<commit_message>
자동 동기화 2026-06-10 20:14:05
</commit_message>
<xml_diff>
--- a/발표준비/개발순서_시연시나리오_발표대본.docx
+++ b/발표준비/개발순서_시연시나리오_발표대본.docx
@@ -4,7 +4,7 @@
   <w:body>
     <w:p>
       <w:pPr>
-        <w:spacing w:after="200" w:before="600"/>
+        <w:spacing w:after="200" w:before="500"/>
         <w:jc w:val="center"/>
       </w:pPr>
       <w:r>
@@ -43,7 +43,7 @@
           <w:b/>
           <w:bCs/>
         </w:rPr>
-        <w:t xml:space="preserve">1. 4인 개발 순서 (의존성 기준)</w:t>
+        <w:t xml:space="preserve">1. 전체 개발 순서 (의존성 기준 타임라인)</w:t>
       </w:r>
     </w:p>
     <w:p>
@@ -54,7 +54,7 @@
         <w:rPr>
           <w:rFonts w:ascii="Apple SD Gothic Neo" w:cs="Apple SD Gothic Neo" w:eastAsia="Apple SD Gothic Neo" w:hAnsi="Apple SD Gothic Neo"/>
         </w:rPr>
-        <w:t xml:space="preserve">핵심 원칙: 부모 클래스와 World의 '인터페이스(이름·시그니처)'를 먼저 고정해야 나머지를 여러 명이 동시에 병렬로 만들 수 있다. 이름이 정해져야 서로를 호출할 수 있기 때문이다.</w:t>
+        <w:t xml:space="preserve">핵심 원칙: 부모 클래스와 World의 '인터페이스(이름·시그니처)'를 먼저 고정해야 나머지를 여러 명이 동시에 병렬로 만들 수 있다. 이름이 정해져야 서로를 호출할 수 있기 때문이다. 아래 표의 같은 단계(②, ③, ④, ⑤) 안의 작업은 서로 동시에(병렬로) 진행된다.</w:t>
       </w:r>
     </w:p>
     <w:tbl>
@@ -71,9 +71,9 @@
       </w:tblPr>
       <w:tblGrid>
         <w:gridCol w:w="800"/>
-        <w:gridCol w:w="4000"/>
-        <w:gridCol w:w="1300"/>
-        <w:gridCol w:w="3300"/>
+        <w:gridCol w:w="4600"/>
+        <w:gridCol w:w="1100"/>
+        <w:gridCol w:w="2900"/>
       </w:tblGrid>
       <w:tr>
         <w:tc>
@@ -109,7 +109,7 @@
         </w:tc>
         <w:tc>
           <w:tcPr>
-            <w:tcW w:type="dxa" w:w="4000"/>
+            <w:tcW w:type="dxa" w:w="4600"/>
             <w:tcBorders>
               <w:top w:val="single" w:color="BBBBBB" w:sz="1"/>
               <w:left w:val="single" w:color="BBBBBB" w:sz="1"/>
@@ -134,13 +134,13 @@
                 <w:b/>
                 <w:bCs/>
               </w:rPr>
-              <w:t xml:space="preserve">작업 / 파일</w:t>
-            </w:r>
-          </w:p>
-        </w:tc>
-        <w:tc>
-          <w:tcPr>
-            <w:tcW w:type="dxa" w:w="1300"/>
+              <w:t xml:space="preserve">파일 (작업 내용)</w:t>
+            </w:r>
+          </w:p>
+        </w:tc>
+        <w:tc>
+          <w:tcPr>
+            <w:tcW w:type="dxa" w:w="1100"/>
             <w:tcBorders>
               <w:top w:val="single" w:color="BBBBBB" w:sz="1"/>
               <w:left w:val="single" w:color="BBBBBB" w:sz="1"/>
@@ -171,7 +171,7 @@
         </w:tc>
         <w:tc>
           <w:tcPr>
-            <w:tcW w:type="dxa" w:w="3300"/>
+            <w:tcW w:type="dxa" w:w="2900"/>
             <w:tcBorders>
               <w:top w:val="single" w:color="BBBBBB" w:sz="1"/>
               <w:left w:val="single" w:color="BBBBBB" w:sz="1"/>
@@ -232,35 +232,35 @@
         </w:tc>
         <w:tc>
           <w:tcPr>
-            <w:tcW w:type="dxa" w:w="4000"/>
-            <w:tcBorders>
-              <w:top w:val="single" w:color="BBBBBB" w:sz="1"/>
-              <w:left w:val="single" w:color="BBBBBB" w:sz="1"/>
-              <w:bottom w:val="single" w:color="BBBBBB" w:sz="1"/>
-              <w:right w:val="single" w:color="BBBBBB" w:sz="1"/>
-            </w:tcBorders>
-            <w:tcMar>
-              <w:top w:type="dxa" w:w="60"/>
-              <w:left w:type="dxa" w:w="100"/>
-              <w:bottom w:type="dxa" w:w="60"/>
-              <w:right w:type="dxa" w:w="100"/>
-            </w:tcMar>
-          </w:tcPr>
-          <w:p>
-            <w:pPr>
-              <w:spacing w:after="0"/>
-            </w:pPr>
-            <w:r>
-              <w:rPr>
-                <w:rFonts w:ascii="Apple SD Gothic Neo" w:cs="Apple SD Gothic Neo" w:eastAsia="Apple SD Gothic Neo" w:hAnsi="Apple SD Gothic Neo"/>
-              </w:rPr>
-              <w:t xml:space="preserve">계획서대로 클래스 구조·속성·메서드 이름·상호작용 규칙 합의</w:t>
-            </w:r>
-          </w:p>
-        </w:tc>
-        <w:tc>
-          <w:tcPr>
-            <w:tcW w:type="dxa" w:w="1300"/>
+            <w:tcW w:type="dxa" w:w="4600"/>
+            <w:tcBorders>
+              <w:top w:val="single" w:color="BBBBBB" w:sz="1"/>
+              <w:left w:val="single" w:color="BBBBBB" w:sz="1"/>
+              <w:bottom w:val="single" w:color="BBBBBB" w:sz="1"/>
+              <w:right w:val="single" w:color="BBBBBB" w:sz="1"/>
+            </w:tcBorders>
+            <w:tcMar>
+              <w:top w:type="dxa" w:w="60"/>
+              <w:left w:type="dxa" w:w="100"/>
+              <w:bottom w:type="dxa" w:w="60"/>
+              <w:right w:type="dxa" w:w="100"/>
+            </w:tcMar>
+          </w:tcPr>
+          <w:p>
+            <w:pPr>
+              <w:spacing w:after="0"/>
+            </w:pPr>
+            <w:r>
+              <w:rPr>
+                <w:rFonts w:ascii="Apple SD Gothic Neo" w:cs="Apple SD Gothic Neo" w:eastAsia="Apple SD Gothic Neo" w:hAnsi="Apple SD Gothic Neo"/>
+              </w:rPr>
+              <w:t xml:space="preserve">(파일 없음) 계획서대로 클래스 구조·속성·메서드 이름·상호작용 규칙 합의</w:t>
+            </w:r>
+          </w:p>
+        </w:tc>
+        <w:tc>
+          <w:tcPr>
+            <w:tcW w:type="dxa" w:w="1100"/>
             <w:tcBorders>
               <w:top w:val="single" w:color="BBBBBB" w:sz="1"/>
               <w:left w:val="single" w:color="BBBBBB" w:sz="1"/>
@@ -288,7 +288,7 @@
         </w:tc>
         <w:tc>
           <w:tcPr>
-            <w:tcW w:type="dxa" w:w="3300"/>
+            <w:tcW w:type="dxa" w:w="2900"/>
             <w:tcBorders>
               <w:top w:val="single" w:color="BBBBBB" w:sz="1"/>
               <w:left w:val="single" w:color="BBBBBB" w:sz="1"/>
@@ -340,13 +340,13 @@
               <w:rPr>
                 <w:rFonts w:ascii="Apple SD Gothic Neo" w:cs="Apple SD Gothic Neo" w:eastAsia="Apple SD Gothic Neo" w:hAnsi="Apple SD Gothic Neo"/>
               </w:rPr>
-              <w:t xml:space="preserve">①</w:t>
-            </w:r>
-          </w:p>
-        </w:tc>
-        <w:tc>
-          <w:tcPr>
-            <w:tcW w:type="dxa" w:w="4000"/>
+              <w:t xml:space="preserve">①-a</w:t>
+            </w:r>
+          </w:p>
+        </w:tc>
+        <w:tc>
+          <w:tcPr>
+            <w:tcW w:type="dxa" w:w="4600"/>
             <w:tcBorders>
               <w:top w:val="single" w:color="BBBBBB" w:sz="1"/>
               <w:left w:val="single" w:color="BBBBBB" w:sz="1"/>
@@ -374,8 +374,8 @@
               <w:rPr>
                 <w:rFonts w:ascii="Courier New" w:cs="Courier New" w:eastAsia="Courier New" w:hAnsi="Courier New"/>
                 <w:color w:val="1a4a7a"/>
-                <w:sz w:val="20"/>
-                <w:szCs w:val="20"/>
+                <w:sz w:val="19"/>
+                <w:szCs w:val="19"/>
               </w:rPr>
               <w:t xml:space="preserve">vector.py</w:t>
             </w:r>
@@ -383,14 +383,14 @@
               <w:rPr>
                 <w:rFonts w:ascii="Apple SD Gothic Neo" w:cs="Apple SD Gothic Neo" w:eastAsia="Apple SD Gothic Neo" w:hAnsi="Apple SD Gothic Neo"/>
               </w:rPr>
-              <w:t xml:space="preserve"> → </w:t>
+              <w:t xml:space="preserve"> (Vector2 벡터 클래스) → 완성 직후 </w:t>
             </w:r>
             <w:r>
               <w:rPr>
                 <w:rFonts w:ascii="Courier New" w:cs="Courier New" w:eastAsia="Courier New" w:hAnsi="Courier New"/>
                 <w:color w:val="1a4a7a"/>
-                <w:sz w:val="20"/>
-                <w:szCs w:val="20"/>
+                <w:sz w:val="19"/>
+                <w:szCs w:val="19"/>
               </w:rPr>
               <w:t xml:space="preserve">physics.py</w:t>
             </w:r>
@@ -398,14 +398,128 @@
               <w:rPr>
                 <w:rFonts w:ascii="Apple SD Gothic Neo" w:cs="Apple SD Gothic Neo" w:eastAsia="Apple SD Gothic Neo" w:hAnsi="Apple SD Gothic Neo"/>
               </w:rPr>
-              <w:t xml:space="preserve"> (물리엔진), </w:t>
+              <w:t xml:space="preserve"> (seek·flee·wander·integrate·clamp_to_bounds·is_contact·knockback)</w:t>
+            </w:r>
+          </w:p>
+        </w:tc>
+        <w:tc>
+          <w:tcPr>
+            <w:tcW w:type="dxa" w:w="1100"/>
+            <w:tcBorders>
+              <w:top w:val="single" w:color="BBBBBB" w:sz="1"/>
+              <w:left w:val="single" w:color="BBBBBB" w:sz="1"/>
+              <w:bottom w:val="single" w:color="BBBBBB" w:sz="1"/>
+              <w:right w:val="single" w:color="BBBBBB" w:sz="1"/>
+            </w:tcBorders>
+            <w:tcMar>
+              <w:top w:type="dxa" w:w="60"/>
+              <w:left w:type="dxa" w:w="100"/>
+              <w:bottom w:type="dxa" w:w="60"/>
+              <w:right w:type="dxa" w:w="100"/>
+            </w:tcMar>
+          </w:tcPr>
+          <w:p>
+            <w:pPr>
+              <w:spacing w:after="0"/>
+            </w:pPr>
+            <w:r>
+              <w:rPr>
+                <w:rFonts w:ascii="Apple SD Gothic Neo" w:cs="Apple SD Gothic Neo" w:eastAsia="Apple SD Gothic Neo" w:hAnsi="Apple SD Gothic Neo"/>
+              </w:rPr>
+              <w:t xml:space="preserve">홍순율</w:t>
+            </w:r>
+          </w:p>
+        </w:tc>
+        <w:tc>
+          <w:tcPr>
+            <w:tcW w:type="dxa" w:w="2900"/>
+            <w:tcBorders>
+              <w:top w:val="single" w:color="BBBBBB" w:sz="1"/>
+              <w:left w:val="single" w:color="BBBBBB" w:sz="1"/>
+              <w:bottom w:val="single" w:color="BBBBBB" w:sz="1"/>
+              <w:right w:val="single" w:color="BBBBBB" w:sz="1"/>
+            </w:tcBorders>
+            <w:tcMar>
+              <w:top w:type="dxa" w:w="60"/>
+              <w:left w:type="dxa" w:w="100"/>
+              <w:bottom w:type="dxa" w:w="60"/>
+              <w:right w:type="dxa" w:w="100"/>
+            </w:tcMar>
+          </w:tcPr>
+          <w:p>
+            <w:pPr>
+              <w:spacing w:after="0"/>
+            </w:pPr>
+            <w:r>
+              <w:rPr>
+                <w:rFonts w:ascii="Apple SD Gothic Neo" w:cs="Apple SD Gothic Neo" w:eastAsia="Apple SD Gothic Neo" w:hAnsi="Apple SD Gothic Neo"/>
+              </w:rPr>
+              <w:t xml:space="preserve">의존성 없음 — 0단계 직후 바로</w:t>
+            </w:r>
+          </w:p>
+        </w:tc>
+      </w:tr>
+      <w:tr>
+        <w:tc>
+          <w:tcPr>
+            <w:tcW w:type="dxa" w:w="800"/>
+            <w:tcBorders>
+              <w:top w:val="single" w:color="BBBBBB" w:sz="1"/>
+              <w:left w:val="single" w:color="BBBBBB" w:sz="1"/>
+              <w:bottom w:val="single" w:color="BBBBBB" w:sz="1"/>
+              <w:right w:val="single" w:color="BBBBBB" w:sz="1"/>
+            </w:tcBorders>
+            <w:tcMar>
+              <w:top w:type="dxa" w:w="60"/>
+              <w:left w:type="dxa" w:w="100"/>
+              <w:bottom w:type="dxa" w:w="60"/>
+              <w:right w:type="dxa" w:w="100"/>
+            </w:tcMar>
+          </w:tcPr>
+          <w:p>
+            <w:pPr>
+              <w:spacing w:after="0"/>
+            </w:pPr>
+            <w:r>
+              <w:rPr>
+                <w:rFonts w:ascii="Apple SD Gothic Neo" w:cs="Apple SD Gothic Neo" w:eastAsia="Apple SD Gothic Neo" w:hAnsi="Apple SD Gothic Neo"/>
+              </w:rPr>
+              <w:t xml:space="preserve">①-b</w:t>
+            </w:r>
+          </w:p>
+        </w:tc>
+        <w:tc>
+          <w:tcPr>
+            <w:tcW w:type="dxa" w:w="4600"/>
+            <w:tcBorders>
+              <w:top w:val="single" w:color="BBBBBB" w:sz="1"/>
+              <w:left w:val="single" w:color="BBBBBB" w:sz="1"/>
+              <w:bottom w:val="single" w:color="BBBBBB" w:sz="1"/>
+              <w:right w:val="single" w:color="BBBBBB" w:sz="1"/>
+            </w:tcBorders>
+            <w:tcMar>
+              <w:top w:type="dxa" w:w="60"/>
+              <w:left w:type="dxa" w:w="100"/>
+              <w:bottom w:type="dxa" w:w="60"/>
+              <w:right w:type="dxa" w:w="100"/>
+            </w:tcMar>
+          </w:tcPr>
+          <w:p>
+            <w:pPr>
+              <w:spacing w:after="0"/>
+            </w:pPr>
+            <w:r>
+              <w:rPr>
+                <w:rFonts w:ascii="Apple SD Gothic Neo" w:cs="Apple SD Gothic Neo" w:eastAsia="Apple SD Gothic Neo" w:hAnsi="Apple SD Gothic Neo"/>
+              </w:rPr>
+              <w:t xml:space="preserve"/>
             </w:r>
             <w:r>
               <w:rPr>
                 <w:rFonts w:ascii="Courier New" w:cs="Courier New" w:eastAsia="Courier New" w:hAnsi="Courier New"/>
                 <w:color w:val="1a4a7a"/>
-                <w:sz w:val="20"/>
-                <w:szCs w:val="20"/>
+                <w:sz w:val="19"/>
+                <w:szCs w:val="19"/>
               </w:rPr>
               <w:t xml:space="preserve">config.py</w:t>
             </w:r>
@@ -413,13 +527,13 @@
               <w:rPr>
                 <w:rFonts w:ascii="Apple SD Gothic Neo" w:cs="Apple SD Gothic Neo" w:eastAsia="Apple SD Gothic Neo" w:hAnsi="Apple SD Gothic Neo"/>
               </w:rPr>
-              <w:t xml:space="preserve"> (전역 상수)</w:t>
-            </w:r>
-          </w:p>
-        </w:tc>
-        <w:tc>
-          <w:tcPr>
-            <w:tcW w:type="dxa" w:w="1300"/>
+              <w:t xml:space="preserve"> (WORLD_W/H·FRAME_MS·INITIAL_COUNTS·MAX_COUNTS·PALETTE·KOR_NAME)</w:t>
+            </w:r>
+          </w:p>
+        </w:tc>
+        <w:tc>
+          <w:tcPr>
+            <w:tcW w:type="dxa" w:w="1100"/>
             <w:tcBorders>
               <w:top w:val="single" w:color="BBBBBB" w:sz="1"/>
               <w:left w:val="single" w:color="BBBBBB" w:sz="1"/>
@@ -447,29 +561,29 @@
         </w:tc>
         <w:tc>
           <w:tcPr>
-            <w:tcW w:type="dxa" w:w="3300"/>
-            <w:tcBorders>
-              <w:top w:val="single" w:color="BBBBBB" w:sz="1"/>
-              <w:left w:val="single" w:color="BBBBBB" w:sz="1"/>
-              <w:bottom w:val="single" w:color="BBBBBB" w:sz="1"/>
-              <w:right w:val="single" w:color="BBBBBB" w:sz="1"/>
-            </w:tcBorders>
-            <w:tcMar>
-              <w:top w:type="dxa" w:w="60"/>
-              <w:left w:type="dxa" w:w="100"/>
-              <w:bottom w:type="dxa" w:w="60"/>
-              <w:right w:type="dxa" w:w="100"/>
-            </w:tcMar>
-          </w:tcPr>
-          <w:p>
-            <w:pPr>
-              <w:spacing w:after="0"/>
-            </w:pPr>
-            <w:r>
-              <w:rPr>
-                <w:rFonts w:ascii="Apple SD Gothic Neo" w:cs="Apple SD Gothic Neo" w:eastAsia="Apple SD Gothic Neo" w:hAnsi="Apple SD Gothic Neo"/>
-              </w:rPr>
-              <w:t xml:space="preserve">의존성 없음 — 0단계 직후 바로</w:t>
+            <w:tcW w:type="dxa" w:w="2900"/>
+            <w:tcBorders>
+              <w:top w:val="single" w:color="BBBBBB" w:sz="1"/>
+              <w:left w:val="single" w:color="BBBBBB" w:sz="1"/>
+              <w:bottom w:val="single" w:color="BBBBBB" w:sz="1"/>
+              <w:right w:val="single" w:color="BBBBBB" w:sz="1"/>
+            </w:tcBorders>
+            <w:tcMar>
+              <w:top w:type="dxa" w:w="60"/>
+              <w:left w:type="dxa" w:w="100"/>
+              <w:bottom w:type="dxa" w:w="60"/>
+              <w:right w:type="dxa" w:w="100"/>
+            </w:tcMar>
+          </w:tcPr>
+          <w:p>
+            <w:pPr>
+              <w:spacing w:after="0"/>
+            </w:pPr>
+            <w:r>
+              <w:rPr>
+                <w:rFonts w:ascii="Apple SD Gothic Neo" w:cs="Apple SD Gothic Neo" w:eastAsia="Apple SD Gothic Neo" w:hAnsi="Apple SD Gothic Neo"/>
+              </w:rPr>
+              <w:t xml:space="preserve">의존성 없음 — ①-a와 같은 시기</w:t>
             </w:r>
           </w:p>
         </w:tc>
@@ -505,7 +619,7 @@
         </w:tc>
         <w:tc>
           <w:tcPr>
-            <w:tcW w:type="dxa" w:w="4000"/>
+            <w:tcW w:type="dxa" w:w="4600"/>
             <w:tcBorders>
               <w:top w:val="single" w:color="BBBBBB" w:sz="1"/>
               <w:left w:val="single" w:color="BBBBBB" w:sz="1"/>
@@ -533,8 +647,8 @@
               <w:rPr>
                 <w:rFonts w:ascii="Courier New" w:cs="Courier New" w:eastAsia="Courier New" w:hAnsi="Courier New"/>
                 <w:color w:val="1a4a7a"/>
-                <w:sz w:val="20"/>
-                <w:szCs w:val="20"/>
+                <w:sz w:val="19"/>
+                <w:szCs w:val="19"/>
               </w:rPr>
               <w:t xml:space="preserve">organisms.py</w:t>
             </w:r>
@@ -542,13 +656,13 @@
               <w:rPr>
                 <w:rFonts w:ascii="Apple SD Gothic Neo" w:cs="Apple SD Gothic Neo" w:eastAsia="Apple SD Gothic Neo" w:hAnsi="Apple SD Gothic Neo"/>
               </w:rPr>
-              <w:t xml:space="preserve">의 Entity·Animal·Carnivore 부모 — ★인터페이스 고정 지점</w:t>
-            </w:r>
-          </w:p>
-        </w:tc>
-        <w:tc>
-          <w:tcPr>
-            <w:tcW w:type="dxa" w:w="1300"/>
+              <w:t xml:space="preserve"> 상단: Entity → Animal → Carnivore 부모 ★인터페이스 고정 지점</w:t>
+            </w:r>
+          </w:p>
+        </w:tc>
+        <w:tc>
+          <w:tcPr>
+            <w:tcW w:type="dxa" w:w="1100"/>
             <w:tcBorders>
               <w:top w:val="single" w:color="BBBBBB" w:sz="1"/>
               <w:left w:val="single" w:color="BBBBBB" w:sz="1"/>
@@ -576,29 +690,29 @@
         </w:tc>
         <w:tc>
           <w:tcPr>
-            <w:tcW w:type="dxa" w:w="3300"/>
-            <w:tcBorders>
-              <w:top w:val="single" w:color="BBBBBB" w:sz="1"/>
-              <w:left w:val="single" w:color="BBBBBB" w:sz="1"/>
-              <w:bottom w:val="single" w:color="BBBBBB" w:sz="1"/>
-              <w:right w:val="single" w:color="BBBBBB" w:sz="1"/>
-            </w:tcBorders>
-            <w:tcMar>
-              <w:top w:type="dxa" w:w="60"/>
-              <w:left w:type="dxa" w:w="100"/>
-              <w:bottom w:type="dxa" w:w="60"/>
-              <w:right w:type="dxa" w:w="100"/>
-            </w:tcMar>
-          </w:tcPr>
-          <w:p>
-            <w:pPr>
-              <w:spacing w:after="0"/>
-            </w:pPr>
-            <w:r>
-              <w:rPr>
-                <w:rFonts w:ascii="Apple SD Gothic Neo" w:cs="Apple SD Gothic Neo" w:eastAsia="Apple SD Gothic Neo" w:hAnsi="Apple SD Gothic Neo"/>
-              </w:rPr>
-              <w:t xml:space="preserve">①의 벡터/물리가 어느 정도 되면</w:t>
+            <w:tcW w:type="dxa" w:w="2900"/>
+            <w:tcBorders>
+              <w:top w:val="single" w:color="BBBBBB" w:sz="1"/>
+              <w:left w:val="single" w:color="BBBBBB" w:sz="1"/>
+              <w:bottom w:val="single" w:color="BBBBBB" w:sz="1"/>
+              <w:right w:val="single" w:color="BBBBBB" w:sz="1"/>
+            </w:tcBorders>
+            <w:tcMar>
+              <w:top w:type="dxa" w:w="60"/>
+              <w:left w:type="dxa" w:w="100"/>
+              <w:bottom w:type="dxa" w:w="60"/>
+              <w:right w:type="dxa" w:w="100"/>
+            </w:tcMar>
+          </w:tcPr>
+          <w:p>
+            <w:pPr>
+              <w:spacing w:after="0"/>
+            </w:pPr>
+            <w:r>
+              <w:rPr>
+                <w:rFonts w:ascii="Apple SD Gothic Neo" w:cs="Apple SD Gothic Neo" w:eastAsia="Apple SD Gothic Neo" w:hAnsi="Apple SD Gothic Neo"/>
+              </w:rPr>
+              <w:t xml:space="preserve">①-a의 Vector2/physics, ①-b의 config</w:t>
             </w:r>
           </w:p>
         </w:tc>
@@ -634,7 +748,7 @@
         </w:tc>
         <w:tc>
           <w:tcPr>
-            <w:tcW w:type="dxa" w:w="4000"/>
+            <w:tcW w:type="dxa" w:w="4600"/>
             <w:tcBorders>
               <w:top w:val="single" w:color="BBBBBB" w:sz="1"/>
               <w:left w:val="single" w:color="BBBBBB" w:sz="1"/>
@@ -662,8 +776,8 @@
               <w:rPr>
                 <w:rFonts w:ascii="Courier New" w:cs="Courier New" w:eastAsia="Courier New" w:hAnsi="Courier New"/>
                 <w:color w:val="1a4a7a"/>
-                <w:sz w:val="20"/>
-                <w:szCs w:val="20"/>
+                <w:sz w:val="19"/>
+                <w:szCs w:val="19"/>
               </w:rPr>
               <w:t xml:space="preserve">organisms.py</w:t>
             </w:r>
@@ -671,13 +785,13 @@
               <w:rPr>
                 <w:rFonts w:ascii="Apple SD Gothic Neo" w:cs="Apple SD Gothic Neo" w:eastAsia="Apple SD Gothic Neo" w:hAnsi="Apple SD Gothic Neo"/>
               </w:rPr>
-              <w:t xml:space="preserve">의 Herbivore·Plant 부모</w:t>
-            </w:r>
-          </w:p>
-        </w:tc>
-        <w:tc>
-          <w:tcPr>
-            <w:tcW w:type="dxa" w:w="1300"/>
+              <w:t xml:space="preserve"> 하단: Herbivore → Plant 부모 (심성진과 같은 파일에서 이어서 작성)</w:t>
+            </w:r>
+          </w:p>
+        </w:tc>
+        <w:tc>
+          <w:tcPr>
+            <w:tcW w:type="dxa" w:w="1100"/>
             <w:tcBorders>
               <w:top w:val="single" w:color="BBBBBB" w:sz="1"/>
               <w:left w:val="single" w:color="BBBBBB" w:sz="1"/>
@@ -705,29 +819,29 @@
         </w:tc>
         <w:tc>
           <w:tcPr>
-            <w:tcW w:type="dxa" w:w="3300"/>
-            <w:tcBorders>
-              <w:top w:val="single" w:color="BBBBBB" w:sz="1"/>
-              <w:left w:val="single" w:color="BBBBBB" w:sz="1"/>
-              <w:bottom w:val="single" w:color="BBBBBB" w:sz="1"/>
-              <w:right w:val="single" w:color="BBBBBB" w:sz="1"/>
-            </w:tcBorders>
-            <w:tcMar>
-              <w:top w:type="dxa" w:w="60"/>
-              <w:left w:type="dxa" w:w="100"/>
-              <w:bottom w:type="dxa" w:w="60"/>
-              <w:right w:type="dxa" w:w="100"/>
-            </w:tcMar>
-          </w:tcPr>
-          <w:p>
-            <w:pPr>
-              <w:spacing w:after="0"/>
-            </w:pPr>
-            <w:r>
-              <w:rPr>
-                <w:rFonts w:ascii="Apple SD Gothic Neo" w:cs="Apple SD Gothic Neo" w:eastAsia="Apple SD Gothic Neo" w:hAnsi="Apple SD Gothic Neo"/>
-              </w:rPr>
-              <w:t xml:space="preserve">②-a의 Animal/Entity 이름이 고정되는 즉시 (같은 파일이라 심성진과 조율)</w:t>
+            <w:tcW w:type="dxa" w:w="2900"/>
+            <w:tcBorders>
+              <w:top w:val="single" w:color="BBBBBB" w:sz="1"/>
+              <w:left w:val="single" w:color="BBBBBB" w:sz="1"/>
+              <w:bottom w:val="single" w:color="BBBBBB" w:sz="1"/>
+              <w:right w:val="single" w:color="BBBBBB" w:sz="1"/>
+            </w:tcBorders>
+            <w:tcMar>
+              <w:top w:type="dxa" w:w="60"/>
+              <w:left w:type="dxa" w:w="100"/>
+              <w:bottom w:type="dxa" w:w="60"/>
+              <w:right w:type="dxa" w:w="100"/>
+            </w:tcMar>
+          </w:tcPr>
+          <w:p>
+            <w:pPr>
+              <w:spacing w:after="0"/>
+            </w:pPr>
+            <w:r>
+              <w:rPr>
+                <w:rFonts w:ascii="Apple SD Gothic Neo" w:cs="Apple SD Gothic Neo" w:eastAsia="Apple SD Gothic Neo" w:hAnsi="Apple SD Gothic Neo"/>
+              </w:rPr>
+              <w:t xml:space="preserve">②-a의 Animal·Entity 이름이 고정되는 즉시</w:t>
             </w:r>
           </w:p>
         </w:tc>
@@ -763,7 +877,7 @@
         </w:tc>
         <w:tc>
           <w:tcPr>
-            <w:tcW w:type="dxa" w:w="4000"/>
+            <w:tcW w:type="dxa" w:w="4600"/>
             <w:tcBorders>
               <w:top w:val="single" w:color="BBBBBB" w:sz="1"/>
               <w:left w:val="single" w:color="BBBBBB" w:sz="1"/>
@@ -791,8 +905,8 @@
               <w:rPr>
                 <w:rFonts w:ascii="Courier New" w:cs="Courier New" w:eastAsia="Courier New" w:hAnsi="Courier New"/>
                 <w:color w:val="1a4a7a"/>
-                <w:sz w:val="20"/>
-                <w:szCs w:val="20"/>
+                <w:sz w:val="19"/>
+                <w:szCs w:val="19"/>
               </w:rPr>
               <w:t xml:space="preserve">carnivores.py</w:t>
             </w:r>
@@ -800,13 +914,13 @@
               <w:rPr>
                 <w:rFonts w:ascii="Apple SD Gothic Neo" w:cs="Apple SD Gothic Neo" w:eastAsia="Apple SD Gothic Neo" w:hAnsi="Apple SD Gothic Neo"/>
               </w:rPr>
-              <w:t xml:space="preserve"> (사자·치타·하이에나)</w:t>
-            </w:r>
-          </w:p>
-        </w:tc>
-        <w:tc>
-          <w:tcPr>
-            <w:tcW w:type="dxa" w:w="1300"/>
+              <w:t xml:space="preserve"> (Lion → Cheetah → Hyena)</w:t>
+            </w:r>
+          </w:p>
+        </w:tc>
+        <w:tc>
+          <w:tcPr>
+            <w:tcW w:type="dxa" w:w="1100"/>
             <w:tcBorders>
               <w:top w:val="single" w:color="BBBBBB" w:sz="1"/>
               <w:left w:val="single" w:color="BBBBBB" w:sz="1"/>
@@ -834,29 +948,29 @@
         </w:tc>
         <w:tc>
           <w:tcPr>
-            <w:tcW w:type="dxa" w:w="3300"/>
-            <w:tcBorders>
-              <w:top w:val="single" w:color="BBBBBB" w:sz="1"/>
-              <w:left w:val="single" w:color="BBBBBB" w:sz="1"/>
-              <w:bottom w:val="single" w:color="BBBBBB" w:sz="1"/>
-              <w:right w:val="single" w:color="BBBBBB" w:sz="1"/>
-            </w:tcBorders>
-            <w:tcMar>
-              <w:top w:type="dxa" w:w="60"/>
-              <w:left w:type="dxa" w:w="100"/>
-              <w:bottom w:type="dxa" w:w="60"/>
-              <w:right w:type="dxa" w:w="100"/>
-            </w:tcMar>
-          </w:tcPr>
-          <w:p>
-            <w:pPr>
-              <w:spacing w:after="0"/>
-            </w:pPr>
-            <w:r>
-              <w:rPr>
-                <w:rFonts w:ascii="Apple SD Gothic Neo" w:cs="Apple SD Gothic Neo" w:eastAsia="Apple SD Gothic Neo" w:hAnsi="Apple SD Gothic Neo"/>
-              </w:rPr>
-              <w:t xml:space="preserve">② 부모 인터페이스 고정 후 — ③-b·③-c와 동시 병렬</w:t>
+            <w:tcW w:type="dxa" w:w="2900"/>
+            <w:tcBorders>
+              <w:top w:val="single" w:color="BBBBBB" w:sz="1"/>
+              <w:left w:val="single" w:color="BBBBBB" w:sz="1"/>
+              <w:bottom w:val="single" w:color="BBBBBB" w:sz="1"/>
+              <w:right w:val="single" w:color="BBBBBB" w:sz="1"/>
+            </w:tcBorders>
+            <w:tcMar>
+              <w:top w:type="dxa" w:w="60"/>
+              <w:left w:type="dxa" w:w="100"/>
+              <w:bottom w:type="dxa" w:w="60"/>
+              <w:right w:type="dxa" w:w="100"/>
+            </w:tcMar>
+          </w:tcPr>
+          <w:p>
+            <w:pPr>
+              <w:spacing w:after="0"/>
+            </w:pPr>
+            <w:r>
+              <w:rPr>
+                <w:rFonts w:ascii="Apple SD Gothic Neo" w:cs="Apple SD Gothic Neo" w:eastAsia="Apple SD Gothic Neo" w:hAnsi="Apple SD Gothic Neo"/>
+              </w:rPr>
+              <w:t xml:space="preserve">②-a(Carnivore) 고정 후 — ③-b·③-c와 동시 병렬</w:t>
             </w:r>
           </w:p>
         </w:tc>
@@ -892,7 +1006,7 @@
         </w:tc>
         <w:tc>
           <w:tcPr>
-            <w:tcW w:type="dxa" w:w="4000"/>
+            <w:tcW w:type="dxa" w:w="4600"/>
             <w:tcBorders>
               <w:top w:val="single" w:color="BBBBBB" w:sz="1"/>
               <w:left w:val="single" w:color="BBBBBB" w:sz="1"/>
@@ -920,8 +1034,8 @@
               <w:rPr>
                 <w:rFonts w:ascii="Courier New" w:cs="Courier New" w:eastAsia="Courier New" w:hAnsi="Courier New"/>
                 <w:color w:val="1a4a7a"/>
-                <w:sz w:val="20"/>
-                <w:szCs w:val="20"/>
+                <w:sz w:val="19"/>
+                <w:szCs w:val="19"/>
               </w:rPr>
               <w:t xml:space="preserve">plants.py</w:t>
             </w:r>
@@ -929,14 +1043,14 @@
               <w:rPr>
                 <w:rFonts w:ascii="Apple SD Gothic Neo" w:cs="Apple SD Gothic Neo" w:eastAsia="Apple SD Gothic Neo" w:hAnsi="Apple SD Gothic Neo"/>
               </w:rPr>
-              <w:t xml:space="preserve"> + </w:t>
+              <w:t xml:space="preserve"> (Grass → Tree) → </w:t>
             </w:r>
             <w:r>
               <w:rPr>
                 <w:rFonts w:ascii="Courier New" w:cs="Courier New" w:eastAsia="Courier New" w:hAnsi="Courier New"/>
                 <w:color w:val="1a4a7a"/>
-                <w:sz w:val="20"/>
-                <w:szCs w:val="20"/>
+                <w:sz w:val="19"/>
+                <w:szCs w:val="19"/>
               </w:rPr>
               <w:t xml:space="preserve">herbivores.py</w:t>
             </w:r>
@@ -944,13 +1058,13 @@
               <w:rPr>
                 <w:rFonts w:ascii="Apple SD Gothic Neo" w:cs="Apple SD Gothic Neo" w:eastAsia="Apple SD Gothic Neo" w:hAnsi="Apple SD Gothic Neo"/>
               </w:rPr>
-              <w:t xml:space="preserve">의 토끼·기린</w:t>
-            </w:r>
-          </w:p>
-        </w:tc>
-        <w:tc>
-          <w:tcPr>
-            <w:tcW w:type="dxa" w:w="1300"/>
+              <w:t xml:space="preserve"> 의 Rabbit·Giraffe</w:t>
+            </w:r>
+          </w:p>
+        </w:tc>
+        <w:tc>
+          <w:tcPr>
+            <w:tcW w:type="dxa" w:w="1100"/>
             <w:tcBorders>
               <w:top w:val="single" w:color="BBBBBB" w:sz="1"/>
               <w:left w:val="single" w:color="BBBBBB" w:sz="1"/>
@@ -978,29 +1092,29 @@
         </w:tc>
         <w:tc>
           <w:tcPr>
-            <w:tcW w:type="dxa" w:w="3300"/>
-            <w:tcBorders>
-              <w:top w:val="single" w:color="BBBBBB" w:sz="1"/>
-              <w:left w:val="single" w:color="BBBBBB" w:sz="1"/>
-              <w:bottom w:val="single" w:color="BBBBBB" w:sz="1"/>
-              <w:right w:val="single" w:color="BBBBBB" w:sz="1"/>
-            </w:tcBorders>
-            <w:tcMar>
-              <w:top w:type="dxa" w:w="60"/>
-              <w:left w:type="dxa" w:w="100"/>
-              <w:bottom w:type="dxa" w:w="60"/>
-              <w:right w:type="dxa" w:w="100"/>
-            </w:tcMar>
-          </w:tcPr>
-          <w:p>
-            <w:pPr>
-              <w:spacing w:after="0"/>
-            </w:pPr>
-            <w:r>
-              <w:rPr>
-                <w:rFonts w:ascii="Apple SD Gothic Neo" w:cs="Apple SD Gothic Neo" w:eastAsia="Apple SD Gothic Neo" w:hAnsi="Apple SD Gothic Neo"/>
-              </w:rPr>
-              <w:t xml:space="preserve">② 고정 후</w:t>
+            <w:tcW w:type="dxa" w:w="2900"/>
+            <w:tcBorders>
+              <w:top w:val="single" w:color="BBBBBB" w:sz="1"/>
+              <w:left w:val="single" w:color="BBBBBB" w:sz="1"/>
+              <w:bottom w:val="single" w:color="BBBBBB" w:sz="1"/>
+              <w:right w:val="single" w:color="BBBBBB" w:sz="1"/>
+            </w:tcBorders>
+            <w:tcMar>
+              <w:top w:type="dxa" w:w="60"/>
+              <w:left w:type="dxa" w:w="100"/>
+              <w:bottom w:type="dxa" w:w="60"/>
+              <w:right w:type="dxa" w:w="100"/>
+            </w:tcMar>
+          </w:tcPr>
+          <w:p>
+            <w:pPr>
+              <w:spacing w:after="0"/>
+            </w:pPr>
+            <w:r>
+              <w:rPr>
+                <w:rFonts w:ascii="Apple SD Gothic Neo" w:cs="Apple SD Gothic Neo" w:eastAsia="Apple SD Gothic Neo" w:hAnsi="Apple SD Gothic Neo"/>
+              </w:rPr>
+              <w:t xml:space="preserve">②-b(Herbivore·Plant) 고정 후</w:t>
             </w:r>
           </w:p>
         </w:tc>
@@ -1036,7 +1150,7 @@
         </w:tc>
         <w:tc>
           <w:tcPr>
-            <w:tcW w:type="dxa" w:w="4000"/>
+            <w:tcW w:type="dxa" w:w="4600"/>
             <w:tcBorders>
               <w:top w:val="single" w:color="BBBBBB" w:sz="1"/>
               <w:left w:val="single" w:color="BBBBBB" w:sz="1"/>
@@ -1064,8 +1178,8 @@
               <w:rPr>
                 <w:rFonts w:ascii="Courier New" w:cs="Courier New" w:eastAsia="Courier New" w:hAnsi="Courier New"/>
                 <w:color w:val="1a4a7a"/>
-                <w:sz w:val="20"/>
-                <w:szCs w:val="20"/>
+                <w:sz w:val="19"/>
+                <w:szCs w:val="19"/>
               </w:rPr>
               <w:t xml:space="preserve">herbivores.py</w:t>
             </w:r>
@@ -1073,13 +1187,13 @@
               <w:rPr>
                 <w:rFonts w:ascii="Apple SD Gothic Neo" w:cs="Apple SD Gothic Neo" w:eastAsia="Apple SD Gothic Neo" w:hAnsi="Apple SD Gothic Neo"/>
               </w:rPr>
-              <w:t xml:space="preserve">의 얼룩말·코끼리</w:t>
-            </w:r>
-          </w:p>
-        </w:tc>
-        <w:tc>
-          <w:tcPr>
-            <w:tcW w:type="dxa" w:w="1300"/>
+              <w:t xml:space="preserve"> 의 Zebra·Elephant</w:t>
+            </w:r>
+          </w:p>
+        </w:tc>
+        <w:tc>
+          <w:tcPr>
+            <w:tcW w:type="dxa" w:w="1100"/>
             <w:tcBorders>
               <w:top w:val="single" w:color="BBBBBB" w:sz="1"/>
               <w:left w:val="single" w:color="BBBBBB" w:sz="1"/>
@@ -1107,29 +1221,29 @@
         </w:tc>
         <w:tc>
           <w:tcPr>
-            <w:tcW w:type="dxa" w:w="3300"/>
-            <w:tcBorders>
-              <w:top w:val="single" w:color="BBBBBB" w:sz="1"/>
-              <w:left w:val="single" w:color="BBBBBB" w:sz="1"/>
-              <w:bottom w:val="single" w:color="BBBBBB" w:sz="1"/>
-              <w:right w:val="single" w:color="BBBBBB" w:sz="1"/>
-            </w:tcBorders>
-            <w:tcMar>
-              <w:top w:type="dxa" w:w="60"/>
-              <w:left w:type="dxa" w:w="100"/>
-              <w:bottom w:type="dxa" w:w="60"/>
-              <w:right w:type="dxa" w:w="100"/>
-            </w:tcMar>
-          </w:tcPr>
-          <w:p>
-            <w:pPr>
-              <w:spacing w:after="0"/>
-            </w:pPr>
-            <w:r>
-              <w:rPr>
-                <w:rFonts w:ascii="Apple SD Gothic Neo" w:cs="Apple SD Gothic Neo" w:eastAsia="Apple SD Gothic Neo" w:hAnsi="Apple SD Gothic Neo"/>
-              </w:rPr>
-              <w:t xml:space="preserve">② 고정 후 (한시헌과 같은 파일이라 합칠 때 조율)</w:t>
+            <w:tcW w:type="dxa" w:w="2900"/>
+            <w:tcBorders>
+              <w:top w:val="single" w:color="BBBBBB" w:sz="1"/>
+              <w:left w:val="single" w:color="BBBBBB" w:sz="1"/>
+              <w:bottom w:val="single" w:color="BBBBBB" w:sz="1"/>
+              <w:right w:val="single" w:color="BBBBBB" w:sz="1"/>
+            </w:tcBorders>
+            <w:tcMar>
+              <w:top w:type="dxa" w:w="60"/>
+              <w:left w:type="dxa" w:w="100"/>
+              <w:bottom w:type="dxa" w:w="60"/>
+              <w:right w:type="dxa" w:w="100"/>
+            </w:tcMar>
+          </w:tcPr>
+          <w:p>
+            <w:pPr>
+              <w:spacing w:after="0"/>
+            </w:pPr>
+            <w:r>
+              <w:rPr>
+                <w:rFonts w:ascii="Apple SD Gothic Neo" w:cs="Apple SD Gothic Neo" w:eastAsia="Apple SD Gothic Neo" w:hAnsi="Apple SD Gothic Neo"/>
+              </w:rPr>
+              <w:t xml:space="preserve">②-b(Herbivore) 고정 후 (한시헌과 같은 파일 — 합칠 때 조율)</w:t>
             </w:r>
           </w:p>
         </w:tc>
@@ -1165,7 +1279,7 @@
         </w:tc>
         <w:tc>
           <w:tcPr>
-            <w:tcW w:type="dxa" w:w="4000"/>
+            <w:tcW w:type="dxa" w:w="4600"/>
             <w:tcBorders>
               <w:top w:val="single" w:color="BBBBBB" w:sz="1"/>
               <w:left w:val="single" w:color="BBBBBB" w:sz="1"/>
@@ -1193,8 +1307,8 @@
               <w:rPr>
                 <w:rFonts w:ascii="Courier New" w:cs="Courier New" w:eastAsia="Courier New" w:hAnsi="Courier New"/>
                 <w:color w:val="1a4a7a"/>
-                <w:sz w:val="20"/>
-                <w:szCs w:val="20"/>
+                <w:sz w:val="19"/>
+                <w:szCs w:val="19"/>
               </w:rPr>
               <w:t xml:space="preserve">world.py</w:t>
             </w:r>
@@ -1202,13 +1316,13 @@
               <w:rPr>
                 <w:rFonts w:ascii="Apple SD Gothic Neo" w:cs="Apple SD Gothic Neo" w:eastAsia="Apple SD Gothic Neo" w:hAnsi="Apple SD Gothic Neo"/>
               </w:rPr>
-              <w:t xml:space="preserve"> (월드·갱신 루프·nearest/within) — ★인터페이스 고정 지점</w:t>
-            </w:r>
-          </w:p>
-        </w:tc>
-        <w:tc>
-          <w:tcPr>
-            <w:tcW w:type="dxa" w:w="1300"/>
+              <w:t xml:space="preserve"> (World: step·nearest·within·spawn·count·log) ★인터페이스 고정 지점</w:t>
+            </w:r>
+          </w:p>
+        </w:tc>
+        <w:tc>
+          <w:tcPr>
+            <w:tcW w:type="dxa" w:w="1100"/>
             <w:tcBorders>
               <w:top w:val="single" w:color="BBBBBB" w:sz="1"/>
               <w:left w:val="single" w:color="BBBBBB" w:sz="1"/>
@@ -1236,29 +1350,29 @@
         </w:tc>
         <w:tc>
           <w:tcPr>
-            <w:tcW w:type="dxa" w:w="3300"/>
-            <w:tcBorders>
-              <w:top w:val="single" w:color="BBBBBB" w:sz="1"/>
-              <w:left w:val="single" w:color="BBBBBB" w:sz="1"/>
-              <w:bottom w:val="single" w:color="BBBBBB" w:sz="1"/>
-              <w:right w:val="single" w:color="BBBBBB" w:sz="1"/>
-            </w:tcBorders>
-            <w:tcMar>
-              <w:top w:type="dxa" w:w="60"/>
-              <w:left w:type="dxa" w:w="100"/>
-              <w:bottom w:type="dxa" w:w="60"/>
-              <w:right w:type="dxa" w:w="100"/>
-            </w:tcMar>
-          </w:tcPr>
-          <w:p>
-            <w:pPr>
-              <w:spacing w:after="0"/>
-            </w:pPr>
-            <w:r>
-              <w:rPr>
-                <w:rFonts w:ascii="Apple SD Gothic Neo" w:cs="Apple SD Gothic Neo" w:eastAsia="Apple SD Gothic Neo" w:hAnsi="Apple SD Gothic Neo"/>
-              </w:rPr>
-              <w:t xml:space="preserve">③의 동물들이 어느 정도 나오면</w:t>
+            <w:tcW w:type="dxa" w:w="2900"/>
+            <w:tcBorders>
+              <w:top w:val="single" w:color="BBBBBB" w:sz="1"/>
+              <w:left w:val="single" w:color="BBBBBB" w:sz="1"/>
+              <w:bottom w:val="single" w:color="BBBBBB" w:sz="1"/>
+              <w:right w:val="single" w:color="BBBBBB" w:sz="1"/>
+            </w:tcBorders>
+            <w:tcMar>
+              <w:top w:type="dxa" w:w="60"/>
+              <w:left w:type="dxa" w:w="100"/>
+              <w:bottom w:type="dxa" w:w="60"/>
+              <w:right w:type="dxa" w:w="100"/>
+            </w:tcMar>
+          </w:tcPr>
+          <w:p>
+            <w:pPr>
+              <w:spacing w:after="0"/>
+            </w:pPr>
+            <w:r>
+              <w:rPr>
+                <w:rFonts w:ascii="Apple SD Gothic Neo" w:cs="Apple SD Gothic Neo" w:eastAsia="Apple SD Gothic Neo" w:hAnsi="Apple SD Gothic Neo"/>
+              </w:rPr>
+              <w:t xml:space="preserve">③의 동물 클래스들이 어느 정도 나오면</w:t>
             </w:r>
           </w:p>
         </w:tc>
@@ -1294,7 +1408,7 @@
         </w:tc>
         <w:tc>
           <w:tcPr>
-            <w:tcW w:type="dxa" w:w="4000"/>
+            <w:tcW w:type="dxa" w:w="4600"/>
             <w:tcBorders>
               <w:top w:val="single" w:color="BBBBBB" w:sz="1"/>
               <w:left w:val="single" w:color="BBBBBB" w:sz="1"/>
@@ -1322,8 +1436,8 @@
               <w:rPr>
                 <w:rFonts w:ascii="Courier New" w:cs="Courier New" w:eastAsia="Courier New" w:hAnsi="Courier New"/>
                 <w:color w:val="1a4a7a"/>
-                <w:sz w:val="20"/>
-                <w:szCs w:val="20"/>
+                <w:sz w:val="19"/>
+                <w:szCs w:val="19"/>
               </w:rPr>
               <w:t xml:space="preserve">interactions.py</w:t>
             </w:r>
@@ -1331,13 +1445,13 @@
               <w:rPr>
                 <w:rFonts w:ascii="Apple SD Gothic Neo" w:cs="Apple SD Gothic Neo" w:eastAsia="Apple SD Gothic Neo" w:hAnsi="Apple SD Gothic Neo"/>
               </w:rPr>
-              <w:t xml:space="preserve"> (전역 상호작용)</w:t>
-            </w:r>
-          </w:p>
-        </w:tc>
-        <w:tc>
-          <w:tcPr>
-            <w:tcW w:type="dxa" w:w="1300"/>
+              <w:t xml:space="preserve"> (feed_herbivores → resolve_predation·_award_kill → giraffe_fights → reproduce_near_trees)</w:t>
+            </w:r>
+          </w:p>
+        </w:tc>
+        <w:tc>
+          <w:tcPr>
+            <w:tcW w:type="dxa" w:w="1100"/>
             <w:tcBorders>
               <w:top w:val="single" w:color="BBBBBB" w:sz="1"/>
               <w:left w:val="single" w:color="BBBBBB" w:sz="1"/>
@@ -1365,29 +1479,29 @@
         </w:tc>
         <w:tc>
           <w:tcPr>
-            <w:tcW w:type="dxa" w:w="3300"/>
-            <w:tcBorders>
-              <w:top w:val="single" w:color="BBBBBB" w:sz="1"/>
-              <w:left w:val="single" w:color="BBBBBB" w:sz="1"/>
-              <w:bottom w:val="single" w:color="BBBBBB" w:sz="1"/>
-              <w:right w:val="single" w:color="BBBBBB" w:sz="1"/>
-            </w:tcBorders>
-            <w:tcMar>
-              <w:top w:type="dxa" w:w="60"/>
-              <w:left w:type="dxa" w:w="100"/>
-              <w:bottom w:type="dxa" w:w="60"/>
-              <w:right w:type="dxa" w:w="100"/>
-            </w:tcMar>
-          </w:tcPr>
-          <w:p>
-            <w:pPr>
-              <w:spacing w:after="0"/>
-            </w:pPr>
-            <w:r>
-              <w:rPr>
-                <w:rFonts w:ascii="Apple SD Gothic Neo" w:cs="Apple SD Gothic Neo" w:eastAsia="Apple SD Gothic Neo" w:hAnsi="Apple SD Gothic Neo"/>
-              </w:rPr>
-              <w:t xml:space="preserve">③ 동물 + ④-a의 nearest/within (인터페이스 합의 후 ④-a와 병렬)</w:t>
+            <w:tcW w:type="dxa" w:w="2900"/>
+            <w:tcBorders>
+              <w:top w:val="single" w:color="BBBBBB" w:sz="1"/>
+              <w:left w:val="single" w:color="BBBBBB" w:sz="1"/>
+              <w:bottom w:val="single" w:color="BBBBBB" w:sz="1"/>
+              <w:right w:val="single" w:color="BBBBBB" w:sz="1"/>
+            </w:tcBorders>
+            <w:tcMar>
+              <w:top w:type="dxa" w:w="60"/>
+              <w:left w:type="dxa" w:w="100"/>
+              <w:bottom w:type="dxa" w:w="60"/>
+              <w:right w:type="dxa" w:w="100"/>
+            </w:tcMar>
+          </w:tcPr>
+          <w:p>
+            <w:pPr>
+              <w:spacing w:after="0"/>
+            </w:pPr>
+            <w:r>
+              <w:rPr>
+                <w:rFonts w:ascii="Apple SD Gothic Neo" w:cs="Apple SD Gothic Neo" w:eastAsia="Apple SD Gothic Neo" w:hAnsi="Apple SD Gothic Neo"/>
+              </w:rPr>
+              <w:t xml:space="preserve">③ 동물들 + ④-a의 nearest/within 이름 합의 (④-a와 병렬)</w:t>
             </w:r>
           </w:p>
         </w:tc>
@@ -1423,7 +1537,7 @@
         </w:tc>
         <w:tc>
           <w:tcPr>
-            <w:tcW w:type="dxa" w:w="4000"/>
+            <w:tcW w:type="dxa" w:w="4600"/>
             <w:tcBorders>
               <w:top w:val="single" w:color="BBBBBB" w:sz="1"/>
               <w:left w:val="single" w:color="BBBBBB" w:sz="1"/>
@@ -1451,8 +1565,8 @@
               <w:rPr>
                 <w:rFonts w:ascii="Courier New" w:cs="Courier New" w:eastAsia="Courier New" w:hAnsi="Courier New"/>
                 <w:color w:val="1a4a7a"/>
-                <w:sz w:val="20"/>
-                <w:szCs w:val="20"/>
+                <w:sz w:val="19"/>
+                <w:szCs w:val="19"/>
               </w:rPr>
               <w:t xml:space="preserve">disaster.py</w:t>
             </w:r>
@@ -1460,14 +1574,14 @@
               <w:rPr>
                 <w:rFonts w:ascii="Apple SD Gothic Neo" w:cs="Apple SD Gothic Neo" w:eastAsia="Apple SD Gothic Neo" w:hAnsi="Apple SD Gothic Neo"/>
               </w:rPr>
-              <w:t xml:space="preserve"> (트랙터 재난) · </w:t>
+              <w:t xml:space="preserve"> (Tractor·spawn_tractors) → </w:t>
             </w:r>
             <w:r>
               <w:rPr>
                 <w:rFonts w:ascii="Courier New" w:cs="Courier New" w:eastAsia="Courier New" w:hAnsi="Courier New"/>
                 <w:color w:val="1a4a7a"/>
-                <w:sz w:val="20"/>
-                <w:szCs w:val="20"/>
+                <w:sz w:val="19"/>
+                <w:szCs w:val="19"/>
               </w:rPr>
               <w:t xml:space="preserve">main.py</w:t>
             </w:r>
@@ -1481,7 +1595,7 @@
         </w:tc>
         <w:tc>
           <w:tcPr>
-            <w:tcW w:type="dxa" w:w="1300"/>
+            <w:tcW w:type="dxa" w:w="1100"/>
             <w:tcBorders>
               <w:top w:val="single" w:color="BBBBBB" w:sz="1"/>
               <w:left w:val="single" w:color="BBBBBB" w:sz="1"/>
@@ -1509,29 +1623,29 @@
         </w:tc>
         <w:tc>
           <w:tcPr>
-            <w:tcW w:type="dxa" w:w="3300"/>
-            <w:tcBorders>
-              <w:top w:val="single" w:color="BBBBBB" w:sz="1"/>
-              <w:left w:val="single" w:color="BBBBBB" w:sz="1"/>
-              <w:bottom w:val="single" w:color="BBBBBB" w:sz="1"/>
-              <w:right w:val="single" w:color="BBBBBB" w:sz="1"/>
-            </w:tcBorders>
-            <w:tcMar>
-              <w:top w:type="dxa" w:w="60"/>
-              <w:left w:type="dxa" w:w="100"/>
-              <w:bottom w:type="dxa" w:w="60"/>
-              <w:right w:type="dxa" w:w="100"/>
-            </w:tcMar>
-          </w:tcPr>
-          <w:p>
-            <w:pPr>
-              <w:spacing w:after="0"/>
-            </w:pPr>
-            <w:r>
-              <w:rPr>
-                <w:rFonts w:ascii="Apple SD Gothic Neo" w:cs="Apple SD Gothic Neo" w:eastAsia="Apple SD Gothic Neo" w:hAnsi="Apple SD Gothic Neo"/>
-              </w:rPr>
-              <w:t xml:space="preserve">④ World 인터페이스 고정 후</w:t>
+            <w:tcW w:type="dxa" w:w="2900"/>
+            <w:tcBorders>
+              <w:top w:val="single" w:color="BBBBBB" w:sz="1"/>
+              <w:left w:val="single" w:color="BBBBBB" w:sz="1"/>
+              <w:bottom w:val="single" w:color="BBBBBB" w:sz="1"/>
+              <w:right w:val="single" w:color="BBBBBB" w:sz="1"/>
+            </w:tcBorders>
+            <w:tcMar>
+              <w:top w:type="dxa" w:w="60"/>
+              <w:left w:type="dxa" w:w="100"/>
+              <w:bottom w:type="dxa" w:w="60"/>
+              <w:right w:type="dxa" w:w="100"/>
+            </w:tcMar>
+          </w:tcPr>
+          <w:p>
+            <w:pPr>
+              <w:spacing w:after="0"/>
+            </w:pPr>
+            <w:r>
+              <w:rPr>
+                <w:rFonts w:ascii="Apple SD Gothic Neo" w:cs="Apple SD Gothic Neo" w:eastAsia="Apple SD Gothic Neo" w:hAnsi="Apple SD Gothic Neo"/>
+              </w:rPr>
+              <w:t xml:space="preserve">④-a의 World(spawn·entities) 고정 후. main.py는 ⑤-b의 gui.py 완성 후 마지막</w:t>
             </w:r>
           </w:p>
         </w:tc>
@@ -1567,7 +1681,7 @@
         </w:tc>
         <w:tc>
           <w:tcPr>
-            <w:tcW w:type="dxa" w:w="4000"/>
+            <w:tcW w:type="dxa" w:w="4600"/>
             <w:tcBorders>
               <w:top w:val="single" w:color="BBBBBB" w:sz="1"/>
               <w:left w:val="single" w:color="BBBBBB" w:sz="1"/>
@@ -1595,8 +1709,8 @@
               <w:rPr>
                 <w:rFonts w:ascii="Courier New" w:cs="Courier New" w:eastAsia="Courier New" w:hAnsi="Courier New"/>
                 <w:color w:val="1a4a7a"/>
-                <w:sz w:val="20"/>
-                <w:szCs w:val="20"/>
+                <w:sz w:val="19"/>
+                <w:szCs w:val="19"/>
               </w:rPr>
               <w:t xml:space="preserve">gui.py</w:t>
             </w:r>
@@ -1604,13 +1718,13 @@
               <w:rPr>
                 <w:rFonts w:ascii="Apple SD Gothic Neo" w:cs="Apple SD Gothic Neo" w:eastAsia="Apple SD Gothic Neo" w:hAnsi="Apple SD Gothic Neo"/>
               </w:rPr>
-              <w:t xml:space="preserve"> (화면 출력·키 입력)</w:t>
-            </w:r>
-          </w:p>
-        </w:tc>
-        <w:tc>
-          <w:tcPr>
-            <w:tcW w:type="dxa" w:w="1300"/>
+              <w:t xml:space="preserve"> (EcosystemApp: 캔버스·패널·게임 루프·키 입력)</w:t>
+            </w:r>
+          </w:p>
+        </w:tc>
+        <w:tc>
+          <w:tcPr>
+            <w:tcW w:type="dxa" w:w="1100"/>
             <w:tcBorders>
               <w:top w:val="single" w:color="BBBBBB" w:sz="1"/>
               <w:left w:val="single" w:color="BBBBBB" w:sz="1"/>
@@ -1638,29 +1752,29 @@
         </w:tc>
         <w:tc>
           <w:tcPr>
-            <w:tcW w:type="dxa" w:w="3300"/>
-            <w:tcBorders>
-              <w:top w:val="single" w:color="BBBBBB" w:sz="1"/>
-              <w:left w:val="single" w:color="BBBBBB" w:sz="1"/>
-              <w:bottom w:val="single" w:color="BBBBBB" w:sz="1"/>
-              <w:right w:val="single" w:color="BBBBBB" w:sz="1"/>
-            </w:tcBorders>
-            <w:tcMar>
-              <w:top w:type="dxa" w:w="60"/>
-              <w:left w:type="dxa" w:w="100"/>
-              <w:bottom w:type="dxa" w:w="60"/>
-              <w:right w:type="dxa" w:w="100"/>
-            </w:tcMar>
-          </w:tcPr>
-          <w:p>
-            <w:pPr>
-              <w:spacing w:after="0"/>
-            </w:pPr>
-            <w:r>
-              <w:rPr>
-                <w:rFonts w:ascii="Apple SD Gothic Neo" w:cs="Apple SD Gothic Neo" w:eastAsia="Apple SD Gothic Neo" w:hAnsi="Apple SD Gothic Neo"/>
-              </w:rPr>
-              <w:t xml:space="preserve">④ World 인터페이스 고정 후 (⑤-a와 병렬)</w:t>
+            <w:tcW w:type="dxa" w:w="2900"/>
+            <w:tcBorders>
+              <w:top w:val="single" w:color="BBBBBB" w:sz="1"/>
+              <w:left w:val="single" w:color="BBBBBB" w:sz="1"/>
+              <w:bottom w:val="single" w:color="BBBBBB" w:sz="1"/>
+              <w:right w:val="single" w:color="BBBBBB" w:sz="1"/>
+            </w:tcBorders>
+            <w:tcMar>
+              <w:top w:type="dxa" w:w="60"/>
+              <w:left w:type="dxa" w:w="100"/>
+              <w:bottom w:type="dxa" w:w="60"/>
+              <w:right w:type="dxa" w:w="100"/>
+            </w:tcMar>
+          </w:tcPr>
+          <w:p>
+            <w:pPr>
+              <w:spacing w:after="0"/>
+            </w:pPr>
+            <w:r>
+              <w:rPr>
+                <w:rFonts w:ascii="Apple SD Gothic Neo" w:cs="Apple SD Gothic Neo" w:eastAsia="Apple SD Gothic Neo" w:hAnsi="Apple SD Gothic Neo"/>
+              </w:rPr>
+              <w:t xml:space="preserve">④-a의 World(step·stats·events) 고정 후 (⑤-a와 병렬)</w:t>
             </w:r>
           </w:p>
         </w:tc>
@@ -1696,35 +1810,35 @@
         </w:tc>
         <w:tc>
           <w:tcPr>
-            <w:tcW w:type="dxa" w:w="4000"/>
-            <w:tcBorders>
-              <w:top w:val="single" w:color="BBBBBB" w:sz="1"/>
-              <w:left w:val="single" w:color="BBBBBB" w:sz="1"/>
-              <w:bottom w:val="single" w:color="BBBBBB" w:sz="1"/>
-              <w:right w:val="single" w:color="BBBBBB" w:sz="1"/>
-            </w:tcBorders>
-            <w:tcMar>
-              <w:top w:type="dxa" w:w="60"/>
-              <w:left w:type="dxa" w:w="100"/>
-              <w:bottom w:type="dxa" w:w="60"/>
-              <w:right w:type="dxa" w:w="100"/>
-            </w:tcMar>
-          </w:tcPr>
-          <w:p>
-            <w:pPr>
-              <w:spacing w:after="0"/>
-            </w:pPr>
-            <w:r>
-              <w:rPr>
-                <w:rFonts w:ascii="Apple SD Gothic Neo" w:cs="Apple SD Gothic Neo" w:eastAsia="Apple SD Gothic Neo" w:hAnsi="Apple SD Gothic Neo"/>
-              </w:rPr>
-              <w:t xml:space="preserve">통합 · 밸런싱(개체 수/능력 조정) · 디버깅</w:t>
-            </w:r>
-          </w:p>
-        </w:tc>
-        <w:tc>
-          <w:tcPr>
-            <w:tcW w:type="dxa" w:w="1300"/>
+            <w:tcW w:type="dxa" w:w="4600"/>
+            <w:tcBorders>
+              <w:top w:val="single" w:color="BBBBBB" w:sz="1"/>
+              <w:left w:val="single" w:color="BBBBBB" w:sz="1"/>
+              <w:bottom w:val="single" w:color="BBBBBB" w:sz="1"/>
+              <w:right w:val="single" w:color="BBBBBB" w:sz="1"/>
+            </w:tcBorders>
+            <w:tcMar>
+              <w:top w:type="dxa" w:w="60"/>
+              <w:left w:type="dxa" w:w="100"/>
+              <w:bottom w:type="dxa" w:w="60"/>
+              <w:right w:type="dxa" w:w="100"/>
+            </w:tcMar>
+          </w:tcPr>
+          <w:p>
+            <w:pPr>
+              <w:spacing w:after="0"/>
+            </w:pPr>
+            <w:r>
+              <w:rPr>
+                <w:rFonts w:ascii="Apple SD Gothic Neo" w:cs="Apple SD Gothic Neo" w:eastAsia="Apple SD Gothic Neo" w:hAnsi="Apple SD Gothic Neo"/>
+              </w:rPr>
+              <w:t xml:space="preserve">(모든 파일) 통합 · 밸런싱(config 수치 조정) · 디버깅</w:t>
+            </w:r>
+          </w:p>
+        </w:tc>
+        <w:tc>
+          <w:tcPr>
+            <w:tcW w:type="dxa" w:w="1100"/>
             <w:tcBorders>
               <w:top w:val="single" w:color="BBBBBB" w:sz="1"/>
               <w:left w:val="single" w:color="BBBBBB" w:sz="1"/>
@@ -1752,7 +1866,7 @@
         </w:tc>
         <w:tc>
           <w:tcPr>
-            <w:tcW w:type="dxa" w:w="3300"/>
+            <w:tcW w:type="dxa" w:w="2900"/>
             <w:tcBorders>
               <w:top w:val="single" w:color="BBBBBB" w:sz="1"/>
               <w:left w:val="single" w:color="BBBBBB" w:sz="1"/>
@@ -1810,7 +1924,7 @@
         </w:tc>
         <w:tc>
           <w:tcPr>
-            <w:tcW w:type="dxa" w:w="4000"/>
+            <w:tcW w:type="dxa" w:w="4600"/>
             <w:tcBorders>
               <w:top w:val="single" w:color="BBBBBB" w:sz="1"/>
               <w:left w:val="single" w:color="BBBBBB" w:sz="1"/>
@@ -1838,7 +1952,7 @@
         </w:tc>
         <w:tc>
           <w:tcPr>
-            <w:tcW w:type="dxa" w:w="1300"/>
+            <w:tcW w:type="dxa" w:w="1100"/>
             <w:tcBorders>
               <w:top w:val="single" w:color="BBBBBB" w:sz="1"/>
               <w:left w:val="single" w:color="BBBBBB" w:sz="1"/>
@@ -1866,7 +1980,7 @@
         </w:tc>
         <w:tc>
           <w:tcPr>
-            <w:tcW w:type="dxa" w:w="3300"/>
+            <w:tcW w:type="dxa" w:w="2900"/>
             <w:tcBorders>
               <w:top w:val="single" w:color="BBBBBB" w:sz="1"/>
               <w:left w:val="single" w:color="BBBBBB" w:sz="1"/>
@@ -1896,7 +2010,53 @@
     </w:tbl>
     <w:p>
       <w:pPr>
-        <w:pStyle w:val="Heading2"/>
+        <w:spacing w:after="120"/>
+      </w:pPr>
+      <w:r>
+        <w:rPr>
+          <w:rFonts w:ascii="Apple SD Gothic Neo" w:cs="Apple SD Gothic Neo" w:eastAsia="Apple SD Gothic Neo" w:hAnsi="Apple SD Gothic Neo"/>
+        </w:rPr>
+        <w:t xml:space="preserve">병목은 ② </w:t>
+      </w:r>
+      <w:r>
+        <w:rPr>
+          <w:rFonts w:ascii="Courier New" w:cs="Courier New" w:eastAsia="Courier New" w:hAnsi="Courier New"/>
+          <w:color w:val="1a4a7a"/>
+          <w:sz w:val="19"/>
+          <w:szCs w:val="19"/>
+        </w:rPr>
+        <w:t xml:space="preserve">organisms.py</w:t>
+      </w:r>
+      <w:r>
+        <w:rPr>
+          <w:rFonts w:ascii="Apple SD Gothic Neo" w:cs="Apple SD Gothic Neo" w:eastAsia="Apple SD Gothic Neo" w:hAnsi="Apple SD Gothic Neo"/>
+        </w:rPr>
+        <w:t xml:space="preserve"> 부모 클래스와 ④ </w:t>
+      </w:r>
+      <w:r>
+        <w:rPr>
+          <w:rFonts w:ascii="Courier New" w:cs="Courier New" w:eastAsia="Courier New" w:hAnsi="Courier New"/>
+          <w:color w:val="1a4a7a"/>
+          <w:sz w:val="19"/>
+          <w:szCs w:val="19"/>
+        </w:rPr>
+        <w:t xml:space="preserve">world.py</w:t>
+      </w:r>
+      <w:r>
+        <w:rPr>
+          <w:rFonts w:ascii="Apple SD Gothic Neo" w:cs="Apple SD Gothic Neo" w:eastAsia="Apple SD Gothic Neo" w:hAnsi="Apple SD Gothic Neo"/>
+        </w:rPr>
+        <w:t xml:space="preserve"> 다. 이 둘의 이름(인터페이스)만 먼저 합의해 두면 속 내용이 비어 있어도 나머지 팀원이 기다리지 않고 병렬로 개발할 수 있다.</w:t>
+      </w:r>
+    </w:p>
+    <w:p>
+      <w:r>
+        <w:br w:type="page"/>
+      </w:r>
+    </w:p>
+    <w:p>
+      <w:pPr>
+        <w:pStyle w:val="Heading1"/>
       </w:pPr>
       <w:r>
         <w:rPr>
@@ -1904,7 +2064,2577 @@
           <w:b/>
           <w:bCs/>
         </w:rPr>
-        <w:t xml:space="preserve">한눈에 보는 흐름</w:t>
+        <w:t xml:space="preserve">2. 인원별 개발 순서 (파일 단위 상세)</w:t>
+      </w:r>
+    </w:p>
+    <w:p>
+      <w:pPr>
+        <w:pStyle w:val="Heading2"/>
+      </w:pPr>
+      <w:r>
+        <w:rPr>
+          <w:rFonts w:ascii="Apple SD Gothic Neo" w:cs="Apple SD Gothic Neo" w:eastAsia="Apple SD Gothic Neo" w:hAnsi="Apple SD Gothic Neo"/>
+          <w:b/>
+          <w:bCs/>
+        </w:rPr>
+        <w:t xml:space="preserve">2-1. 홍순율 — 기반을 깔고, 마지막을 닫는다</w:t>
+      </w:r>
+    </w:p>
+    <w:tbl>
+      <w:tblPr>
+        <w:tblW w:type="dxa" w:w="9400"/>
+        <w:tblBorders>
+          <w:top w:val="single" w:color="auto" w:sz="4"/>
+          <w:left w:val="single" w:color="auto" w:sz="4"/>
+          <w:bottom w:val="single" w:color="auto" w:sz="4"/>
+          <w:right w:val="single" w:color="auto" w:sz="4"/>
+          <w:insideH w:val="single" w:color="auto" w:sz="4"/>
+          <w:insideV w:val="single" w:color="auto" w:sz="4"/>
+        </w:tblBorders>
+      </w:tblPr>
+      <w:tblGrid>
+        <w:gridCol w:w="700"/>
+        <w:gridCol w:w="1500"/>
+        <w:gridCol w:w="4500"/>
+        <w:gridCol w:w="2700"/>
+      </w:tblGrid>
+      <w:tr>
+        <w:tc>
+          <w:tcPr>
+            <w:tcW w:type="dxa" w:w="700"/>
+            <w:tcBorders>
+              <w:top w:val="single" w:color="BBBBBB" w:sz="1"/>
+              <w:left w:val="single" w:color="BBBBBB" w:sz="1"/>
+              <w:bottom w:val="single" w:color="BBBBBB" w:sz="1"/>
+              <w:right w:val="single" w:color="BBBBBB" w:sz="1"/>
+            </w:tcBorders>
+            <w:shd w:fill="DCE9D5" w:val="clear"/>
+            <w:tcMar>
+              <w:top w:type="dxa" w:w="60"/>
+              <w:left w:type="dxa" w:w="100"/>
+              <w:bottom w:type="dxa" w:w="60"/>
+              <w:right w:type="dxa" w:w="100"/>
+            </w:tcMar>
+          </w:tcPr>
+          <w:p>
+            <w:pPr>
+              <w:spacing w:after="0"/>
+            </w:pPr>
+            <w:r>
+              <w:rPr>
+                <w:rFonts w:ascii="Apple SD Gothic Neo" w:cs="Apple SD Gothic Neo" w:eastAsia="Apple SD Gothic Neo" w:hAnsi="Apple SD Gothic Neo"/>
+                <w:b/>
+                <w:bCs/>
+              </w:rPr>
+              <w:t xml:space="preserve">순서</w:t>
+            </w:r>
+          </w:p>
+        </w:tc>
+        <w:tc>
+          <w:tcPr>
+            <w:tcW w:type="dxa" w:w="1500"/>
+            <w:tcBorders>
+              <w:top w:val="single" w:color="BBBBBB" w:sz="1"/>
+              <w:left w:val="single" w:color="BBBBBB" w:sz="1"/>
+              <w:bottom w:val="single" w:color="BBBBBB" w:sz="1"/>
+              <w:right w:val="single" w:color="BBBBBB" w:sz="1"/>
+            </w:tcBorders>
+            <w:shd w:fill="DCE9D5" w:val="clear"/>
+            <w:tcMar>
+              <w:top w:type="dxa" w:w="60"/>
+              <w:left w:type="dxa" w:w="100"/>
+              <w:bottom w:type="dxa" w:w="60"/>
+              <w:right w:type="dxa" w:w="100"/>
+            </w:tcMar>
+          </w:tcPr>
+          <w:p>
+            <w:pPr>
+              <w:spacing w:after="0"/>
+            </w:pPr>
+            <w:r>
+              <w:rPr>
+                <w:rFonts w:ascii="Apple SD Gothic Neo" w:cs="Apple SD Gothic Neo" w:eastAsia="Apple SD Gothic Neo" w:hAnsi="Apple SD Gothic Neo"/>
+                <w:b/>
+                <w:bCs/>
+              </w:rPr>
+              <w:t xml:space="preserve">파일</w:t>
+            </w:r>
+          </w:p>
+        </w:tc>
+        <w:tc>
+          <w:tcPr>
+            <w:tcW w:type="dxa" w:w="4500"/>
+            <w:tcBorders>
+              <w:top w:val="single" w:color="BBBBBB" w:sz="1"/>
+              <w:left w:val="single" w:color="BBBBBB" w:sz="1"/>
+              <w:bottom w:val="single" w:color="BBBBBB" w:sz="1"/>
+              <w:right w:val="single" w:color="BBBBBB" w:sz="1"/>
+            </w:tcBorders>
+            <w:shd w:fill="DCE9D5" w:val="clear"/>
+            <w:tcMar>
+              <w:top w:type="dxa" w:w="60"/>
+              <w:left w:type="dxa" w:w="100"/>
+              <w:bottom w:type="dxa" w:w="60"/>
+              <w:right w:type="dxa" w:w="100"/>
+            </w:tcMar>
+          </w:tcPr>
+          <w:p>
+            <w:pPr>
+              <w:spacing w:after="0"/>
+            </w:pPr>
+            <w:r>
+              <w:rPr>
+                <w:rFonts w:ascii="Apple SD Gothic Neo" w:cs="Apple SD Gothic Neo" w:eastAsia="Apple SD Gothic Neo" w:hAnsi="Apple SD Gothic Neo"/>
+                <w:b/>
+                <w:bCs/>
+              </w:rPr>
+              <w:t xml:space="preserve">만드는 것</w:t>
+            </w:r>
+          </w:p>
+        </w:tc>
+        <w:tc>
+          <w:tcPr>
+            <w:tcW w:type="dxa" w:w="2700"/>
+            <w:tcBorders>
+              <w:top w:val="single" w:color="BBBBBB" w:sz="1"/>
+              <w:left w:val="single" w:color="BBBBBB" w:sz="1"/>
+              <w:bottom w:val="single" w:color="BBBBBB" w:sz="1"/>
+              <w:right w:val="single" w:color="BBBBBB" w:sz="1"/>
+            </w:tcBorders>
+            <w:shd w:fill="DCE9D5" w:val="clear"/>
+            <w:tcMar>
+              <w:top w:type="dxa" w:w="60"/>
+              <w:left w:type="dxa" w:w="100"/>
+              <w:bottom w:type="dxa" w:w="60"/>
+              <w:right w:type="dxa" w:w="100"/>
+            </w:tcMar>
+          </w:tcPr>
+          <w:p>
+            <w:pPr>
+              <w:spacing w:after="0"/>
+            </w:pPr>
+            <w:r>
+              <w:rPr>
+                <w:rFonts w:ascii="Apple SD Gothic Neo" w:cs="Apple SD Gothic Neo" w:eastAsia="Apple SD Gothic Neo" w:hAnsi="Apple SD Gothic Neo"/>
+                <w:b/>
+                <w:bCs/>
+              </w:rPr>
+              <w:t xml:space="preserve">시작 조건</w:t>
+            </w:r>
+          </w:p>
+        </w:tc>
+      </w:tr>
+      <w:tr>
+        <w:tc>
+          <w:tcPr>
+            <w:tcW w:type="dxa" w:w="700"/>
+            <w:tcBorders>
+              <w:top w:val="single" w:color="BBBBBB" w:sz="1"/>
+              <w:left w:val="single" w:color="BBBBBB" w:sz="1"/>
+              <w:bottom w:val="single" w:color="BBBBBB" w:sz="1"/>
+              <w:right w:val="single" w:color="BBBBBB" w:sz="1"/>
+            </w:tcBorders>
+            <w:tcMar>
+              <w:top w:type="dxa" w:w="60"/>
+              <w:left w:type="dxa" w:w="100"/>
+              <w:bottom w:type="dxa" w:w="60"/>
+              <w:right w:type="dxa" w:w="100"/>
+            </w:tcMar>
+          </w:tcPr>
+          <w:p>
+            <w:pPr>
+              <w:spacing w:after="0"/>
+            </w:pPr>
+            <w:r>
+              <w:rPr>
+                <w:rFonts w:ascii="Apple SD Gothic Neo" w:cs="Apple SD Gothic Neo" w:eastAsia="Apple SD Gothic Neo" w:hAnsi="Apple SD Gothic Neo"/>
+              </w:rPr>
+              <w:t xml:space="preserve">1</w:t>
+            </w:r>
+          </w:p>
+        </w:tc>
+        <w:tc>
+          <w:tcPr>
+            <w:tcW w:type="dxa" w:w="1500"/>
+            <w:tcBorders>
+              <w:top w:val="single" w:color="BBBBBB" w:sz="1"/>
+              <w:left w:val="single" w:color="BBBBBB" w:sz="1"/>
+              <w:bottom w:val="single" w:color="BBBBBB" w:sz="1"/>
+              <w:right w:val="single" w:color="BBBBBB" w:sz="1"/>
+            </w:tcBorders>
+            <w:tcMar>
+              <w:top w:type="dxa" w:w="60"/>
+              <w:left w:type="dxa" w:w="100"/>
+              <w:bottom w:type="dxa" w:w="60"/>
+              <w:right w:type="dxa" w:w="100"/>
+            </w:tcMar>
+          </w:tcPr>
+          <w:p>
+            <w:pPr>
+              <w:spacing w:after="0"/>
+            </w:pPr>
+            <w:r>
+              <w:rPr>
+                <w:rFonts w:ascii="Apple SD Gothic Neo" w:cs="Apple SD Gothic Neo" w:eastAsia="Apple SD Gothic Neo" w:hAnsi="Apple SD Gothic Neo"/>
+              </w:rPr>
+              <w:t xml:space="preserve"/>
+            </w:r>
+            <w:r>
+              <w:rPr>
+                <w:rFonts w:ascii="Courier New" w:cs="Courier New" w:eastAsia="Courier New" w:hAnsi="Courier New"/>
+                <w:color w:val="1a4a7a"/>
+                <w:sz w:val="19"/>
+                <w:szCs w:val="19"/>
+              </w:rPr>
+              <w:t xml:space="preserve">vector.py</w:t>
+            </w:r>
+            <w:r>
+              <w:rPr>
+                <w:rFonts w:ascii="Apple SD Gothic Neo" w:cs="Apple SD Gothic Neo" w:eastAsia="Apple SD Gothic Neo" w:hAnsi="Apple SD Gothic Neo"/>
+              </w:rPr>
+              <w:t xml:space="preserve"/>
+            </w:r>
+          </w:p>
+        </w:tc>
+        <w:tc>
+          <w:tcPr>
+            <w:tcW w:type="dxa" w:w="4500"/>
+            <w:tcBorders>
+              <w:top w:val="single" w:color="BBBBBB" w:sz="1"/>
+              <w:left w:val="single" w:color="BBBBBB" w:sz="1"/>
+              <w:bottom w:val="single" w:color="BBBBBB" w:sz="1"/>
+              <w:right w:val="single" w:color="BBBBBB" w:sz="1"/>
+            </w:tcBorders>
+            <w:tcMar>
+              <w:top w:type="dxa" w:w="60"/>
+              <w:left w:type="dxa" w:w="100"/>
+              <w:bottom w:type="dxa" w:w="60"/>
+              <w:right w:type="dxa" w:w="100"/>
+            </w:tcMar>
+          </w:tcPr>
+          <w:p>
+            <w:pPr>
+              <w:spacing w:after="0"/>
+            </w:pPr>
+            <w:r>
+              <w:rPr>
+                <w:rFonts w:ascii="Apple SD Gothic Neo" w:cs="Apple SD Gothic Neo" w:eastAsia="Apple SD Gothic Neo" w:hAnsi="Apple SD Gothic Neo"/>
+              </w:rPr>
+              <w:t xml:space="preserve">Vector2 클래스: __slots__, 사칙연산 오버로딩, length/normalized/with_length/distance_sq_to</w:t>
+            </w:r>
+          </w:p>
+        </w:tc>
+        <w:tc>
+          <w:tcPr>
+            <w:tcW w:type="dxa" w:w="2700"/>
+            <w:tcBorders>
+              <w:top w:val="single" w:color="BBBBBB" w:sz="1"/>
+              <w:left w:val="single" w:color="BBBBBB" w:sz="1"/>
+              <w:bottom w:val="single" w:color="BBBBBB" w:sz="1"/>
+              <w:right w:val="single" w:color="BBBBBB" w:sz="1"/>
+            </w:tcBorders>
+            <w:tcMar>
+              <w:top w:type="dxa" w:w="60"/>
+              <w:left w:type="dxa" w:w="100"/>
+              <w:bottom w:type="dxa" w:w="60"/>
+              <w:right w:type="dxa" w:w="100"/>
+            </w:tcMar>
+          </w:tcPr>
+          <w:p>
+            <w:pPr>
+              <w:spacing w:after="0"/>
+            </w:pPr>
+            <w:r>
+              <w:rPr>
+                <w:rFonts w:ascii="Apple SD Gothic Neo" w:cs="Apple SD Gothic Neo" w:eastAsia="Apple SD Gothic Neo" w:hAnsi="Apple SD Gothic Neo"/>
+              </w:rPr>
+              <w:t xml:space="preserve">없음 — 프로젝트 최초 작업</w:t>
+            </w:r>
+          </w:p>
+        </w:tc>
+      </w:tr>
+      <w:tr>
+        <w:tc>
+          <w:tcPr>
+            <w:tcW w:type="dxa" w:w="700"/>
+            <w:tcBorders>
+              <w:top w:val="single" w:color="BBBBBB" w:sz="1"/>
+              <w:left w:val="single" w:color="BBBBBB" w:sz="1"/>
+              <w:bottom w:val="single" w:color="BBBBBB" w:sz="1"/>
+              <w:right w:val="single" w:color="BBBBBB" w:sz="1"/>
+            </w:tcBorders>
+            <w:tcMar>
+              <w:top w:type="dxa" w:w="60"/>
+              <w:left w:type="dxa" w:w="100"/>
+              <w:bottom w:type="dxa" w:w="60"/>
+              <w:right w:type="dxa" w:w="100"/>
+            </w:tcMar>
+          </w:tcPr>
+          <w:p>
+            <w:pPr>
+              <w:spacing w:after="0"/>
+            </w:pPr>
+            <w:r>
+              <w:rPr>
+                <w:rFonts w:ascii="Apple SD Gothic Neo" w:cs="Apple SD Gothic Neo" w:eastAsia="Apple SD Gothic Neo" w:hAnsi="Apple SD Gothic Neo"/>
+              </w:rPr>
+              <w:t xml:space="preserve">2</w:t>
+            </w:r>
+          </w:p>
+        </w:tc>
+        <w:tc>
+          <w:tcPr>
+            <w:tcW w:type="dxa" w:w="1500"/>
+            <w:tcBorders>
+              <w:top w:val="single" w:color="BBBBBB" w:sz="1"/>
+              <w:left w:val="single" w:color="BBBBBB" w:sz="1"/>
+              <w:bottom w:val="single" w:color="BBBBBB" w:sz="1"/>
+              <w:right w:val="single" w:color="BBBBBB" w:sz="1"/>
+            </w:tcBorders>
+            <w:tcMar>
+              <w:top w:type="dxa" w:w="60"/>
+              <w:left w:type="dxa" w:w="100"/>
+              <w:bottom w:type="dxa" w:w="60"/>
+              <w:right w:type="dxa" w:w="100"/>
+            </w:tcMar>
+          </w:tcPr>
+          <w:p>
+            <w:pPr>
+              <w:spacing w:after="0"/>
+            </w:pPr>
+            <w:r>
+              <w:rPr>
+                <w:rFonts w:ascii="Apple SD Gothic Neo" w:cs="Apple SD Gothic Neo" w:eastAsia="Apple SD Gothic Neo" w:hAnsi="Apple SD Gothic Neo"/>
+              </w:rPr>
+              <w:t xml:space="preserve"/>
+            </w:r>
+            <w:r>
+              <w:rPr>
+                <w:rFonts w:ascii="Courier New" w:cs="Courier New" w:eastAsia="Courier New" w:hAnsi="Courier New"/>
+                <w:color w:val="1a4a7a"/>
+                <w:sz w:val="19"/>
+                <w:szCs w:val="19"/>
+              </w:rPr>
+              <w:t xml:space="preserve">physics.py</w:t>
+            </w:r>
+            <w:r>
+              <w:rPr>
+                <w:rFonts w:ascii="Apple SD Gothic Neo" w:cs="Apple SD Gothic Neo" w:eastAsia="Apple SD Gothic Neo" w:hAnsi="Apple SD Gothic Neo"/>
+              </w:rPr>
+              <w:t xml:space="preserve"/>
+            </w:r>
+          </w:p>
+        </w:tc>
+        <w:tc>
+          <w:tcPr>
+            <w:tcW w:type="dxa" w:w="4500"/>
+            <w:tcBorders>
+              <w:top w:val="single" w:color="BBBBBB" w:sz="1"/>
+              <w:left w:val="single" w:color="BBBBBB" w:sz="1"/>
+              <w:bottom w:val="single" w:color="BBBBBB" w:sz="1"/>
+              <w:right w:val="single" w:color="BBBBBB" w:sz="1"/>
+            </w:tcBorders>
+            <w:tcMar>
+              <w:top w:type="dxa" w:w="60"/>
+              <w:left w:type="dxa" w:w="100"/>
+              <w:bottom w:type="dxa" w:w="60"/>
+              <w:right w:type="dxa" w:w="100"/>
+            </w:tcMar>
+          </w:tcPr>
+          <w:p>
+            <w:pPr>
+              <w:spacing w:after="0"/>
+            </w:pPr>
+            <w:r>
+              <w:rPr>
+                <w:rFonts w:ascii="Apple SD Gothic Neo" w:cs="Apple SD Gothic Neo" w:eastAsia="Apple SD Gothic Neo" w:hAnsi="Apple SD Gothic Neo"/>
+              </w:rPr>
+              <w:t xml:space="preserve">조향(seek·flee·wander·separate), 적분(integrate), 경계(clamp_to_bounds·clamp_point), 충돌(is_contact·within_range), 넉백(knockback)</w:t>
+            </w:r>
+          </w:p>
+        </w:tc>
+        <w:tc>
+          <w:tcPr>
+            <w:tcW w:type="dxa" w:w="2700"/>
+            <w:tcBorders>
+              <w:top w:val="single" w:color="BBBBBB" w:sz="1"/>
+              <w:left w:val="single" w:color="BBBBBB" w:sz="1"/>
+              <w:bottom w:val="single" w:color="BBBBBB" w:sz="1"/>
+              <w:right w:val="single" w:color="BBBBBB" w:sz="1"/>
+            </w:tcBorders>
+            <w:tcMar>
+              <w:top w:type="dxa" w:w="60"/>
+              <w:left w:type="dxa" w:w="100"/>
+              <w:bottom w:type="dxa" w:w="60"/>
+              <w:right w:type="dxa" w:w="100"/>
+            </w:tcMar>
+          </w:tcPr>
+          <w:p>
+            <w:pPr>
+              <w:spacing w:after="0"/>
+            </w:pPr>
+            <w:r>
+              <w:rPr>
+                <w:rFonts w:ascii="Apple SD Gothic Neo" w:cs="Apple SD Gothic Neo" w:eastAsia="Apple SD Gothic Neo" w:hAnsi="Apple SD Gothic Neo"/>
+              </w:rPr>
+              <w:t xml:space="preserve">1번 vector.py 완성 직후</w:t>
+            </w:r>
+          </w:p>
+        </w:tc>
+      </w:tr>
+      <w:tr>
+        <w:tc>
+          <w:tcPr>
+            <w:tcW w:type="dxa" w:w="700"/>
+            <w:tcBorders>
+              <w:top w:val="single" w:color="BBBBBB" w:sz="1"/>
+              <w:left w:val="single" w:color="BBBBBB" w:sz="1"/>
+              <w:bottom w:val="single" w:color="BBBBBB" w:sz="1"/>
+              <w:right w:val="single" w:color="BBBBBB" w:sz="1"/>
+            </w:tcBorders>
+            <w:tcMar>
+              <w:top w:type="dxa" w:w="60"/>
+              <w:left w:type="dxa" w:w="100"/>
+              <w:bottom w:type="dxa" w:w="60"/>
+              <w:right w:type="dxa" w:w="100"/>
+            </w:tcMar>
+          </w:tcPr>
+          <w:p>
+            <w:pPr>
+              <w:spacing w:after="0"/>
+            </w:pPr>
+            <w:r>
+              <w:rPr>
+                <w:rFonts w:ascii="Apple SD Gothic Neo" w:cs="Apple SD Gothic Neo" w:eastAsia="Apple SD Gothic Neo" w:hAnsi="Apple SD Gothic Neo"/>
+              </w:rPr>
+              <w:t xml:space="preserve">3</w:t>
+            </w:r>
+          </w:p>
+        </w:tc>
+        <w:tc>
+          <w:tcPr>
+            <w:tcW w:type="dxa" w:w="1500"/>
+            <w:tcBorders>
+              <w:top w:val="single" w:color="BBBBBB" w:sz="1"/>
+              <w:left w:val="single" w:color="BBBBBB" w:sz="1"/>
+              <w:bottom w:val="single" w:color="BBBBBB" w:sz="1"/>
+              <w:right w:val="single" w:color="BBBBBB" w:sz="1"/>
+            </w:tcBorders>
+            <w:tcMar>
+              <w:top w:type="dxa" w:w="60"/>
+              <w:left w:type="dxa" w:w="100"/>
+              <w:bottom w:type="dxa" w:w="60"/>
+              <w:right w:type="dxa" w:w="100"/>
+            </w:tcMar>
+          </w:tcPr>
+          <w:p>
+            <w:pPr>
+              <w:spacing w:after="0"/>
+            </w:pPr>
+            <w:r>
+              <w:rPr>
+                <w:rFonts w:ascii="Apple SD Gothic Neo" w:cs="Apple SD Gothic Neo" w:eastAsia="Apple SD Gothic Neo" w:hAnsi="Apple SD Gothic Neo"/>
+              </w:rPr>
+              <w:t xml:space="preserve"/>
+            </w:r>
+            <w:r>
+              <w:rPr>
+                <w:rFonts w:ascii="Courier New" w:cs="Courier New" w:eastAsia="Courier New" w:hAnsi="Courier New"/>
+                <w:color w:val="1a4a7a"/>
+                <w:sz w:val="19"/>
+                <w:szCs w:val="19"/>
+              </w:rPr>
+              <w:t xml:space="preserve">config.py</w:t>
+            </w:r>
+            <w:r>
+              <w:rPr>
+                <w:rFonts w:ascii="Apple SD Gothic Neo" w:cs="Apple SD Gothic Neo" w:eastAsia="Apple SD Gothic Neo" w:hAnsi="Apple SD Gothic Neo"/>
+              </w:rPr>
+              <w:t xml:space="preserve"/>
+            </w:r>
+          </w:p>
+        </w:tc>
+        <w:tc>
+          <w:tcPr>
+            <w:tcW w:type="dxa" w:w="4500"/>
+            <w:tcBorders>
+              <w:top w:val="single" w:color="BBBBBB" w:sz="1"/>
+              <w:left w:val="single" w:color="BBBBBB" w:sz="1"/>
+              <w:bottom w:val="single" w:color="BBBBBB" w:sz="1"/>
+              <w:right w:val="single" w:color="BBBBBB" w:sz="1"/>
+            </w:tcBorders>
+            <w:tcMar>
+              <w:top w:type="dxa" w:w="60"/>
+              <w:left w:type="dxa" w:w="100"/>
+              <w:bottom w:type="dxa" w:w="60"/>
+              <w:right w:type="dxa" w:w="100"/>
+            </w:tcMar>
+          </w:tcPr>
+          <w:p>
+            <w:pPr>
+              <w:spacing w:after="0"/>
+            </w:pPr>
+            <w:r>
+              <w:rPr>
+                <w:rFonts w:ascii="Apple SD Gothic Neo" w:cs="Apple SD Gothic Neo" w:eastAsia="Apple SD Gothic Neo" w:hAnsi="Apple SD Gothic Neo"/>
+              </w:rPr>
+              <w:t xml:space="preserve">월드 크기·프레임·초기/최대 개체 수·번식 밸런스 상수·팔레트·한국어 이름</w:t>
+            </w:r>
+          </w:p>
+        </w:tc>
+        <w:tc>
+          <w:tcPr>
+            <w:tcW w:type="dxa" w:w="2700"/>
+            <w:tcBorders>
+              <w:top w:val="single" w:color="BBBBBB" w:sz="1"/>
+              <w:left w:val="single" w:color="BBBBBB" w:sz="1"/>
+              <w:bottom w:val="single" w:color="BBBBBB" w:sz="1"/>
+              <w:right w:val="single" w:color="BBBBBB" w:sz="1"/>
+            </w:tcBorders>
+            <w:tcMar>
+              <w:top w:type="dxa" w:w="60"/>
+              <w:left w:type="dxa" w:w="100"/>
+              <w:bottom w:type="dxa" w:w="60"/>
+              <w:right w:type="dxa" w:w="100"/>
+            </w:tcMar>
+          </w:tcPr>
+          <w:p>
+            <w:pPr>
+              <w:spacing w:after="0"/>
+            </w:pPr>
+            <w:r>
+              <w:rPr>
+                <w:rFonts w:ascii="Apple SD Gothic Neo" w:cs="Apple SD Gothic Neo" w:eastAsia="Apple SD Gothic Neo" w:hAnsi="Apple SD Gothic Neo"/>
+              </w:rPr>
+              <w:t xml:space="preserve">없음 — 1·2번과 병행 가능</w:t>
+            </w:r>
+          </w:p>
+        </w:tc>
+      </w:tr>
+      <w:tr>
+        <w:tc>
+          <w:tcPr>
+            <w:tcW w:type="dxa" w:w="700"/>
+            <w:tcBorders>
+              <w:top w:val="single" w:color="BBBBBB" w:sz="1"/>
+              <w:left w:val="single" w:color="BBBBBB" w:sz="1"/>
+              <w:bottom w:val="single" w:color="BBBBBB" w:sz="1"/>
+              <w:right w:val="single" w:color="BBBBBB" w:sz="1"/>
+            </w:tcBorders>
+            <w:tcMar>
+              <w:top w:type="dxa" w:w="60"/>
+              <w:left w:type="dxa" w:w="100"/>
+              <w:bottom w:type="dxa" w:w="60"/>
+              <w:right w:type="dxa" w:w="100"/>
+            </w:tcMar>
+          </w:tcPr>
+          <w:p>
+            <w:pPr>
+              <w:spacing w:after="0"/>
+            </w:pPr>
+            <w:r>
+              <w:rPr>
+                <w:rFonts w:ascii="Apple SD Gothic Neo" w:cs="Apple SD Gothic Neo" w:eastAsia="Apple SD Gothic Neo" w:hAnsi="Apple SD Gothic Neo"/>
+              </w:rPr>
+              <w:t xml:space="preserve">4</w:t>
+            </w:r>
+          </w:p>
+        </w:tc>
+        <w:tc>
+          <w:tcPr>
+            <w:tcW w:type="dxa" w:w="1500"/>
+            <w:tcBorders>
+              <w:top w:val="single" w:color="BBBBBB" w:sz="1"/>
+              <w:left w:val="single" w:color="BBBBBB" w:sz="1"/>
+              <w:bottom w:val="single" w:color="BBBBBB" w:sz="1"/>
+              <w:right w:val="single" w:color="BBBBBB" w:sz="1"/>
+            </w:tcBorders>
+            <w:tcMar>
+              <w:top w:type="dxa" w:w="60"/>
+              <w:left w:type="dxa" w:w="100"/>
+              <w:bottom w:type="dxa" w:w="60"/>
+              <w:right w:type="dxa" w:w="100"/>
+            </w:tcMar>
+          </w:tcPr>
+          <w:p>
+            <w:pPr>
+              <w:spacing w:after="0"/>
+            </w:pPr>
+            <w:r>
+              <w:rPr>
+                <w:rFonts w:ascii="Apple SD Gothic Neo" w:cs="Apple SD Gothic Neo" w:eastAsia="Apple SD Gothic Neo" w:hAnsi="Apple SD Gothic Neo"/>
+              </w:rPr>
+              <w:t xml:space="preserve"/>
+            </w:r>
+            <w:r>
+              <w:rPr>
+                <w:rFonts w:ascii="Courier New" w:cs="Courier New" w:eastAsia="Courier New" w:hAnsi="Courier New"/>
+                <w:color w:val="1a4a7a"/>
+                <w:sz w:val="19"/>
+                <w:szCs w:val="19"/>
+              </w:rPr>
+              <w:t xml:space="preserve">disaster.py</w:t>
+            </w:r>
+            <w:r>
+              <w:rPr>
+                <w:rFonts w:ascii="Apple SD Gothic Neo" w:cs="Apple SD Gothic Neo" w:eastAsia="Apple SD Gothic Neo" w:hAnsi="Apple SD Gothic Neo"/>
+              </w:rPr>
+              <w:t xml:space="preserve"/>
+            </w:r>
+          </w:p>
+        </w:tc>
+        <w:tc>
+          <w:tcPr>
+            <w:tcW w:type="dxa" w:w="4500"/>
+            <w:tcBorders>
+              <w:top w:val="single" w:color="BBBBBB" w:sz="1"/>
+              <w:left w:val="single" w:color="BBBBBB" w:sz="1"/>
+              <w:bottom w:val="single" w:color="BBBBBB" w:sz="1"/>
+              <w:right w:val="single" w:color="BBBBBB" w:sz="1"/>
+            </w:tcBorders>
+            <w:tcMar>
+              <w:top w:type="dxa" w:w="60"/>
+              <w:left w:type="dxa" w:w="100"/>
+              <w:bottom w:type="dxa" w:w="60"/>
+              <w:right w:type="dxa" w:w="100"/>
+            </w:tcMar>
+          </w:tcPr>
+          <w:p>
+            <w:pPr>
+              <w:spacing w:after="0"/>
+            </w:pPr>
+            <w:r>
+              <w:rPr>
+                <w:rFonts w:ascii="Apple SD Gothic Neo" w:cs="Apple SD Gothic Neo" w:eastAsia="Apple SD Gothic Neo" w:hAnsi="Apple SD Gothic Neo"/>
+              </w:rPr>
+              <w:t xml:space="preserve">Tractor(Entity 상속)·spawn_tractors. 심성진의 Entity와 World.spawn이 필요</w:t>
+            </w:r>
+          </w:p>
+        </w:tc>
+        <w:tc>
+          <w:tcPr>
+            <w:tcW w:type="dxa" w:w="2700"/>
+            <w:tcBorders>
+              <w:top w:val="single" w:color="BBBBBB" w:sz="1"/>
+              <w:left w:val="single" w:color="BBBBBB" w:sz="1"/>
+              <w:bottom w:val="single" w:color="BBBBBB" w:sz="1"/>
+              <w:right w:val="single" w:color="BBBBBB" w:sz="1"/>
+            </w:tcBorders>
+            <w:tcMar>
+              <w:top w:type="dxa" w:w="60"/>
+              <w:left w:type="dxa" w:w="100"/>
+              <w:bottom w:type="dxa" w:w="60"/>
+              <w:right w:type="dxa" w:w="100"/>
+            </w:tcMar>
+          </w:tcPr>
+          <w:p>
+            <w:pPr>
+              <w:spacing w:after="0"/>
+            </w:pPr>
+            <w:r>
+              <w:rPr>
+                <w:rFonts w:ascii="Apple SD Gothic Neo" w:cs="Apple SD Gothic Neo" w:eastAsia="Apple SD Gothic Neo" w:hAnsi="Apple SD Gothic Neo"/>
+              </w:rPr>
+              <w:t xml:space="preserve">②-a Entity + ④-a World 인터페이스 고정 후</w:t>
+            </w:r>
+          </w:p>
+        </w:tc>
+      </w:tr>
+      <w:tr>
+        <w:tc>
+          <w:tcPr>
+            <w:tcW w:type="dxa" w:w="700"/>
+            <w:tcBorders>
+              <w:top w:val="single" w:color="BBBBBB" w:sz="1"/>
+              <w:left w:val="single" w:color="BBBBBB" w:sz="1"/>
+              <w:bottom w:val="single" w:color="BBBBBB" w:sz="1"/>
+              <w:right w:val="single" w:color="BBBBBB" w:sz="1"/>
+            </w:tcBorders>
+            <w:tcMar>
+              <w:top w:type="dxa" w:w="60"/>
+              <w:left w:type="dxa" w:w="100"/>
+              <w:bottom w:type="dxa" w:w="60"/>
+              <w:right w:type="dxa" w:w="100"/>
+            </w:tcMar>
+          </w:tcPr>
+          <w:p>
+            <w:pPr>
+              <w:spacing w:after="0"/>
+            </w:pPr>
+            <w:r>
+              <w:rPr>
+                <w:rFonts w:ascii="Apple SD Gothic Neo" w:cs="Apple SD Gothic Neo" w:eastAsia="Apple SD Gothic Neo" w:hAnsi="Apple SD Gothic Neo"/>
+              </w:rPr>
+              <w:t xml:space="preserve">5</w:t>
+            </w:r>
+          </w:p>
+        </w:tc>
+        <w:tc>
+          <w:tcPr>
+            <w:tcW w:type="dxa" w:w="1500"/>
+            <w:tcBorders>
+              <w:top w:val="single" w:color="BBBBBB" w:sz="1"/>
+              <w:left w:val="single" w:color="BBBBBB" w:sz="1"/>
+              <w:bottom w:val="single" w:color="BBBBBB" w:sz="1"/>
+              <w:right w:val="single" w:color="BBBBBB" w:sz="1"/>
+            </w:tcBorders>
+            <w:tcMar>
+              <w:top w:type="dxa" w:w="60"/>
+              <w:left w:type="dxa" w:w="100"/>
+              <w:bottom w:type="dxa" w:w="60"/>
+              <w:right w:type="dxa" w:w="100"/>
+            </w:tcMar>
+          </w:tcPr>
+          <w:p>
+            <w:pPr>
+              <w:spacing w:after="0"/>
+            </w:pPr>
+            <w:r>
+              <w:rPr>
+                <w:rFonts w:ascii="Apple SD Gothic Neo" w:cs="Apple SD Gothic Neo" w:eastAsia="Apple SD Gothic Neo" w:hAnsi="Apple SD Gothic Neo"/>
+              </w:rPr>
+              <w:t xml:space="preserve"/>
+            </w:r>
+            <w:r>
+              <w:rPr>
+                <w:rFonts w:ascii="Courier New" w:cs="Courier New" w:eastAsia="Courier New" w:hAnsi="Courier New"/>
+                <w:color w:val="1a4a7a"/>
+                <w:sz w:val="19"/>
+                <w:szCs w:val="19"/>
+              </w:rPr>
+              <w:t xml:space="preserve">main.py</w:t>
+            </w:r>
+            <w:r>
+              <w:rPr>
+                <w:rFonts w:ascii="Apple SD Gothic Neo" w:cs="Apple SD Gothic Neo" w:eastAsia="Apple SD Gothic Neo" w:hAnsi="Apple SD Gothic Neo"/>
+              </w:rPr>
+              <w:t xml:space="preserve"/>
+            </w:r>
+          </w:p>
+        </w:tc>
+        <w:tc>
+          <w:tcPr>
+            <w:tcW w:type="dxa" w:w="4500"/>
+            <w:tcBorders>
+              <w:top w:val="single" w:color="BBBBBB" w:sz="1"/>
+              <w:left w:val="single" w:color="BBBBBB" w:sz="1"/>
+              <w:bottom w:val="single" w:color="BBBBBB" w:sz="1"/>
+              <w:right w:val="single" w:color="BBBBBB" w:sz="1"/>
+            </w:tcBorders>
+            <w:tcMar>
+              <w:top w:type="dxa" w:w="60"/>
+              <w:left w:type="dxa" w:w="100"/>
+              <w:bottom w:type="dxa" w:w="60"/>
+              <w:right w:type="dxa" w:w="100"/>
+            </w:tcMar>
+          </w:tcPr>
+          <w:p>
+            <w:pPr>
+              <w:spacing w:after="0"/>
+            </w:pPr>
+            <w:r>
+              <w:rPr>
+                <w:rFonts w:ascii="Apple SD Gothic Neo" w:cs="Apple SD Gothic Neo" w:eastAsia="Apple SD Gothic Neo" w:hAnsi="Apple SD Gothic Neo"/>
+              </w:rPr>
+              <w:t xml:space="preserve">tk 루트 생성 → EcosystemApp 실행. 전체 중 '맨 마지막' 파일</w:t>
+            </w:r>
+          </w:p>
+        </w:tc>
+        <w:tc>
+          <w:tcPr>
+            <w:tcW w:type="dxa" w:w="2700"/>
+            <w:tcBorders>
+              <w:top w:val="single" w:color="BBBBBB" w:sz="1"/>
+              <w:left w:val="single" w:color="BBBBBB" w:sz="1"/>
+              <w:bottom w:val="single" w:color="BBBBBB" w:sz="1"/>
+              <w:right w:val="single" w:color="BBBBBB" w:sz="1"/>
+            </w:tcBorders>
+            <w:tcMar>
+              <w:top w:type="dxa" w:w="60"/>
+              <w:left w:type="dxa" w:w="100"/>
+              <w:bottom w:type="dxa" w:w="60"/>
+              <w:right w:type="dxa" w:w="100"/>
+            </w:tcMar>
+          </w:tcPr>
+          <w:p>
+            <w:pPr>
+              <w:spacing w:after="0"/>
+            </w:pPr>
+            <w:r>
+              <w:rPr>
+                <w:rFonts w:ascii="Apple SD Gothic Neo" w:cs="Apple SD Gothic Neo" w:eastAsia="Apple SD Gothic Neo" w:hAnsi="Apple SD Gothic Neo"/>
+              </w:rPr>
+              <w:t xml:space="preserve">한시헌의 gui.py 완성 후</w:t>
+            </w:r>
+          </w:p>
+        </w:tc>
+      </w:tr>
+    </w:tbl>
+    <w:p>
+      <w:pPr>
+        <w:spacing w:after="120"/>
+      </w:pPr>
+      <w:r>
+        <w:rPr>
+          <w:rFonts w:ascii="Apple SD Gothic Neo" w:cs="Apple SD Gothic Neo" w:eastAsia="Apple SD Gothic Neo" w:hAnsi="Apple SD Gothic Neo"/>
+        </w:rPr>
+        <w:t xml:space="preserve">요약: </w:t>
+      </w:r>
+      <w:r>
+        <w:rPr>
+          <w:rFonts w:ascii="Courier New" w:cs="Courier New" w:eastAsia="Courier New" w:hAnsi="Courier New"/>
+          <w:color w:val="1a4a7a"/>
+          <w:sz w:val="19"/>
+          <w:szCs w:val="19"/>
+        </w:rPr>
+        <w:t xml:space="preserve">vector.py</w:t>
+      </w:r>
+      <w:r>
+        <w:rPr>
+          <w:rFonts w:ascii="Apple SD Gothic Neo" w:cs="Apple SD Gothic Neo" w:eastAsia="Apple SD Gothic Neo" w:hAnsi="Apple SD Gothic Neo"/>
+        </w:rPr>
+        <w:t xml:space="preserve"> → </w:t>
+      </w:r>
+      <w:r>
+        <w:rPr>
+          <w:rFonts w:ascii="Courier New" w:cs="Courier New" w:eastAsia="Courier New" w:hAnsi="Courier New"/>
+          <w:color w:val="1a4a7a"/>
+          <w:sz w:val="19"/>
+          <w:szCs w:val="19"/>
+        </w:rPr>
+        <w:t xml:space="preserve">physics.py</w:t>
+      </w:r>
+      <w:r>
+        <w:rPr>
+          <w:rFonts w:ascii="Apple SD Gothic Neo" w:cs="Apple SD Gothic Neo" w:eastAsia="Apple SD Gothic Neo" w:hAnsi="Apple SD Gothic Neo"/>
+        </w:rPr>
+        <w:t xml:space="preserve"> → </w:t>
+      </w:r>
+      <w:r>
+        <w:rPr>
+          <w:rFonts w:ascii="Courier New" w:cs="Courier New" w:eastAsia="Courier New" w:hAnsi="Courier New"/>
+          <w:color w:val="1a4a7a"/>
+          <w:sz w:val="19"/>
+          <w:szCs w:val="19"/>
+        </w:rPr>
+        <w:t xml:space="preserve">config.py</w:t>
+      </w:r>
+      <w:r>
+        <w:rPr>
+          <w:rFonts w:ascii="Apple SD Gothic Neo" w:cs="Apple SD Gothic Neo" w:eastAsia="Apple SD Gothic Neo" w:hAnsi="Apple SD Gothic Neo"/>
+        </w:rPr>
+        <w:t xml:space="preserve"> 까지를 가장 먼저 끝내 팀 전체의 출발선을 만들고, 중반에는 대기하다가 World가 나오면 </w:t>
+      </w:r>
+      <w:r>
+        <w:rPr>
+          <w:rFonts w:ascii="Courier New" w:cs="Courier New" w:eastAsia="Courier New" w:hAnsi="Courier New"/>
+          <w:color w:val="1a4a7a"/>
+          <w:sz w:val="19"/>
+          <w:szCs w:val="19"/>
+        </w:rPr>
+        <w:t xml:space="preserve">disaster.py</w:t>
+      </w:r>
+      <w:r>
+        <w:rPr>
+          <w:rFonts w:ascii="Apple SD Gothic Neo" w:cs="Apple SD Gothic Neo" w:eastAsia="Apple SD Gothic Neo" w:hAnsi="Apple SD Gothic Neo"/>
+        </w:rPr>
+        <w:t xml:space="preserve">, gui가 나오면 </w:t>
+      </w:r>
+      <w:r>
+        <w:rPr>
+          <w:rFonts w:ascii="Courier New" w:cs="Courier New" w:eastAsia="Courier New" w:hAnsi="Courier New"/>
+          <w:color w:val="1a4a7a"/>
+          <w:sz w:val="19"/>
+          <w:szCs w:val="19"/>
+        </w:rPr>
+        <w:t xml:space="preserve">main.py</w:t>
+      </w:r>
+      <w:r>
+        <w:rPr>
+          <w:rFonts w:ascii="Apple SD Gothic Neo" w:cs="Apple SD Gothic Neo" w:eastAsia="Apple SD Gothic Neo" w:hAnsi="Apple SD Gothic Neo"/>
+        </w:rPr>
+        <w:t xml:space="preserve"> 로 프로그램을 닫는다.</w:t>
+      </w:r>
+    </w:p>
+    <w:p>
+      <w:pPr>
+        <w:pStyle w:val="Heading2"/>
+      </w:pPr>
+      <w:r>
+        <w:rPr>
+          <w:rFonts w:ascii="Apple SD Gothic Neo" w:cs="Apple SD Gothic Neo" w:eastAsia="Apple SD Gothic Neo" w:hAnsi="Apple SD Gothic Neo"/>
+          <w:b/>
+          <w:bCs/>
+        </w:rPr>
+        <w:t xml:space="preserve">2-2. 심성진 — 인터페이스를 고정하는 두 번의 병목</w:t>
+      </w:r>
+    </w:p>
+    <w:tbl>
+      <w:tblPr>
+        <w:tblW w:type="dxa" w:w="9400"/>
+        <w:tblBorders>
+          <w:top w:val="single" w:color="auto" w:sz="4"/>
+          <w:left w:val="single" w:color="auto" w:sz="4"/>
+          <w:bottom w:val="single" w:color="auto" w:sz="4"/>
+          <w:right w:val="single" w:color="auto" w:sz="4"/>
+          <w:insideH w:val="single" w:color="auto" w:sz="4"/>
+          <w:insideV w:val="single" w:color="auto" w:sz="4"/>
+        </w:tblBorders>
+      </w:tblPr>
+      <w:tblGrid>
+        <w:gridCol w:w="700"/>
+        <w:gridCol w:w="1700"/>
+        <w:gridCol w:w="4600"/>
+        <w:gridCol w:w="2400"/>
+      </w:tblGrid>
+      <w:tr>
+        <w:tc>
+          <w:tcPr>
+            <w:tcW w:type="dxa" w:w="700"/>
+            <w:tcBorders>
+              <w:top w:val="single" w:color="BBBBBB" w:sz="1"/>
+              <w:left w:val="single" w:color="BBBBBB" w:sz="1"/>
+              <w:bottom w:val="single" w:color="BBBBBB" w:sz="1"/>
+              <w:right w:val="single" w:color="BBBBBB" w:sz="1"/>
+            </w:tcBorders>
+            <w:shd w:fill="DCE9D5" w:val="clear"/>
+            <w:tcMar>
+              <w:top w:type="dxa" w:w="60"/>
+              <w:left w:type="dxa" w:w="100"/>
+              <w:bottom w:type="dxa" w:w="60"/>
+              <w:right w:type="dxa" w:w="100"/>
+            </w:tcMar>
+          </w:tcPr>
+          <w:p>
+            <w:pPr>
+              <w:spacing w:after="0"/>
+            </w:pPr>
+            <w:r>
+              <w:rPr>
+                <w:rFonts w:ascii="Apple SD Gothic Neo" w:cs="Apple SD Gothic Neo" w:eastAsia="Apple SD Gothic Neo" w:hAnsi="Apple SD Gothic Neo"/>
+                <w:b/>
+                <w:bCs/>
+              </w:rPr>
+              <w:t xml:space="preserve">순서</w:t>
+            </w:r>
+          </w:p>
+        </w:tc>
+        <w:tc>
+          <w:tcPr>
+            <w:tcW w:type="dxa" w:w="1700"/>
+            <w:tcBorders>
+              <w:top w:val="single" w:color="BBBBBB" w:sz="1"/>
+              <w:left w:val="single" w:color="BBBBBB" w:sz="1"/>
+              <w:bottom w:val="single" w:color="BBBBBB" w:sz="1"/>
+              <w:right w:val="single" w:color="BBBBBB" w:sz="1"/>
+            </w:tcBorders>
+            <w:shd w:fill="DCE9D5" w:val="clear"/>
+            <w:tcMar>
+              <w:top w:type="dxa" w:w="60"/>
+              <w:left w:type="dxa" w:w="100"/>
+              <w:bottom w:type="dxa" w:w="60"/>
+              <w:right w:type="dxa" w:w="100"/>
+            </w:tcMar>
+          </w:tcPr>
+          <w:p>
+            <w:pPr>
+              <w:spacing w:after="0"/>
+            </w:pPr>
+            <w:r>
+              <w:rPr>
+                <w:rFonts w:ascii="Apple SD Gothic Neo" w:cs="Apple SD Gothic Neo" w:eastAsia="Apple SD Gothic Neo" w:hAnsi="Apple SD Gothic Neo"/>
+                <w:b/>
+                <w:bCs/>
+              </w:rPr>
+              <w:t xml:space="preserve">파일</w:t>
+            </w:r>
+          </w:p>
+        </w:tc>
+        <w:tc>
+          <w:tcPr>
+            <w:tcW w:type="dxa" w:w="4600"/>
+            <w:tcBorders>
+              <w:top w:val="single" w:color="BBBBBB" w:sz="1"/>
+              <w:left w:val="single" w:color="BBBBBB" w:sz="1"/>
+              <w:bottom w:val="single" w:color="BBBBBB" w:sz="1"/>
+              <w:right w:val="single" w:color="BBBBBB" w:sz="1"/>
+            </w:tcBorders>
+            <w:shd w:fill="DCE9D5" w:val="clear"/>
+            <w:tcMar>
+              <w:top w:type="dxa" w:w="60"/>
+              <w:left w:type="dxa" w:w="100"/>
+              <w:bottom w:type="dxa" w:w="60"/>
+              <w:right w:type="dxa" w:w="100"/>
+            </w:tcMar>
+          </w:tcPr>
+          <w:p>
+            <w:pPr>
+              <w:spacing w:after="0"/>
+            </w:pPr>
+            <w:r>
+              <w:rPr>
+                <w:rFonts w:ascii="Apple SD Gothic Neo" w:cs="Apple SD Gothic Neo" w:eastAsia="Apple SD Gothic Neo" w:hAnsi="Apple SD Gothic Neo"/>
+                <w:b/>
+                <w:bCs/>
+              </w:rPr>
+              <w:t xml:space="preserve">만드는 것</w:t>
+            </w:r>
+          </w:p>
+        </w:tc>
+        <w:tc>
+          <w:tcPr>
+            <w:tcW w:type="dxa" w:w="2400"/>
+            <w:tcBorders>
+              <w:top w:val="single" w:color="BBBBBB" w:sz="1"/>
+              <w:left w:val="single" w:color="BBBBBB" w:sz="1"/>
+              <w:bottom w:val="single" w:color="BBBBBB" w:sz="1"/>
+              <w:right w:val="single" w:color="BBBBBB" w:sz="1"/>
+            </w:tcBorders>
+            <w:shd w:fill="DCE9D5" w:val="clear"/>
+            <w:tcMar>
+              <w:top w:type="dxa" w:w="60"/>
+              <w:left w:type="dxa" w:w="100"/>
+              <w:bottom w:type="dxa" w:w="60"/>
+              <w:right w:type="dxa" w:w="100"/>
+            </w:tcMar>
+          </w:tcPr>
+          <w:p>
+            <w:pPr>
+              <w:spacing w:after="0"/>
+            </w:pPr>
+            <w:r>
+              <w:rPr>
+                <w:rFonts w:ascii="Apple SD Gothic Neo" w:cs="Apple SD Gothic Neo" w:eastAsia="Apple SD Gothic Neo" w:hAnsi="Apple SD Gothic Neo"/>
+                <w:b/>
+                <w:bCs/>
+              </w:rPr>
+              <w:t xml:space="preserve">시작 조건</w:t>
+            </w:r>
+          </w:p>
+        </w:tc>
+      </w:tr>
+      <w:tr>
+        <w:tc>
+          <w:tcPr>
+            <w:tcW w:type="dxa" w:w="700"/>
+            <w:tcBorders>
+              <w:top w:val="single" w:color="BBBBBB" w:sz="1"/>
+              <w:left w:val="single" w:color="BBBBBB" w:sz="1"/>
+              <w:bottom w:val="single" w:color="BBBBBB" w:sz="1"/>
+              <w:right w:val="single" w:color="BBBBBB" w:sz="1"/>
+            </w:tcBorders>
+            <w:tcMar>
+              <w:top w:type="dxa" w:w="60"/>
+              <w:left w:type="dxa" w:w="100"/>
+              <w:bottom w:type="dxa" w:w="60"/>
+              <w:right w:type="dxa" w:w="100"/>
+            </w:tcMar>
+          </w:tcPr>
+          <w:p>
+            <w:pPr>
+              <w:spacing w:after="0"/>
+            </w:pPr>
+            <w:r>
+              <w:rPr>
+                <w:rFonts w:ascii="Apple SD Gothic Neo" w:cs="Apple SD Gothic Neo" w:eastAsia="Apple SD Gothic Neo" w:hAnsi="Apple SD Gothic Neo"/>
+              </w:rPr>
+              <w:t xml:space="preserve">1</w:t>
+            </w:r>
+          </w:p>
+        </w:tc>
+        <w:tc>
+          <w:tcPr>
+            <w:tcW w:type="dxa" w:w="1700"/>
+            <w:tcBorders>
+              <w:top w:val="single" w:color="BBBBBB" w:sz="1"/>
+              <w:left w:val="single" w:color="BBBBBB" w:sz="1"/>
+              <w:bottom w:val="single" w:color="BBBBBB" w:sz="1"/>
+              <w:right w:val="single" w:color="BBBBBB" w:sz="1"/>
+            </w:tcBorders>
+            <w:tcMar>
+              <w:top w:type="dxa" w:w="60"/>
+              <w:left w:type="dxa" w:w="100"/>
+              <w:bottom w:type="dxa" w:w="60"/>
+              <w:right w:type="dxa" w:w="100"/>
+            </w:tcMar>
+          </w:tcPr>
+          <w:p>
+            <w:pPr>
+              <w:spacing w:after="0"/>
+            </w:pPr>
+            <w:r>
+              <w:rPr>
+                <w:rFonts w:ascii="Apple SD Gothic Neo" w:cs="Apple SD Gothic Neo" w:eastAsia="Apple SD Gothic Neo" w:hAnsi="Apple SD Gothic Neo"/>
+              </w:rPr>
+              <w:t xml:space="preserve"/>
+            </w:r>
+            <w:r>
+              <w:rPr>
+                <w:rFonts w:ascii="Courier New" w:cs="Courier New" w:eastAsia="Courier New" w:hAnsi="Courier New"/>
+                <w:color w:val="1a4a7a"/>
+                <w:sz w:val="19"/>
+                <w:szCs w:val="19"/>
+              </w:rPr>
+              <w:t xml:space="preserve">organisms.py</w:t>
+            </w:r>
+            <w:r>
+              <w:rPr>
+                <w:rFonts w:ascii="Apple SD Gothic Neo" w:cs="Apple SD Gothic Neo" w:eastAsia="Apple SD Gothic Neo" w:hAnsi="Apple SD Gothic Neo"/>
+              </w:rPr>
+              <w:t xml:space="preserve"> (상단)</w:t>
+            </w:r>
+          </w:p>
+        </w:tc>
+        <w:tc>
+          <w:tcPr>
+            <w:tcW w:type="dxa" w:w="4600"/>
+            <w:tcBorders>
+              <w:top w:val="single" w:color="BBBBBB" w:sz="1"/>
+              <w:left w:val="single" w:color="BBBBBB" w:sz="1"/>
+              <w:bottom w:val="single" w:color="BBBBBB" w:sz="1"/>
+              <w:right w:val="single" w:color="BBBBBB" w:sz="1"/>
+            </w:tcBorders>
+            <w:tcMar>
+              <w:top w:type="dxa" w:w="60"/>
+              <w:left w:type="dxa" w:w="100"/>
+              <w:bottom w:type="dxa" w:w="60"/>
+              <w:right w:type="dxa" w:w="100"/>
+            </w:tcMar>
+          </w:tcPr>
+          <w:p>
+            <w:pPr>
+              <w:spacing w:after="0"/>
+            </w:pPr>
+            <w:r>
+              <w:rPr>
+                <w:rFonts w:ascii="Apple SD Gothic Neo" w:cs="Apple SD Gothic Neo" w:eastAsia="Apple SD Gothic Neo" w:hAnsi="Apple SD Gothic Neo"/>
+              </w:rPr>
+              <w:t xml:space="preserve">Entity(추상 최상위: place·alive·update*) → Animal(speed·hp·ap·rsp·hunger, update 템플릿·move·eat·isalive·effective_speed·_tick_timers) → Carnivore(energy·attack·_carnivore_behavior·번식 확장) — ★1차 인터페이스 고정</w:t>
+            </w:r>
+          </w:p>
+        </w:tc>
+        <w:tc>
+          <w:tcPr>
+            <w:tcW w:type="dxa" w:w="2400"/>
+            <w:tcBorders>
+              <w:top w:val="single" w:color="BBBBBB" w:sz="1"/>
+              <w:left w:val="single" w:color="BBBBBB" w:sz="1"/>
+              <w:bottom w:val="single" w:color="BBBBBB" w:sz="1"/>
+              <w:right w:val="single" w:color="BBBBBB" w:sz="1"/>
+            </w:tcBorders>
+            <w:tcMar>
+              <w:top w:type="dxa" w:w="60"/>
+              <w:left w:type="dxa" w:w="100"/>
+              <w:bottom w:type="dxa" w:w="60"/>
+              <w:right w:type="dxa" w:w="100"/>
+            </w:tcMar>
+          </w:tcPr>
+          <w:p>
+            <w:pPr>
+              <w:spacing w:after="0"/>
+            </w:pPr>
+            <w:r>
+              <w:rPr>
+                <w:rFonts w:ascii="Apple SD Gothic Neo" w:cs="Apple SD Gothic Neo" w:eastAsia="Apple SD Gothic Neo" w:hAnsi="Apple SD Gothic Neo"/>
+              </w:rPr>
+              <w:t xml:space="preserve">홍순율의 vector.py·physics.py·config.py</w:t>
+            </w:r>
+          </w:p>
+        </w:tc>
+      </w:tr>
+      <w:tr>
+        <w:tc>
+          <w:tcPr>
+            <w:tcW w:type="dxa" w:w="700"/>
+            <w:tcBorders>
+              <w:top w:val="single" w:color="BBBBBB" w:sz="1"/>
+              <w:left w:val="single" w:color="BBBBBB" w:sz="1"/>
+              <w:bottom w:val="single" w:color="BBBBBB" w:sz="1"/>
+              <w:right w:val="single" w:color="BBBBBB" w:sz="1"/>
+            </w:tcBorders>
+            <w:tcMar>
+              <w:top w:type="dxa" w:w="60"/>
+              <w:left w:type="dxa" w:w="100"/>
+              <w:bottom w:type="dxa" w:w="60"/>
+              <w:right w:type="dxa" w:w="100"/>
+            </w:tcMar>
+          </w:tcPr>
+          <w:p>
+            <w:pPr>
+              <w:spacing w:after="0"/>
+            </w:pPr>
+            <w:r>
+              <w:rPr>
+                <w:rFonts w:ascii="Apple SD Gothic Neo" w:cs="Apple SD Gothic Neo" w:eastAsia="Apple SD Gothic Neo" w:hAnsi="Apple SD Gothic Neo"/>
+              </w:rPr>
+              <w:t xml:space="preserve">2</w:t>
+            </w:r>
+          </w:p>
+        </w:tc>
+        <w:tc>
+          <w:tcPr>
+            <w:tcW w:type="dxa" w:w="1700"/>
+            <w:tcBorders>
+              <w:top w:val="single" w:color="BBBBBB" w:sz="1"/>
+              <w:left w:val="single" w:color="BBBBBB" w:sz="1"/>
+              <w:bottom w:val="single" w:color="BBBBBB" w:sz="1"/>
+              <w:right w:val="single" w:color="BBBBBB" w:sz="1"/>
+            </w:tcBorders>
+            <w:tcMar>
+              <w:top w:type="dxa" w:w="60"/>
+              <w:left w:type="dxa" w:w="100"/>
+              <w:bottom w:type="dxa" w:w="60"/>
+              <w:right w:type="dxa" w:w="100"/>
+            </w:tcMar>
+          </w:tcPr>
+          <w:p>
+            <w:pPr>
+              <w:spacing w:after="0"/>
+            </w:pPr>
+            <w:r>
+              <w:rPr>
+                <w:rFonts w:ascii="Apple SD Gothic Neo" w:cs="Apple SD Gothic Neo" w:eastAsia="Apple SD Gothic Neo" w:hAnsi="Apple SD Gothic Neo"/>
+              </w:rPr>
+              <w:t xml:space="preserve"/>
+            </w:r>
+            <w:r>
+              <w:rPr>
+                <w:rFonts w:ascii="Courier New" w:cs="Courier New" w:eastAsia="Courier New" w:hAnsi="Courier New"/>
+                <w:color w:val="1a4a7a"/>
+                <w:sz w:val="19"/>
+                <w:szCs w:val="19"/>
+              </w:rPr>
+              <w:t xml:space="preserve">herbivores.py</w:t>
+            </w:r>
+            <w:r>
+              <w:rPr>
+                <w:rFonts w:ascii="Apple SD Gothic Neo" w:cs="Apple SD Gothic Neo" w:eastAsia="Apple SD Gothic Neo" w:hAnsi="Apple SD Gothic Neo"/>
+              </w:rPr>
+              <w:t xml:space="preserve"> (일부)</w:t>
+            </w:r>
+          </w:p>
+        </w:tc>
+        <w:tc>
+          <w:tcPr>
+            <w:tcW w:type="dxa" w:w="4600"/>
+            <w:tcBorders>
+              <w:top w:val="single" w:color="BBBBBB" w:sz="1"/>
+              <w:left w:val="single" w:color="BBBBBB" w:sz="1"/>
+              <w:bottom w:val="single" w:color="BBBBBB" w:sz="1"/>
+              <w:right w:val="single" w:color="BBBBBB" w:sz="1"/>
+            </w:tcBorders>
+            <w:tcMar>
+              <w:top w:type="dxa" w:w="60"/>
+              <w:left w:type="dxa" w:w="100"/>
+              <w:bottom w:type="dxa" w:w="60"/>
+              <w:right w:type="dxa" w:w="100"/>
+            </w:tcMar>
+          </w:tcPr>
+          <w:p>
+            <w:pPr>
+              <w:spacing w:after="0"/>
+            </w:pPr>
+            <w:r>
+              <w:rPr>
+                <w:rFonts w:ascii="Apple SD Gothic Neo" w:cs="Apple SD Gothic Neo" w:eastAsia="Apple SD Gothic Neo" w:hAnsi="Apple SD Gothic Neo"/>
+              </w:rPr>
+              <w:t xml:space="preserve">Zebra(distract)·Elephant(stomp·tree) — 한시헌의 Herbivore 부모를 상속</w:t>
+            </w:r>
+          </w:p>
+        </w:tc>
+        <w:tc>
+          <w:tcPr>
+            <w:tcW w:type="dxa" w:w="2400"/>
+            <w:tcBorders>
+              <w:top w:val="single" w:color="BBBBBB" w:sz="1"/>
+              <w:left w:val="single" w:color="BBBBBB" w:sz="1"/>
+              <w:bottom w:val="single" w:color="BBBBBB" w:sz="1"/>
+              <w:right w:val="single" w:color="BBBBBB" w:sz="1"/>
+            </w:tcBorders>
+            <w:tcMar>
+              <w:top w:type="dxa" w:w="60"/>
+              <w:left w:type="dxa" w:w="100"/>
+              <w:bottom w:type="dxa" w:w="60"/>
+              <w:right w:type="dxa" w:w="100"/>
+            </w:tcMar>
+          </w:tcPr>
+          <w:p>
+            <w:pPr>
+              <w:spacing w:after="0"/>
+            </w:pPr>
+            <w:r>
+              <w:rPr>
+                <w:rFonts w:ascii="Apple SD Gothic Neo" w:cs="Apple SD Gothic Neo" w:eastAsia="Apple SD Gothic Neo" w:hAnsi="Apple SD Gothic Neo"/>
+              </w:rPr>
+              <w:t xml:space="preserve">한시헌의 ②-b(Herbivore) 고정 후. ③단계 3인 병렬 중 하나</w:t>
+            </w:r>
+          </w:p>
+        </w:tc>
+      </w:tr>
+      <w:tr>
+        <w:tc>
+          <w:tcPr>
+            <w:tcW w:type="dxa" w:w="700"/>
+            <w:tcBorders>
+              <w:top w:val="single" w:color="BBBBBB" w:sz="1"/>
+              <w:left w:val="single" w:color="BBBBBB" w:sz="1"/>
+              <w:bottom w:val="single" w:color="BBBBBB" w:sz="1"/>
+              <w:right w:val="single" w:color="BBBBBB" w:sz="1"/>
+            </w:tcBorders>
+            <w:tcMar>
+              <w:top w:type="dxa" w:w="60"/>
+              <w:left w:type="dxa" w:w="100"/>
+              <w:bottom w:type="dxa" w:w="60"/>
+              <w:right w:type="dxa" w:w="100"/>
+            </w:tcMar>
+          </w:tcPr>
+          <w:p>
+            <w:pPr>
+              <w:spacing w:after="0"/>
+            </w:pPr>
+            <w:r>
+              <w:rPr>
+                <w:rFonts w:ascii="Apple SD Gothic Neo" w:cs="Apple SD Gothic Neo" w:eastAsia="Apple SD Gothic Neo" w:hAnsi="Apple SD Gothic Neo"/>
+              </w:rPr>
+              <w:t xml:space="preserve">3</w:t>
+            </w:r>
+          </w:p>
+        </w:tc>
+        <w:tc>
+          <w:tcPr>
+            <w:tcW w:type="dxa" w:w="1700"/>
+            <w:tcBorders>
+              <w:top w:val="single" w:color="BBBBBB" w:sz="1"/>
+              <w:left w:val="single" w:color="BBBBBB" w:sz="1"/>
+              <w:bottom w:val="single" w:color="BBBBBB" w:sz="1"/>
+              <w:right w:val="single" w:color="BBBBBB" w:sz="1"/>
+            </w:tcBorders>
+            <w:tcMar>
+              <w:top w:type="dxa" w:w="60"/>
+              <w:left w:type="dxa" w:w="100"/>
+              <w:bottom w:type="dxa" w:w="60"/>
+              <w:right w:type="dxa" w:w="100"/>
+            </w:tcMar>
+          </w:tcPr>
+          <w:p>
+            <w:pPr>
+              <w:spacing w:after="0"/>
+            </w:pPr>
+            <w:r>
+              <w:rPr>
+                <w:rFonts w:ascii="Apple SD Gothic Neo" w:cs="Apple SD Gothic Neo" w:eastAsia="Apple SD Gothic Neo" w:hAnsi="Apple SD Gothic Neo"/>
+              </w:rPr>
+              <w:t xml:space="preserve"/>
+            </w:r>
+            <w:r>
+              <w:rPr>
+                <w:rFonts w:ascii="Courier New" w:cs="Courier New" w:eastAsia="Courier New" w:hAnsi="Courier New"/>
+                <w:color w:val="1a4a7a"/>
+                <w:sz w:val="19"/>
+                <w:szCs w:val="19"/>
+              </w:rPr>
+              <w:t xml:space="preserve">world.py</w:t>
+            </w:r>
+            <w:r>
+              <w:rPr>
+                <w:rFonts w:ascii="Apple SD Gothic Neo" w:cs="Apple SD Gothic Neo" w:eastAsia="Apple SD Gothic Neo" w:hAnsi="Apple SD Gothic Neo"/>
+              </w:rPr>
+              <w:t xml:space="preserve"/>
+            </w:r>
+          </w:p>
+        </w:tc>
+        <w:tc>
+          <w:tcPr>
+            <w:tcW w:type="dxa" w:w="4600"/>
+            <w:tcBorders>
+              <w:top w:val="single" w:color="BBBBBB" w:sz="1"/>
+              <w:left w:val="single" w:color="BBBBBB" w:sz="1"/>
+              <w:bottom w:val="single" w:color="BBBBBB" w:sz="1"/>
+              <w:right w:val="single" w:color="BBBBBB" w:sz="1"/>
+            </w:tcBorders>
+            <w:tcMar>
+              <w:top w:type="dxa" w:w="60"/>
+              <w:left w:type="dxa" w:w="100"/>
+              <w:bottom w:type="dxa" w:w="60"/>
+              <w:right w:type="dxa" w:w="100"/>
+            </w:tcMar>
+          </w:tcPr>
+          <w:p>
+            <w:pPr>
+              <w:spacing w:after="0"/>
+            </w:pPr>
+            <w:r>
+              <w:rPr>
+                <w:rFonts w:ascii="Apple SD Gothic Neo" w:cs="Apple SD Gothic Neo" w:eastAsia="Apple SD Gothic Neo" w:hAnsi="Apple SD Gothic Neo"/>
+              </w:rPr>
+              <w:t xml:space="preserve">World: _populate·log·spawn·count·nearest·within·step(6단계)·_flush·_recount_grass_occupancy·_regrow_trees·_check_over·trigger_disaster·stats — ★2차 인터페이스 고정</w:t>
+            </w:r>
+          </w:p>
+        </w:tc>
+        <w:tc>
+          <w:tcPr>
+            <w:tcW w:type="dxa" w:w="2400"/>
+            <w:tcBorders>
+              <w:top w:val="single" w:color="BBBBBB" w:sz="1"/>
+              <w:left w:val="single" w:color="BBBBBB" w:sz="1"/>
+              <w:bottom w:val="single" w:color="BBBBBB" w:sz="1"/>
+              <w:right w:val="single" w:color="BBBBBB" w:sz="1"/>
+            </w:tcBorders>
+            <w:tcMar>
+              <w:top w:type="dxa" w:w="60"/>
+              <w:left w:type="dxa" w:w="100"/>
+              <w:bottom w:type="dxa" w:w="60"/>
+              <w:right w:type="dxa" w:w="100"/>
+            </w:tcMar>
+          </w:tcPr>
+          <w:p>
+            <w:pPr>
+              <w:spacing w:after="0"/>
+            </w:pPr>
+            <w:r>
+              <w:rPr>
+                <w:rFonts w:ascii="Apple SD Gothic Neo" w:cs="Apple SD Gothic Neo" w:eastAsia="Apple SD Gothic Neo" w:hAnsi="Apple SD Gothic Neo"/>
+              </w:rPr>
+              <w:t xml:space="preserve">③의 동물 클래스들이 어느 정도 모이면</w:t>
+            </w:r>
+          </w:p>
+        </w:tc>
+      </w:tr>
+    </w:tbl>
+    <w:p>
+      <w:pPr>
+        <w:spacing w:after="120"/>
+      </w:pPr>
+      <w:r>
+        <w:rPr>
+          <w:rFonts w:ascii="Apple SD Gothic Neo" w:cs="Apple SD Gothic Neo" w:eastAsia="Apple SD Gothic Neo" w:hAnsi="Apple SD Gothic Neo"/>
+        </w:rPr>
+        <w:t xml:space="preserve">요약: 프로젝트의 두 병목(부모 클래스, World)을 모두 맡으므로, 각 단계에서 '이름 먼저 고정 → 속 채우기' 순서로 일해 팀원들의 대기 시간을 최소화한다.</w:t>
+      </w:r>
+    </w:p>
+    <w:p>
+      <w:pPr>
+        <w:pStyle w:val="Heading2"/>
+      </w:pPr>
+      <w:r>
+        <w:rPr>
+          <w:rFonts w:ascii="Apple SD Gothic Neo" w:cs="Apple SD Gothic Neo" w:eastAsia="Apple SD Gothic Neo" w:hAnsi="Apple SD Gothic Neo"/>
+          <w:b/>
+          <w:bCs/>
+        </w:rPr>
+        <w:t xml:space="preserve">2-3. 심준서 — 포식자와 사건의 중재</w:t>
+      </w:r>
+    </w:p>
+    <w:tbl>
+      <w:tblPr>
+        <w:tblW w:type="dxa" w:w="9400"/>
+        <w:tblBorders>
+          <w:top w:val="single" w:color="auto" w:sz="4"/>
+          <w:left w:val="single" w:color="auto" w:sz="4"/>
+          <w:bottom w:val="single" w:color="auto" w:sz="4"/>
+          <w:right w:val="single" w:color="auto" w:sz="4"/>
+          <w:insideH w:val="single" w:color="auto" w:sz="4"/>
+          <w:insideV w:val="single" w:color="auto" w:sz="4"/>
+        </w:tblBorders>
+      </w:tblPr>
+      <w:tblGrid>
+        <w:gridCol w:w="700"/>
+        <w:gridCol w:w="1700"/>
+        <w:gridCol w:w="4600"/>
+        <w:gridCol w:w="2400"/>
+      </w:tblGrid>
+      <w:tr>
+        <w:tc>
+          <w:tcPr>
+            <w:tcW w:type="dxa" w:w="700"/>
+            <w:tcBorders>
+              <w:top w:val="single" w:color="BBBBBB" w:sz="1"/>
+              <w:left w:val="single" w:color="BBBBBB" w:sz="1"/>
+              <w:bottom w:val="single" w:color="BBBBBB" w:sz="1"/>
+              <w:right w:val="single" w:color="BBBBBB" w:sz="1"/>
+            </w:tcBorders>
+            <w:shd w:fill="DCE9D5" w:val="clear"/>
+            <w:tcMar>
+              <w:top w:type="dxa" w:w="60"/>
+              <w:left w:type="dxa" w:w="100"/>
+              <w:bottom w:type="dxa" w:w="60"/>
+              <w:right w:type="dxa" w:w="100"/>
+            </w:tcMar>
+          </w:tcPr>
+          <w:p>
+            <w:pPr>
+              <w:spacing w:after="0"/>
+            </w:pPr>
+            <w:r>
+              <w:rPr>
+                <w:rFonts w:ascii="Apple SD Gothic Neo" w:cs="Apple SD Gothic Neo" w:eastAsia="Apple SD Gothic Neo" w:hAnsi="Apple SD Gothic Neo"/>
+                <w:b/>
+                <w:bCs/>
+              </w:rPr>
+              <w:t xml:space="preserve">순서</w:t>
+            </w:r>
+          </w:p>
+        </w:tc>
+        <w:tc>
+          <w:tcPr>
+            <w:tcW w:type="dxa" w:w="1700"/>
+            <w:tcBorders>
+              <w:top w:val="single" w:color="BBBBBB" w:sz="1"/>
+              <w:left w:val="single" w:color="BBBBBB" w:sz="1"/>
+              <w:bottom w:val="single" w:color="BBBBBB" w:sz="1"/>
+              <w:right w:val="single" w:color="BBBBBB" w:sz="1"/>
+            </w:tcBorders>
+            <w:shd w:fill="DCE9D5" w:val="clear"/>
+            <w:tcMar>
+              <w:top w:type="dxa" w:w="60"/>
+              <w:left w:type="dxa" w:w="100"/>
+              <w:bottom w:type="dxa" w:w="60"/>
+              <w:right w:type="dxa" w:w="100"/>
+            </w:tcMar>
+          </w:tcPr>
+          <w:p>
+            <w:pPr>
+              <w:spacing w:after="0"/>
+            </w:pPr>
+            <w:r>
+              <w:rPr>
+                <w:rFonts w:ascii="Apple SD Gothic Neo" w:cs="Apple SD Gothic Neo" w:eastAsia="Apple SD Gothic Neo" w:hAnsi="Apple SD Gothic Neo"/>
+                <w:b/>
+                <w:bCs/>
+              </w:rPr>
+              <w:t xml:space="preserve">파일</w:t>
+            </w:r>
+          </w:p>
+        </w:tc>
+        <w:tc>
+          <w:tcPr>
+            <w:tcW w:type="dxa" w:w="4600"/>
+            <w:tcBorders>
+              <w:top w:val="single" w:color="BBBBBB" w:sz="1"/>
+              <w:left w:val="single" w:color="BBBBBB" w:sz="1"/>
+              <w:bottom w:val="single" w:color="BBBBBB" w:sz="1"/>
+              <w:right w:val="single" w:color="BBBBBB" w:sz="1"/>
+            </w:tcBorders>
+            <w:shd w:fill="DCE9D5" w:val="clear"/>
+            <w:tcMar>
+              <w:top w:type="dxa" w:w="60"/>
+              <w:left w:type="dxa" w:w="100"/>
+              <w:bottom w:type="dxa" w:w="60"/>
+              <w:right w:type="dxa" w:w="100"/>
+            </w:tcMar>
+          </w:tcPr>
+          <w:p>
+            <w:pPr>
+              <w:spacing w:after="0"/>
+            </w:pPr>
+            <w:r>
+              <w:rPr>
+                <w:rFonts w:ascii="Apple SD Gothic Neo" w:cs="Apple SD Gothic Neo" w:eastAsia="Apple SD Gothic Neo" w:hAnsi="Apple SD Gothic Neo"/>
+                <w:b/>
+                <w:bCs/>
+              </w:rPr>
+              <w:t xml:space="preserve">만드는 것</w:t>
+            </w:r>
+          </w:p>
+        </w:tc>
+        <w:tc>
+          <w:tcPr>
+            <w:tcW w:type="dxa" w:w="2400"/>
+            <w:tcBorders>
+              <w:top w:val="single" w:color="BBBBBB" w:sz="1"/>
+              <w:left w:val="single" w:color="BBBBBB" w:sz="1"/>
+              <w:bottom w:val="single" w:color="BBBBBB" w:sz="1"/>
+              <w:right w:val="single" w:color="BBBBBB" w:sz="1"/>
+            </w:tcBorders>
+            <w:shd w:fill="DCE9D5" w:val="clear"/>
+            <w:tcMar>
+              <w:top w:type="dxa" w:w="60"/>
+              <w:left w:type="dxa" w:w="100"/>
+              <w:bottom w:type="dxa" w:w="60"/>
+              <w:right w:type="dxa" w:w="100"/>
+            </w:tcMar>
+          </w:tcPr>
+          <w:p>
+            <w:pPr>
+              <w:spacing w:after="0"/>
+            </w:pPr>
+            <w:r>
+              <w:rPr>
+                <w:rFonts w:ascii="Apple SD Gothic Neo" w:cs="Apple SD Gothic Neo" w:eastAsia="Apple SD Gothic Neo" w:hAnsi="Apple SD Gothic Neo"/>
+                <w:b/>
+                <w:bCs/>
+              </w:rPr>
+              <w:t xml:space="preserve">시작 조건</w:t>
+            </w:r>
+          </w:p>
+        </w:tc>
+      </w:tr>
+      <w:tr>
+        <w:tc>
+          <w:tcPr>
+            <w:tcW w:type="dxa" w:w="700"/>
+            <w:tcBorders>
+              <w:top w:val="single" w:color="BBBBBB" w:sz="1"/>
+              <w:left w:val="single" w:color="BBBBBB" w:sz="1"/>
+              <w:bottom w:val="single" w:color="BBBBBB" w:sz="1"/>
+              <w:right w:val="single" w:color="BBBBBB" w:sz="1"/>
+            </w:tcBorders>
+            <w:tcMar>
+              <w:top w:type="dxa" w:w="60"/>
+              <w:left w:type="dxa" w:w="100"/>
+              <w:bottom w:type="dxa" w:w="60"/>
+              <w:right w:type="dxa" w:w="100"/>
+            </w:tcMar>
+          </w:tcPr>
+          <w:p>
+            <w:pPr>
+              <w:spacing w:after="0"/>
+            </w:pPr>
+            <w:r>
+              <w:rPr>
+                <w:rFonts w:ascii="Apple SD Gothic Neo" w:cs="Apple SD Gothic Neo" w:eastAsia="Apple SD Gothic Neo" w:hAnsi="Apple SD Gothic Neo"/>
+              </w:rPr>
+              <w:t xml:space="preserve">1</w:t>
+            </w:r>
+          </w:p>
+        </w:tc>
+        <w:tc>
+          <w:tcPr>
+            <w:tcW w:type="dxa" w:w="1700"/>
+            <w:tcBorders>
+              <w:top w:val="single" w:color="BBBBBB" w:sz="1"/>
+              <w:left w:val="single" w:color="BBBBBB" w:sz="1"/>
+              <w:bottom w:val="single" w:color="BBBBBB" w:sz="1"/>
+              <w:right w:val="single" w:color="BBBBBB" w:sz="1"/>
+            </w:tcBorders>
+            <w:tcMar>
+              <w:top w:type="dxa" w:w="60"/>
+              <w:left w:type="dxa" w:w="100"/>
+              <w:bottom w:type="dxa" w:w="60"/>
+              <w:right w:type="dxa" w:w="100"/>
+            </w:tcMar>
+          </w:tcPr>
+          <w:p>
+            <w:pPr>
+              <w:spacing w:after="0"/>
+            </w:pPr>
+            <w:r>
+              <w:rPr>
+                <w:rFonts w:ascii="Apple SD Gothic Neo" w:cs="Apple SD Gothic Neo" w:eastAsia="Apple SD Gothic Neo" w:hAnsi="Apple SD Gothic Neo"/>
+              </w:rPr>
+              <w:t xml:space="preserve"/>
+            </w:r>
+            <w:r>
+              <w:rPr>
+                <w:rFonts w:ascii="Courier New" w:cs="Courier New" w:eastAsia="Courier New" w:hAnsi="Courier New"/>
+                <w:color w:val="1a4a7a"/>
+                <w:sz w:val="19"/>
+                <w:szCs w:val="19"/>
+              </w:rPr>
+              <w:t xml:space="preserve">carnivores.py</w:t>
+            </w:r>
+            <w:r>
+              <w:rPr>
+                <w:rFonts w:ascii="Apple SD Gothic Neo" w:cs="Apple SD Gothic Neo" w:eastAsia="Apple SD Gothic Neo" w:hAnsi="Apple SD Gothic Neo"/>
+              </w:rPr>
+              <w:t xml:space="preserve"/>
+            </w:r>
+          </w:p>
+        </w:tc>
+        <w:tc>
+          <w:tcPr>
+            <w:tcW w:type="dxa" w:w="4600"/>
+            <w:tcBorders>
+              <w:top w:val="single" w:color="BBBBBB" w:sz="1"/>
+              <w:left w:val="single" w:color="BBBBBB" w:sz="1"/>
+              <w:bottom w:val="single" w:color="BBBBBB" w:sz="1"/>
+              <w:right w:val="single" w:color="BBBBBB" w:sz="1"/>
+            </w:tcBorders>
+            <w:tcMar>
+              <w:top w:type="dxa" w:w="60"/>
+              <w:left w:type="dxa" w:w="100"/>
+              <w:bottom w:type="dxa" w:w="60"/>
+              <w:right w:type="dxa" w:w="100"/>
+            </w:tcMar>
+          </w:tcPr>
+          <w:p>
+            <w:pPr>
+              <w:spacing w:after="0"/>
+            </w:pPr>
+            <w:r>
+              <w:rPr>
+                <w:rFonts w:ascii="Apple SD Gothic Neo" w:cs="Apple SD Gothic Neo" w:eastAsia="Apple SD Gothic Neo" w:hAnsi="Apple SD Gothic Neo"/>
+              </w:rPr>
+              <w:t xml:space="preserve">Lion(roar 광역 둔화) → Cheetah(boost 가속) → Hyena(steal 가로채기·끼어들기 act). 부모 Carnivore의 _carnivore_behavior·attack·_cooldowns 활용</w:t>
+            </w:r>
+          </w:p>
+        </w:tc>
+        <w:tc>
+          <w:tcPr>
+            <w:tcW w:type="dxa" w:w="2400"/>
+            <w:tcBorders>
+              <w:top w:val="single" w:color="BBBBBB" w:sz="1"/>
+              <w:left w:val="single" w:color="BBBBBB" w:sz="1"/>
+              <w:bottom w:val="single" w:color="BBBBBB" w:sz="1"/>
+              <w:right w:val="single" w:color="BBBBBB" w:sz="1"/>
+            </w:tcBorders>
+            <w:tcMar>
+              <w:top w:type="dxa" w:w="60"/>
+              <w:left w:type="dxa" w:w="100"/>
+              <w:bottom w:type="dxa" w:w="60"/>
+              <w:right w:type="dxa" w:w="100"/>
+            </w:tcMar>
+          </w:tcPr>
+          <w:p>
+            <w:pPr>
+              <w:spacing w:after="0"/>
+            </w:pPr>
+            <w:r>
+              <w:rPr>
+                <w:rFonts w:ascii="Apple SD Gothic Neo" w:cs="Apple SD Gothic Neo" w:eastAsia="Apple SD Gothic Neo" w:hAnsi="Apple SD Gothic Neo"/>
+              </w:rPr>
+              <w:t xml:space="preserve">심성진 ②-a(Carnivore) 고정 후. ③단계 3인 병렬 중 하나</w:t>
+            </w:r>
+          </w:p>
+        </w:tc>
+      </w:tr>
+      <w:tr>
+        <w:tc>
+          <w:tcPr>
+            <w:tcW w:type="dxa" w:w="700"/>
+            <w:tcBorders>
+              <w:top w:val="single" w:color="BBBBBB" w:sz="1"/>
+              <w:left w:val="single" w:color="BBBBBB" w:sz="1"/>
+              <w:bottom w:val="single" w:color="BBBBBB" w:sz="1"/>
+              <w:right w:val="single" w:color="BBBBBB" w:sz="1"/>
+            </w:tcBorders>
+            <w:tcMar>
+              <w:top w:type="dxa" w:w="60"/>
+              <w:left w:type="dxa" w:w="100"/>
+              <w:bottom w:type="dxa" w:w="60"/>
+              <w:right w:type="dxa" w:w="100"/>
+            </w:tcMar>
+          </w:tcPr>
+          <w:p>
+            <w:pPr>
+              <w:spacing w:after="0"/>
+            </w:pPr>
+            <w:r>
+              <w:rPr>
+                <w:rFonts w:ascii="Apple SD Gothic Neo" w:cs="Apple SD Gothic Neo" w:eastAsia="Apple SD Gothic Neo" w:hAnsi="Apple SD Gothic Neo"/>
+              </w:rPr>
+              <w:t xml:space="preserve">2</w:t>
+            </w:r>
+          </w:p>
+        </w:tc>
+        <w:tc>
+          <w:tcPr>
+            <w:tcW w:type="dxa" w:w="1700"/>
+            <w:tcBorders>
+              <w:top w:val="single" w:color="BBBBBB" w:sz="1"/>
+              <w:left w:val="single" w:color="BBBBBB" w:sz="1"/>
+              <w:bottom w:val="single" w:color="BBBBBB" w:sz="1"/>
+              <w:right w:val="single" w:color="BBBBBB" w:sz="1"/>
+            </w:tcBorders>
+            <w:tcMar>
+              <w:top w:type="dxa" w:w="60"/>
+              <w:left w:type="dxa" w:w="100"/>
+              <w:bottom w:type="dxa" w:w="60"/>
+              <w:right w:type="dxa" w:w="100"/>
+            </w:tcMar>
+          </w:tcPr>
+          <w:p>
+            <w:pPr>
+              <w:spacing w:after="0"/>
+            </w:pPr>
+            <w:r>
+              <w:rPr>
+                <w:rFonts w:ascii="Apple SD Gothic Neo" w:cs="Apple SD Gothic Neo" w:eastAsia="Apple SD Gothic Neo" w:hAnsi="Apple SD Gothic Neo"/>
+              </w:rPr>
+              <w:t xml:space="preserve"/>
+            </w:r>
+            <w:r>
+              <w:rPr>
+                <w:rFonts w:ascii="Courier New" w:cs="Courier New" w:eastAsia="Courier New" w:hAnsi="Courier New"/>
+                <w:color w:val="1a4a7a"/>
+                <w:sz w:val="19"/>
+                <w:szCs w:val="19"/>
+              </w:rPr>
+              <w:t xml:space="preserve">interactions.py</w:t>
+            </w:r>
+            <w:r>
+              <w:rPr>
+                <w:rFonts w:ascii="Apple SD Gothic Neo" w:cs="Apple SD Gothic Neo" w:eastAsia="Apple SD Gothic Neo" w:hAnsi="Apple SD Gothic Neo"/>
+              </w:rPr>
+              <w:t xml:space="preserve"/>
+            </w:r>
+          </w:p>
+        </w:tc>
+        <w:tc>
+          <w:tcPr>
+            <w:tcW w:type="dxa" w:w="4600"/>
+            <w:tcBorders>
+              <w:top w:val="single" w:color="BBBBBB" w:sz="1"/>
+              <w:left w:val="single" w:color="BBBBBB" w:sz="1"/>
+              <w:bottom w:val="single" w:color="BBBBBB" w:sz="1"/>
+              <w:right w:val="single" w:color="BBBBBB" w:sz="1"/>
+            </w:tcBorders>
+            <w:tcMar>
+              <w:top w:type="dxa" w:w="60"/>
+              <w:left w:type="dxa" w:w="100"/>
+              <w:bottom w:type="dxa" w:w="60"/>
+              <w:right w:type="dxa" w:w="100"/>
+            </w:tcMar>
+          </w:tcPr>
+          <w:p>
+            <w:pPr>
+              <w:spacing w:after="0"/>
+            </w:pPr>
+            <w:r>
+              <w:rPr>
+                <w:rFonts w:ascii="Apple SD Gothic Neo" w:cs="Apple SD Gothic Neo" w:eastAsia="Apple SD Gothic Neo" w:hAnsi="Apple SD Gothic Neo"/>
+              </w:rPr>
+              <w:t xml:space="preserve">run_all 순서 설계 → feed_herbivores(풀 먹기) → resolve_predation + _award_kill(포식·하이에나 약탈) → giraffe_fights(기린 쌍 싸움) → reproduce_near_trees + 보조 3함수(번식·새끼 배치·가족 해산)</w:t>
+            </w:r>
+          </w:p>
+        </w:tc>
+        <w:tc>
+          <w:tcPr>
+            <w:tcW w:type="dxa" w:w="2400"/>
+            <w:tcBorders>
+              <w:top w:val="single" w:color="BBBBBB" w:sz="1"/>
+              <w:left w:val="single" w:color="BBBBBB" w:sz="1"/>
+              <w:bottom w:val="single" w:color="BBBBBB" w:sz="1"/>
+              <w:right w:val="single" w:color="BBBBBB" w:sz="1"/>
+            </w:tcBorders>
+            <w:tcMar>
+              <w:top w:type="dxa" w:w="60"/>
+              <w:left w:type="dxa" w:w="100"/>
+              <w:bottom w:type="dxa" w:w="60"/>
+              <w:right w:type="dxa" w:w="100"/>
+            </w:tcMar>
+          </w:tcPr>
+          <w:p>
+            <w:pPr>
+              <w:spacing w:after="0"/>
+            </w:pPr>
+            <w:r>
+              <w:rPr>
+                <w:rFonts w:ascii="Apple SD Gothic Neo" w:cs="Apple SD Gothic Neo" w:eastAsia="Apple SD Gothic Neo" w:hAnsi="Apple SD Gothic Neo"/>
+              </w:rPr>
+              <w:t xml:space="preserve">③ 동물들 + 심성진 ④-a의 nearest/within/spawn/count 이름 합의 (④-a와 병렬 진행)</w:t>
+            </w:r>
+          </w:p>
+        </w:tc>
+      </w:tr>
+    </w:tbl>
+    <w:p>
+      <w:pPr>
+        <w:spacing w:after="120"/>
+      </w:pPr>
+      <w:r>
+        <w:rPr>
+          <w:rFonts w:ascii="Apple SD Gothic Neo" w:cs="Apple SD Gothic Neo" w:eastAsia="Apple SD Gothic Neo" w:hAnsi="Apple SD Gothic Neo"/>
+        </w:rPr>
+        <w:t xml:space="preserve">요약: carnivores.py는 부모 인터페이스만 있으면 바로 시작할 수 있고, interactions.py는 World의 메서드 '이름'만 합의되면 World 완성을 기다리지 않고 병렬로 짤 수 있다.</w:t>
+      </w:r>
+    </w:p>
+    <w:p>
+      <w:pPr>
+        <w:pStyle w:val="Heading2"/>
+      </w:pPr>
+      <w:r>
+        <w:rPr>
+          <w:rFonts w:ascii="Apple SD Gothic Neo" w:cs="Apple SD Gothic Neo" w:eastAsia="Apple SD Gothic Neo" w:hAnsi="Apple SD Gothic Neo"/>
+          <w:b/>
+          <w:bCs/>
+        </w:rPr>
+        <w:t xml:space="preserve">2-4. 한시헌 — 초식·식물에서 화면까지</w:t>
+      </w:r>
+    </w:p>
+    <w:tbl>
+      <w:tblPr>
+        <w:tblW w:type="dxa" w:w="9400"/>
+        <w:tblBorders>
+          <w:top w:val="single" w:color="auto" w:sz="4"/>
+          <w:left w:val="single" w:color="auto" w:sz="4"/>
+          <w:bottom w:val="single" w:color="auto" w:sz="4"/>
+          <w:right w:val="single" w:color="auto" w:sz="4"/>
+          <w:insideH w:val="single" w:color="auto" w:sz="4"/>
+          <w:insideV w:val="single" w:color="auto" w:sz="4"/>
+        </w:tblBorders>
+      </w:tblPr>
+      <w:tblGrid>
+        <w:gridCol w:w="700"/>
+        <w:gridCol w:w="1700"/>
+        <w:gridCol w:w="4600"/>
+        <w:gridCol w:w="2400"/>
+      </w:tblGrid>
+      <w:tr>
+        <w:tc>
+          <w:tcPr>
+            <w:tcW w:type="dxa" w:w="700"/>
+            <w:tcBorders>
+              <w:top w:val="single" w:color="BBBBBB" w:sz="1"/>
+              <w:left w:val="single" w:color="BBBBBB" w:sz="1"/>
+              <w:bottom w:val="single" w:color="BBBBBB" w:sz="1"/>
+              <w:right w:val="single" w:color="BBBBBB" w:sz="1"/>
+            </w:tcBorders>
+            <w:shd w:fill="DCE9D5" w:val="clear"/>
+            <w:tcMar>
+              <w:top w:type="dxa" w:w="60"/>
+              <w:left w:type="dxa" w:w="100"/>
+              <w:bottom w:type="dxa" w:w="60"/>
+              <w:right w:type="dxa" w:w="100"/>
+            </w:tcMar>
+          </w:tcPr>
+          <w:p>
+            <w:pPr>
+              <w:spacing w:after="0"/>
+            </w:pPr>
+            <w:r>
+              <w:rPr>
+                <w:rFonts w:ascii="Apple SD Gothic Neo" w:cs="Apple SD Gothic Neo" w:eastAsia="Apple SD Gothic Neo" w:hAnsi="Apple SD Gothic Neo"/>
+                <w:b/>
+                <w:bCs/>
+              </w:rPr>
+              <w:t xml:space="preserve">순서</w:t>
+            </w:r>
+          </w:p>
+        </w:tc>
+        <w:tc>
+          <w:tcPr>
+            <w:tcW w:type="dxa" w:w="1700"/>
+            <w:tcBorders>
+              <w:top w:val="single" w:color="BBBBBB" w:sz="1"/>
+              <w:left w:val="single" w:color="BBBBBB" w:sz="1"/>
+              <w:bottom w:val="single" w:color="BBBBBB" w:sz="1"/>
+              <w:right w:val="single" w:color="BBBBBB" w:sz="1"/>
+            </w:tcBorders>
+            <w:shd w:fill="DCE9D5" w:val="clear"/>
+            <w:tcMar>
+              <w:top w:type="dxa" w:w="60"/>
+              <w:left w:type="dxa" w:w="100"/>
+              <w:bottom w:type="dxa" w:w="60"/>
+              <w:right w:type="dxa" w:w="100"/>
+            </w:tcMar>
+          </w:tcPr>
+          <w:p>
+            <w:pPr>
+              <w:spacing w:after="0"/>
+            </w:pPr>
+            <w:r>
+              <w:rPr>
+                <w:rFonts w:ascii="Apple SD Gothic Neo" w:cs="Apple SD Gothic Neo" w:eastAsia="Apple SD Gothic Neo" w:hAnsi="Apple SD Gothic Neo"/>
+                <w:b/>
+                <w:bCs/>
+              </w:rPr>
+              <w:t xml:space="preserve">파일</w:t>
+            </w:r>
+          </w:p>
+        </w:tc>
+        <w:tc>
+          <w:tcPr>
+            <w:tcW w:type="dxa" w:w="4600"/>
+            <w:tcBorders>
+              <w:top w:val="single" w:color="BBBBBB" w:sz="1"/>
+              <w:left w:val="single" w:color="BBBBBB" w:sz="1"/>
+              <w:bottom w:val="single" w:color="BBBBBB" w:sz="1"/>
+              <w:right w:val="single" w:color="BBBBBB" w:sz="1"/>
+            </w:tcBorders>
+            <w:shd w:fill="DCE9D5" w:val="clear"/>
+            <w:tcMar>
+              <w:top w:type="dxa" w:w="60"/>
+              <w:left w:type="dxa" w:w="100"/>
+              <w:bottom w:type="dxa" w:w="60"/>
+              <w:right w:type="dxa" w:w="100"/>
+            </w:tcMar>
+          </w:tcPr>
+          <w:p>
+            <w:pPr>
+              <w:spacing w:after="0"/>
+            </w:pPr>
+            <w:r>
+              <w:rPr>
+                <w:rFonts w:ascii="Apple SD Gothic Neo" w:cs="Apple SD Gothic Neo" w:eastAsia="Apple SD Gothic Neo" w:hAnsi="Apple SD Gothic Neo"/>
+                <w:b/>
+                <w:bCs/>
+              </w:rPr>
+              <w:t xml:space="preserve">만드는 것</w:t>
+            </w:r>
+          </w:p>
+        </w:tc>
+        <w:tc>
+          <w:tcPr>
+            <w:tcW w:type="dxa" w:w="2400"/>
+            <w:tcBorders>
+              <w:top w:val="single" w:color="BBBBBB" w:sz="1"/>
+              <w:left w:val="single" w:color="BBBBBB" w:sz="1"/>
+              <w:bottom w:val="single" w:color="BBBBBB" w:sz="1"/>
+              <w:right w:val="single" w:color="BBBBBB" w:sz="1"/>
+            </w:tcBorders>
+            <w:shd w:fill="DCE9D5" w:val="clear"/>
+            <w:tcMar>
+              <w:top w:type="dxa" w:w="60"/>
+              <w:left w:type="dxa" w:w="100"/>
+              <w:bottom w:type="dxa" w:w="60"/>
+              <w:right w:type="dxa" w:w="100"/>
+            </w:tcMar>
+          </w:tcPr>
+          <w:p>
+            <w:pPr>
+              <w:spacing w:after="0"/>
+            </w:pPr>
+            <w:r>
+              <w:rPr>
+                <w:rFonts w:ascii="Apple SD Gothic Neo" w:cs="Apple SD Gothic Neo" w:eastAsia="Apple SD Gothic Neo" w:hAnsi="Apple SD Gothic Neo"/>
+                <w:b/>
+                <w:bCs/>
+              </w:rPr>
+              <w:t xml:space="preserve">시작 조건</w:t>
+            </w:r>
+          </w:p>
+        </w:tc>
+      </w:tr>
+      <w:tr>
+        <w:tc>
+          <w:tcPr>
+            <w:tcW w:type="dxa" w:w="700"/>
+            <w:tcBorders>
+              <w:top w:val="single" w:color="BBBBBB" w:sz="1"/>
+              <w:left w:val="single" w:color="BBBBBB" w:sz="1"/>
+              <w:bottom w:val="single" w:color="BBBBBB" w:sz="1"/>
+              <w:right w:val="single" w:color="BBBBBB" w:sz="1"/>
+            </w:tcBorders>
+            <w:tcMar>
+              <w:top w:type="dxa" w:w="60"/>
+              <w:left w:type="dxa" w:w="100"/>
+              <w:bottom w:type="dxa" w:w="60"/>
+              <w:right w:type="dxa" w:w="100"/>
+            </w:tcMar>
+          </w:tcPr>
+          <w:p>
+            <w:pPr>
+              <w:spacing w:after="0"/>
+            </w:pPr>
+            <w:r>
+              <w:rPr>
+                <w:rFonts w:ascii="Apple SD Gothic Neo" w:cs="Apple SD Gothic Neo" w:eastAsia="Apple SD Gothic Neo" w:hAnsi="Apple SD Gothic Neo"/>
+              </w:rPr>
+              <w:t xml:space="preserve">1</w:t>
+            </w:r>
+          </w:p>
+        </w:tc>
+        <w:tc>
+          <w:tcPr>
+            <w:tcW w:type="dxa" w:w="1700"/>
+            <w:tcBorders>
+              <w:top w:val="single" w:color="BBBBBB" w:sz="1"/>
+              <w:left w:val="single" w:color="BBBBBB" w:sz="1"/>
+              <w:bottom w:val="single" w:color="BBBBBB" w:sz="1"/>
+              <w:right w:val="single" w:color="BBBBBB" w:sz="1"/>
+            </w:tcBorders>
+            <w:tcMar>
+              <w:top w:type="dxa" w:w="60"/>
+              <w:left w:type="dxa" w:w="100"/>
+              <w:bottom w:type="dxa" w:w="60"/>
+              <w:right w:type="dxa" w:w="100"/>
+            </w:tcMar>
+          </w:tcPr>
+          <w:p>
+            <w:pPr>
+              <w:spacing w:after="0"/>
+            </w:pPr>
+            <w:r>
+              <w:rPr>
+                <w:rFonts w:ascii="Apple SD Gothic Neo" w:cs="Apple SD Gothic Neo" w:eastAsia="Apple SD Gothic Neo" w:hAnsi="Apple SD Gothic Neo"/>
+              </w:rPr>
+              <w:t xml:space="preserve"/>
+            </w:r>
+            <w:r>
+              <w:rPr>
+                <w:rFonts w:ascii="Courier New" w:cs="Courier New" w:eastAsia="Courier New" w:hAnsi="Courier New"/>
+                <w:color w:val="1a4a7a"/>
+                <w:sz w:val="19"/>
+                <w:szCs w:val="19"/>
+              </w:rPr>
+              <w:t xml:space="preserve">organisms.py</w:t>
+            </w:r>
+            <w:r>
+              <w:rPr>
+                <w:rFonts w:ascii="Apple SD Gothic Neo" w:cs="Apple SD Gothic Neo" w:eastAsia="Apple SD Gothic Neo" w:hAnsi="Apple SD Gothic Neo"/>
+              </w:rPr>
+              <w:t xml:space="preserve"> (하단)</w:t>
+            </w:r>
+          </w:p>
+        </w:tc>
+        <w:tc>
+          <w:tcPr>
+            <w:tcW w:type="dxa" w:w="4600"/>
+            <w:tcBorders>
+              <w:top w:val="single" w:color="BBBBBB" w:sz="1"/>
+              <w:left w:val="single" w:color="BBBBBB" w:sz="1"/>
+              <w:bottom w:val="single" w:color="BBBBBB" w:sz="1"/>
+              <w:right w:val="single" w:color="BBBBBB" w:sz="1"/>
+            </w:tcBorders>
+            <w:tcMar>
+              <w:top w:type="dxa" w:w="60"/>
+              <w:left w:type="dxa" w:w="100"/>
+              <w:bottom w:type="dxa" w:w="60"/>
+              <w:right w:type="dxa" w:w="100"/>
+            </w:tcMar>
+          </w:tcPr>
+          <w:p>
+            <w:pPr>
+              <w:spacing w:after="0"/>
+            </w:pPr>
+            <w:r>
+              <w:rPr>
+                <w:rFonts w:ascii="Apple SD Gothic Neo" w:cs="Apple SD Gothic Neo" w:eastAsia="Apple SD Gothic Neo" w:hAnsi="Apple SD Gothic Neo"/>
+              </w:rPr>
+              <w:t xml:space="preserve">Herbivore(rp_rate·reproduce·can_reproduce·_herbivore_behavior·_forage_and_gather·_steer_with_spacing·_disperse_from_tree·_select_breeding_tree·_breeding_spot) → Plant(eaten·grow·update)</w:t>
+            </w:r>
+          </w:p>
+        </w:tc>
+        <w:tc>
+          <w:tcPr>
+            <w:tcW w:type="dxa" w:w="2400"/>
+            <w:tcBorders>
+              <w:top w:val="single" w:color="BBBBBB" w:sz="1"/>
+              <w:left w:val="single" w:color="BBBBBB" w:sz="1"/>
+              <w:bottom w:val="single" w:color="BBBBBB" w:sz="1"/>
+              <w:right w:val="single" w:color="BBBBBB" w:sz="1"/>
+            </w:tcBorders>
+            <w:tcMar>
+              <w:top w:type="dxa" w:w="60"/>
+              <w:left w:type="dxa" w:w="100"/>
+              <w:bottom w:type="dxa" w:w="60"/>
+              <w:right w:type="dxa" w:w="100"/>
+            </w:tcMar>
+          </w:tcPr>
+          <w:p>
+            <w:pPr>
+              <w:spacing w:after="0"/>
+            </w:pPr>
+            <w:r>
+              <w:rPr>
+                <w:rFonts w:ascii="Apple SD Gothic Neo" w:cs="Apple SD Gothic Neo" w:eastAsia="Apple SD Gothic Neo" w:hAnsi="Apple SD Gothic Neo"/>
+              </w:rPr>
+              <w:t xml:space="preserve">심성진 ②-a의 Animal·Entity 이름이 고정되는 즉시 (같은 파일 — 작성 구역 분담)</w:t>
+            </w:r>
+          </w:p>
+        </w:tc>
+      </w:tr>
+      <w:tr>
+        <w:tc>
+          <w:tcPr>
+            <w:tcW w:type="dxa" w:w="700"/>
+            <w:tcBorders>
+              <w:top w:val="single" w:color="BBBBBB" w:sz="1"/>
+              <w:left w:val="single" w:color="BBBBBB" w:sz="1"/>
+              <w:bottom w:val="single" w:color="BBBBBB" w:sz="1"/>
+              <w:right w:val="single" w:color="BBBBBB" w:sz="1"/>
+            </w:tcBorders>
+            <w:tcMar>
+              <w:top w:type="dxa" w:w="60"/>
+              <w:left w:type="dxa" w:w="100"/>
+              <w:bottom w:type="dxa" w:w="60"/>
+              <w:right w:type="dxa" w:w="100"/>
+            </w:tcMar>
+          </w:tcPr>
+          <w:p>
+            <w:pPr>
+              <w:spacing w:after="0"/>
+            </w:pPr>
+            <w:r>
+              <w:rPr>
+                <w:rFonts w:ascii="Apple SD Gothic Neo" w:cs="Apple SD Gothic Neo" w:eastAsia="Apple SD Gothic Neo" w:hAnsi="Apple SD Gothic Neo"/>
+              </w:rPr>
+              <w:t xml:space="preserve">2</w:t>
+            </w:r>
+          </w:p>
+        </w:tc>
+        <w:tc>
+          <w:tcPr>
+            <w:tcW w:type="dxa" w:w="1700"/>
+            <w:tcBorders>
+              <w:top w:val="single" w:color="BBBBBB" w:sz="1"/>
+              <w:left w:val="single" w:color="BBBBBB" w:sz="1"/>
+              <w:bottom w:val="single" w:color="BBBBBB" w:sz="1"/>
+              <w:right w:val="single" w:color="BBBBBB" w:sz="1"/>
+            </w:tcBorders>
+            <w:tcMar>
+              <w:top w:type="dxa" w:w="60"/>
+              <w:left w:type="dxa" w:w="100"/>
+              <w:bottom w:type="dxa" w:w="60"/>
+              <w:right w:type="dxa" w:w="100"/>
+            </w:tcMar>
+          </w:tcPr>
+          <w:p>
+            <w:pPr>
+              <w:spacing w:after="0"/>
+            </w:pPr>
+            <w:r>
+              <w:rPr>
+                <w:rFonts w:ascii="Apple SD Gothic Neo" w:cs="Apple SD Gothic Neo" w:eastAsia="Apple SD Gothic Neo" w:hAnsi="Apple SD Gothic Neo"/>
+              </w:rPr>
+              <w:t xml:space="preserve"/>
+            </w:r>
+            <w:r>
+              <w:rPr>
+                <w:rFonts w:ascii="Courier New" w:cs="Courier New" w:eastAsia="Courier New" w:hAnsi="Courier New"/>
+                <w:color w:val="1a4a7a"/>
+                <w:sz w:val="19"/>
+                <w:szCs w:val="19"/>
+              </w:rPr>
+              <w:t xml:space="preserve">plants.py</w:t>
+            </w:r>
+            <w:r>
+              <w:rPr>
+                <w:rFonts w:ascii="Apple SD Gothic Neo" w:cs="Apple SD Gothic Neo" w:eastAsia="Apple SD Gothic Neo" w:hAnsi="Apple SD Gothic Neo"/>
+              </w:rPr>
+              <w:t xml:space="preserve"/>
+            </w:r>
+          </w:p>
+        </w:tc>
+        <w:tc>
+          <w:tcPr>
+            <w:tcW w:type="dxa" w:w="4600"/>
+            <w:tcBorders>
+              <w:top w:val="single" w:color="BBBBBB" w:sz="1"/>
+              <w:left w:val="single" w:color="BBBBBB" w:sz="1"/>
+              <w:bottom w:val="single" w:color="BBBBBB" w:sz="1"/>
+              <w:right w:val="single" w:color="BBBBBB" w:sz="1"/>
+            </w:tcBorders>
+            <w:tcMar>
+              <w:top w:type="dxa" w:w="60"/>
+              <w:left w:type="dxa" w:w="100"/>
+              <w:bottom w:type="dxa" w:w="60"/>
+              <w:right w:type="dxa" w:w="100"/>
+            </w:tcMar>
+          </w:tcPr>
+          <w:p>
+            <w:pPr>
+              <w:spacing w:after="0"/>
+            </w:pPr>
+            <w:r>
+              <w:rPr>
+                <w:rFonts w:ascii="Apple SD Gothic Neo" w:cs="Apple SD Gothic Neo" w:eastAsia="Apple SD Gothic Neo" w:hAnsi="Apple SD Gothic Neo"/>
+              </w:rPr>
+              <w:t xml:space="preserve">Grass(food·rab_num·be_eaten·grow 재성장) → Tree(BREED_RADIUS)</w:t>
+            </w:r>
+          </w:p>
+        </w:tc>
+        <w:tc>
+          <w:tcPr>
+            <w:tcW w:type="dxa" w:w="2400"/>
+            <w:tcBorders>
+              <w:top w:val="single" w:color="BBBBBB" w:sz="1"/>
+              <w:left w:val="single" w:color="BBBBBB" w:sz="1"/>
+              <w:bottom w:val="single" w:color="BBBBBB" w:sz="1"/>
+              <w:right w:val="single" w:color="BBBBBB" w:sz="1"/>
+            </w:tcBorders>
+            <w:tcMar>
+              <w:top w:type="dxa" w:w="60"/>
+              <w:left w:type="dxa" w:w="100"/>
+              <w:bottom w:type="dxa" w:w="60"/>
+              <w:right w:type="dxa" w:w="100"/>
+            </w:tcMar>
+          </w:tcPr>
+          <w:p>
+            <w:pPr>
+              <w:spacing w:after="0"/>
+            </w:pPr>
+            <w:r>
+              <w:rPr>
+                <w:rFonts w:ascii="Apple SD Gothic Neo" w:cs="Apple SD Gothic Neo" w:eastAsia="Apple SD Gothic Neo" w:hAnsi="Apple SD Gothic Neo"/>
+              </w:rPr>
+              <w:t xml:space="preserve">1번 Plant 부모 완성 직후</w:t>
+            </w:r>
+          </w:p>
+        </w:tc>
+      </w:tr>
+      <w:tr>
+        <w:tc>
+          <w:tcPr>
+            <w:tcW w:type="dxa" w:w="700"/>
+            <w:tcBorders>
+              <w:top w:val="single" w:color="BBBBBB" w:sz="1"/>
+              <w:left w:val="single" w:color="BBBBBB" w:sz="1"/>
+              <w:bottom w:val="single" w:color="BBBBBB" w:sz="1"/>
+              <w:right w:val="single" w:color="BBBBBB" w:sz="1"/>
+            </w:tcBorders>
+            <w:tcMar>
+              <w:top w:type="dxa" w:w="60"/>
+              <w:left w:type="dxa" w:w="100"/>
+              <w:bottom w:type="dxa" w:w="60"/>
+              <w:right w:type="dxa" w:w="100"/>
+            </w:tcMar>
+          </w:tcPr>
+          <w:p>
+            <w:pPr>
+              <w:spacing w:after="0"/>
+            </w:pPr>
+            <w:r>
+              <w:rPr>
+                <w:rFonts w:ascii="Apple SD Gothic Neo" w:cs="Apple SD Gothic Neo" w:eastAsia="Apple SD Gothic Neo" w:hAnsi="Apple SD Gothic Neo"/>
+              </w:rPr>
+              <w:t xml:space="preserve">3</w:t>
+            </w:r>
+          </w:p>
+        </w:tc>
+        <w:tc>
+          <w:tcPr>
+            <w:tcW w:type="dxa" w:w="1700"/>
+            <w:tcBorders>
+              <w:top w:val="single" w:color="BBBBBB" w:sz="1"/>
+              <w:left w:val="single" w:color="BBBBBB" w:sz="1"/>
+              <w:bottom w:val="single" w:color="BBBBBB" w:sz="1"/>
+              <w:right w:val="single" w:color="BBBBBB" w:sz="1"/>
+            </w:tcBorders>
+            <w:tcMar>
+              <w:top w:type="dxa" w:w="60"/>
+              <w:left w:type="dxa" w:w="100"/>
+              <w:bottom w:type="dxa" w:w="60"/>
+              <w:right w:type="dxa" w:w="100"/>
+            </w:tcMar>
+          </w:tcPr>
+          <w:p>
+            <w:pPr>
+              <w:spacing w:after="0"/>
+            </w:pPr>
+            <w:r>
+              <w:rPr>
+                <w:rFonts w:ascii="Apple SD Gothic Neo" w:cs="Apple SD Gothic Neo" w:eastAsia="Apple SD Gothic Neo" w:hAnsi="Apple SD Gothic Neo"/>
+              </w:rPr>
+              <w:t xml:space="preserve"/>
+            </w:r>
+            <w:r>
+              <w:rPr>
+                <w:rFonts w:ascii="Courier New" w:cs="Courier New" w:eastAsia="Courier New" w:hAnsi="Courier New"/>
+                <w:color w:val="1a4a7a"/>
+                <w:sz w:val="19"/>
+                <w:szCs w:val="19"/>
+              </w:rPr>
+              <w:t xml:space="preserve">herbivores.py</w:t>
+            </w:r>
+            <w:r>
+              <w:rPr>
+                <w:rFonts w:ascii="Apple SD Gothic Neo" w:cs="Apple SD Gothic Neo" w:eastAsia="Apple SD Gothic Neo" w:hAnsi="Apple SD Gothic Neo"/>
+              </w:rPr>
+              <w:t xml:space="preserve"> (일부)</w:t>
+            </w:r>
+          </w:p>
+        </w:tc>
+        <w:tc>
+          <w:tcPr>
+            <w:tcW w:type="dxa" w:w="4600"/>
+            <w:tcBorders>
+              <w:top w:val="single" w:color="BBBBBB" w:sz="1"/>
+              <w:left w:val="single" w:color="BBBBBB" w:sz="1"/>
+              <w:bottom w:val="single" w:color="BBBBBB" w:sz="1"/>
+              <w:right w:val="single" w:color="BBBBBB" w:sz="1"/>
+            </w:tcBorders>
+            <w:tcMar>
+              <w:top w:type="dxa" w:w="60"/>
+              <w:left w:type="dxa" w:w="100"/>
+              <w:bottom w:type="dxa" w:w="60"/>
+              <w:right w:type="dxa" w:w="100"/>
+            </w:tcMar>
+          </w:tcPr>
+          <w:p>
+            <w:pPr>
+              <w:spacing w:after="0"/>
+            </w:pPr>
+            <w:r>
+              <w:rPr>
+                <w:rFonts w:ascii="Apple SD Gothic Neo" w:cs="Apple SD Gothic Neo" w:eastAsia="Apple SD Gothic Neo" w:hAnsi="Apple SD Gothic Neo"/>
+              </w:rPr>
+              <w:t xml:space="preserve">Rabbit(hide 은신) → Giraffe(neckfight 넥스윙). 심성진의 Zebra·Elephant와 같은 파일 — 합칠 때 조율</w:t>
+            </w:r>
+          </w:p>
+        </w:tc>
+        <w:tc>
+          <w:tcPr>
+            <w:tcW w:type="dxa" w:w="2400"/>
+            <w:tcBorders>
+              <w:top w:val="single" w:color="BBBBBB" w:sz="1"/>
+              <w:left w:val="single" w:color="BBBBBB" w:sz="1"/>
+              <w:bottom w:val="single" w:color="BBBBBB" w:sz="1"/>
+              <w:right w:val="single" w:color="BBBBBB" w:sz="1"/>
+            </w:tcBorders>
+            <w:tcMar>
+              <w:top w:type="dxa" w:w="60"/>
+              <w:left w:type="dxa" w:w="100"/>
+              <w:bottom w:type="dxa" w:w="60"/>
+              <w:right w:type="dxa" w:w="100"/>
+            </w:tcMar>
+          </w:tcPr>
+          <w:p>
+            <w:pPr>
+              <w:spacing w:after="0"/>
+            </w:pPr>
+            <w:r>
+              <w:rPr>
+                <w:rFonts w:ascii="Apple SD Gothic Neo" w:cs="Apple SD Gothic Neo" w:eastAsia="Apple SD Gothic Neo" w:hAnsi="Apple SD Gothic Neo"/>
+              </w:rPr>
+              <w:t xml:space="preserve">1번 Herbivore 부모 완성 직후. ③단계 3인 병렬 중 하나</w:t>
+            </w:r>
+          </w:p>
+        </w:tc>
+      </w:tr>
+      <w:tr>
+        <w:tc>
+          <w:tcPr>
+            <w:tcW w:type="dxa" w:w="700"/>
+            <w:tcBorders>
+              <w:top w:val="single" w:color="BBBBBB" w:sz="1"/>
+              <w:left w:val="single" w:color="BBBBBB" w:sz="1"/>
+              <w:bottom w:val="single" w:color="BBBBBB" w:sz="1"/>
+              <w:right w:val="single" w:color="BBBBBB" w:sz="1"/>
+            </w:tcBorders>
+            <w:tcMar>
+              <w:top w:type="dxa" w:w="60"/>
+              <w:left w:type="dxa" w:w="100"/>
+              <w:bottom w:type="dxa" w:w="60"/>
+              <w:right w:type="dxa" w:w="100"/>
+            </w:tcMar>
+          </w:tcPr>
+          <w:p>
+            <w:pPr>
+              <w:spacing w:after="0"/>
+            </w:pPr>
+            <w:r>
+              <w:rPr>
+                <w:rFonts w:ascii="Apple SD Gothic Neo" w:cs="Apple SD Gothic Neo" w:eastAsia="Apple SD Gothic Neo" w:hAnsi="Apple SD Gothic Neo"/>
+              </w:rPr>
+              <w:t xml:space="preserve">4</w:t>
+            </w:r>
+          </w:p>
+        </w:tc>
+        <w:tc>
+          <w:tcPr>
+            <w:tcW w:type="dxa" w:w="1700"/>
+            <w:tcBorders>
+              <w:top w:val="single" w:color="BBBBBB" w:sz="1"/>
+              <w:left w:val="single" w:color="BBBBBB" w:sz="1"/>
+              <w:bottom w:val="single" w:color="BBBBBB" w:sz="1"/>
+              <w:right w:val="single" w:color="BBBBBB" w:sz="1"/>
+            </w:tcBorders>
+            <w:tcMar>
+              <w:top w:type="dxa" w:w="60"/>
+              <w:left w:type="dxa" w:w="100"/>
+              <w:bottom w:type="dxa" w:w="60"/>
+              <w:right w:type="dxa" w:w="100"/>
+            </w:tcMar>
+          </w:tcPr>
+          <w:p>
+            <w:pPr>
+              <w:spacing w:after="0"/>
+            </w:pPr>
+            <w:r>
+              <w:rPr>
+                <w:rFonts w:ascii="Apple SD Gothic Neo" w:cs="Apple SD Gothic Neo" w:eastAsia="Apple SD Gothic Neo" w:hAnsi="Apple SD Gothic Neo"/>
+              </w:rPr>
+              <w:t xml:space="preserve"/>
+            </w:r>
+            <w:r>
+              <w:rPr>
+                <w:rFonts w:ascii="Courier New" w:cs="Courier New" w:eastAsia="Courier New" w:hAnsi="Courier New"/>
+                <w:color w:val="1a4a7a"/>
+                <w:sz w:val="19"/>
+                <w:szCs w:val="19"/>
+              </w:rPr>
+              <w:t xml:space="preserve">gui.py</w:t>
+            </w:r>
+            <w:r>
+              <w:rPr>
+                <w:rFonts w:ascii="Apple SD Gothic Neo" w:cs="Apple SD Gothic Neo" w:eastAsia="Apple SD Gothic Neo" w:hAnsi="Apple SD Gothic Neo"/>
+              </w:rPr>
+              <w:t xml:space="preserve"/>
+            </w:r>
+          </w:p>
+        </w:tc>
+        <w:tc>
+          <w:tcPr>
+            <w:tcW w:type="dxa" w:w="4600"/>
+            <w:tcBorders>
+              <w:top w:val="single" w:color="BBBBBB" w:sz="1"/>
+              <w:left w:val="single" w:color="BBBBBB" w:sz="1"/>
+              <w:bottom w:val="single" w:color="BBBBBB" w:sz="1"/>
+              <w:right w:val="single" w:color="BBBBBB" w:sz="1"/>
+            </w:tcBorders>
+            <w:tcMar>
+              <w:top w:type="dxa" w:w="60"/>
+              <w:left w:type="dxa" w:w="100"/>
+              <w:bottom w:type="dxa" w:w="60"/>
+              <w:right w:type="dxa" w:w="100"/>
+            </w:tcMar>
+          </w:tcPr>
+          <w:p>
+            <w:pPr>
+              <w:spacing w:after="0"/>
+            </w:pPr>
+            <w:r>
+              <w:rPr>
+                <w:rFonts w:ascii="Apple SD Gothic Neo" w:cs="Apple SD Gothic Neo" w:eastAsia="Apple SD Gothic Neo" w:hAnsi="Apple SD Gothic Neo"/>
+              </w:rPr>
+              <w:t xml:space="preserve">EcosystemApp: _pick_font/_resolve_fonts(글꼴 이식성) → _build_panel(정보 패널) → _loop(after 게임 루프) → _render/_draw_entity/_draw_hp_bar/_draw_gameover(렌더링) → _update_panel → _on_key/_restart(한/영 키 매핑 포함)</w:t>
+            </w:r>
+          </w:p>
+        </w:tc>
+        <w:tc>
+          <w:tcPr>
+            <w:tcW w:type="dxa" w:w="2400"/>
+            <w:tcBorders>
+              <w:top w:val="single" w:color="BBBBBB" w:sz="1"/>
+              <w:left w:val="single" w:color="BBBBBB" w:sz="1"/>
+              <w:bottom w:val="single" w:color="BBBBBB" w:sz="1"/>
+              <w:right w:val="single" w:color="BBBBBB" w:sz="1"/>
+            </w:tcBorders>
+            <w:tcMar>
+              <w:top w:type="dxa" w:w="60"/>
+              <w:left w:type="dxa" w:w="100"/>
+              <w:bottom w:type="dxa" w:w="60"/>
+              <w:right w:type="dxa" w:w="100"/>
+            </w:tcMar>
+          </w:tcPr>
+          <w:p>
+            <w:pPr>
+              <w:spacing w:after="0"/>
+            </w:pPr>
+            <w:r>
+              <w:rPr>
+                <w:rFonts w:ascii="Apple SD Gothic Neo" w:cs="Apple SD Gothic Neo" w:eastAsia="Apple SD Gothic Neo" w:hAnsi="Apple SD Gothic Neo"/>
+              </w:rPr>
+              <w:t xml:space="preserve">심성진 ④-a의 World(step·stats·events·trigger_disaster) 고정 후</w:t>
+            </w:r>
+          </w:p>
+        </w:tc>
+      </w:tr>
+    </w:tbl>
+    <w:p>
+      <w:pPr>
+        <w:spacing w:after="120"/>
+      </w:pPr>
+      <w:r>
+        <w:rPr>
+          <w:rFonts w:ascii="Apple SD Gothic Neo" w:cs="Apple SD Gothic Neo" w:eastAsia="Apple SD Gothic Neo" w:hAnsi="Apple SD Gothic Neo"/>
+        </w:rPr>
+        <w:t xml:space="preserve">요약: organisms.py 하단(부모) → plants.py → 토끼·기린 순서로 먹이 피라미드 아래쪽을 완성하고, World가 나오면 gui.py로 전체를 화면에 올린다.</w:t>
+      </w:r>
+    </w:p>
+    <w:p>
+      <w:pPr>
+        <w:pStyle w:val="Heading2"/>
+      </w:pPr>
+      <w:r>
+        <w:rPr>
+          <w:rFonts w:ascii="Apple SD Gothic Neo" w:cs="Apple SD Gothic Neo" w:eastAsia="Apple SD Gothic Neo" w:hAnsi="Apple SD Gothic Neo"/>
+          <w:b/>
+          <w:bCs/>
+        </w:rPr>
+        <w:t xml:space="preserve">2-5. 한눈에 보는 흐름</w:t>
       </w:r>
     </w:p>
     <w:p>
@@ -1914,13 +4644,13 @@
           <w:ilvl w:val="0"/>
           <w:numId w:val="2"/>
         </w:numPr>
-        <w:spacing w:after="60"/>
+        <w:spacing w:after="50"/>
       </w:pPr>
       <w:r>
         <w:rPr>
           <w:rFonts w:ascii="Apple SD Gothic Neo" w:cs="Apple SD Gothic Neo" w:eastAsia="Apple SD Gothic Neo" w:hAnsi="Apple SD Gothic Neo"/>
         </w:rPr>
-        <w:t xml:space="preserve">홍순율이 vector → physics, config로 기반을 깐다 (의존성 없음, 가장 먼저).</w:t>
+        <w:t xml:space="preserve">0단계: 다 함께 계획서로 이름(클래스·속성·메서드) 합의.</w:t>
       </w:r>
     </w:p>
     <w:p>
@@ -1930,13 +4660,58 @@
           <w:ilvl w:val="0"/>
           <w:numId w:val="2"/>
         </w:numPr>
-        <w:spacing w:after="60"/>
+        <w:spacing w:after="50"/>
       </w:pPr>
       <w:r>
         <w:rPr>
           <w:rFonts w:ascii="Apple SD Gothic Neo" w:cs="Apple SD Gothic Neo" w:eastAsia="Apple SD Gothic Neo" w:hAnsi="Apple SD Gothic Neo"/>
         </w:rPr>
-        <w:t xml:space="preserve">심성진이 Entity·Animal·Carnivore 부모를 만들어 인터페이스를 고정하고, 한시헌이 곧바로 같은 파일에 Herbivore·Plant 부모를 이어 만든다.</w:t>
+        <w:t xml:space="preserve">①: 홍순율 </w:t>
+      </w:r>
+      <w:r>
+        <w:rPr>
+          <w:rFonts w:ascii="Courier New" w:cs="Courier New" w:eastAsia="Courier New" w:hAnsi="Courier New"/>
+          <w:color w:val="1a4a7a"/>
+          <w:sz w:val="19"/>
+          <w:szCs w:val="19"/>
+        </w:rPr>
+        <w:t xml:space="preserve">vector.py</w:t>
+      </w:r>
+      <w:r>
+        <w:rPr>
+          <w:rFonts w:ascii="Apple SD Gothic Neo" w:cs="Apple SD Gothic Neo" w:eastAsia="Apple SD Gothic Neo" w:hAnsi="Apple SD Gothic Neo"/>
+        </w:rPr>
+        <w:t xml:space="preserve"> → </w:t>
+      </w:r>
+      <w:r>
+        <w:rPr>
+          <w:rFonts w:ascii="Courier New" w:cs="Courier New" w:eastAsia="Courier New" w:hAnsi="Courier New"/>
+          <w:color w:val="1a4a7a"/>
+          <w:sz w:val="19"/>
+          <w:szCs w:val="19"/>
+        </w:rPr>
+        <w:t xml:space="preserve">physics.py</w:t>
+      </w:r>
+      <w:r>
+        <w:rPr>
+          <w:rFonts w:ascii="Apple SD Gothic Neo" w:cs="Apple SD Gothic Neo" w:eastAsia="Apple SD Gothic Neo" w:hAnsi="Apple SD Gothic Neo"/>
+        </w:rPr>
+        <w:t xml:space="preserve">, 그리고 </w:t>
+      </w:r>
+      <w:r>
+        <w:rPr>
+          <w:rFonts w:ascii="Courier New" w:cs="Courier New" w:eastAsia="Courier New" w:hAnsi="Courier New"/>
+          <w:color w:val="1a4a7a"/>
+          <w:sz w:val="19"/>
+          <w:szCs w:val="19"/>
+        </w:rPr>
+        <w:t xml:space="preserve">config.py</w:t>
+      </w:r>
+      <w:r>
+        <w:rPr>
+          <w:rFonts w:ascii="Apple SD Gothic Neo" w:cs="Apple SD Gothic Neo" w:eastAsia="Apple SD Gothic Neo" w:hAnsi="Apple SD Gothic Neo"/>
+        </w:rPr>
+        <w:t xml:space="preserve"> (의존성 없음, 가장 먼저).</w:t>
       </w:r>
     </w:p>
     <w:p>
@@ -1946,13 +4721,28 @@
           <w:ilvl w:val="0"/>
           <w:numId w:val="2"/>
         </w:numPr>
-        <w:spacing w:after="60"/>
+        <w:spacing w:after="50"/>
       </w:pPr>
       <w:r>
         <w:rPr>
           <w:rFonts w:ascii="Apple SD Gothic Neo" w:cs="Apple SD Gothic Neo" w:eastAsia="Apple SD Gothic Neo" w:hAnsi="Apple SD Gothic Neo"/>
         </w:rPr>
-        <w:t xml:space="preserve">고정되는 즉시 심준서(육식 3종) · 한시헌(풀·나무·토끼·기린) · 심성진(얼룩말·코끼리) 셋이 동시에 구체 클래스를 작성한다.</w:t>
+        <w:t xml:space="preserve">②: 심성진이 </w:t>
+      </w:r>
+      <w:r>
+        <w:rPr>
+          <w:rFonts w:ascii="Courier New" w:cs="Courier New" w:eastAsia="Courier New" w:hAnsi="Courier New"/>
+          <w:color w:val="1a4a7a"/>
+          <w:sz w:val="19"/>
+          <w:szCs w:val="19"/>
+        </w:rPr>
+        <w:t xml:space="preserve">organisms.py</w:t>
+      </w:r>
+      <w:r>
+        <w:rPr>
+          <w:rFonts w:ascii="Apple SD Gothic Neo" w:cs="Apple SD Gothic Neo" w:eastAsia="Apple SD Gothic Neo" w:hAnsi="Apple SD Gothic Neo"/>
+        </w:rPr>
+        <w:t xml:space="preserve"> 에 Entity·Animal·Carnivore를 만들어 인터페이스 고정 → 한시헌이 곧바로 같은 파일에 Herbivore·Plant를 이어서 작성.</w:t>
       </w:r>
     </w:p>
     <w:p>
@@ -1962,13 +4752,73 @@
           <w:ilvl w:val="0"/>
           <w:numId w:val="2"/>
         </w:numPr>
-        <w:spacing w:after="60"/>
+        <w:spacing w:after="50"/>
       </w:pPr>
       <w:r>
         <w:rPr>
           <w:rFonts w:ascii="Apple SD Gothic Neo" w:cs="Apple SD Gothic Neo" w:eastAsia="Apple SD Gothic Neo" w:hAnsi="Apple SD Gothic Neo"/>
         </w:rPr>
-        <w:t xml:space="preserve">동물이 나오면 심성진(world)과 심준서(interactions)가 월드·상호작용을 병렬로 작성한다.</w:t>
+        <w:t xml:space="preserve">③ (3인 동시 병렬): 심준서 </w:t>
+      </w:r>
+      <w:r>
+        <w:rPr>
+          <w:rFonts w:ascii="Courier New" w:cs="Courier New" w:eastAsia="Courier New" w:hAnsi="Courier New"/>
+          <w:color w:val="1a4a7a"/>
+          <w:sz w:val="19"/>
+          <w:szCs w:val="19"/>
+        </w:rPr>
+        <w:t xml:space="preserve">carnivores.py</w:t>
+      </w:r>
+      <w:r>
+        <w:rPr>
+          <w:rFonts w:ascii="Apple SD Gothic Neo" w:cs="Apple SD Gothic Neo" w:eastAsia="Apple SD Gothic Neo" w:hAnsi="Apple SD Gothic Neo"/>
+        </w:rPr>
+        <w:t xml:space="preserve"> / 한시헌 </w:t>
+      </w:r>
+      <w:r>
+        <w:rPr>
+          <w:rFonts w:ascii="Courier New" w:cs="Courier New" w:eastAsia="Courier New" w:hAnsi="Courier New"/>
+          <w:color w:val="1a4a7a"/>
+          <w:sz w:val="19"/>
+          <w:szCs w:val="19"/>
+        </w:rPr>
+        <w:t xml:space="preserve">plants.py</w:t>
+      </w:r>
+      <w:r>
+        <w:rPr>
+          <w:rFonts w:ascii="Apple SD Gothic Neo" w:cs="Apple SD Gothic Neo" w:eastAsia="Apple SD Gothic Neo" w:hAnsi="Apple SD Gothic Neo"/>
+        </w:rPr>
+        <w:t xml:space="preserve"> + </w:t>
+      </w:r>
+      <w:r>
+        <w:rPr>
+          <w:rFonts w:ascii="Courier New" w:cs="Courier New" w:eastAsia="Courier New" w:hAnsi="Courier New"/>
+          <w:color w:val="1a4a7a"/>
+          <w:sz w:val="19"/>
+          <w:szCs w:val="19"/>
+        </w:rPr>
+        <w:t xml:space="preserve">herbivores.py</w:t>
+      </w:r>
+      <w:r>
+        <w:rPr>
+          <w:rFonts w:ascii="Apple SD Gothic Neo" w:cs="Apple SD Gothic Neo" w:eastAsia="Apple SD Gothic Neo" w:hAnsi="Apple SD Gothic Neo"/>
+        </w:rPr>
+        <w:t xml:space="preserve">(Rabbit·Giraffe) / 심성진 </w:t>
+      </w:r>
+      <w:r>
+        <w:rPr>
+          <w:rFonts w:ascii="Courier New" w:cs="Courier New" w:eastAsia="Courier New" w:hAnsi="Courier New"/>
+          <w:color w:val="1a4a7a"/>
+          <w:sz w:val="19"/>
+          <w:szCs w:val="19"/>
+        </w:rPr>
+        <w:t xml:space="preserve">herbivores.py</w:t>
+      </w:r>
+      <w:r>
+        <w:rPr>
+          <w:rFonts w:ascii="Apple SD Gothic Neo" w:cs="Apple SD Gothic Neo" w:eastAsia="Apple SD Gothic Neo" w:hAnsi="Apple SD Gothic Neo"/>
+        </w:rPr>
+        <w:t xml:space="preserve">(Zebra·Elephant).</w:t>
       </w:r>
     </w:p>
     <w:p>
@@ -1978,13 +4828,43 @@
           <w:ilvl w:val="0"/>
           <w:numId w:val="2"/>
         </w:numPr>
-        <w:spacing w:after="60"/>
+        <w:spacing w:after="50"/>
       </w:pPr>
       <w:r>
         <w:rPr>
           <w:rFonts w:ascii="Apple SD Gothic Neo" w:cs="Apple SD Gothic Neo" w:eastAsia="Apple SD Gothic Neo" w:hAnsi="Apple SD Gothic Neo"/>
         </w:rPr>
-        <w:t xml:space="preserve">World가 완성되면 홍순율(disaster·main)과 한시헌(gui)이 화면·입력·종료를 만든다.</w:t>
+        <w:t xml:space="preserve">④ (2인 병렬): 심성진 </w:t>
+      </w:r>
+      <w:r>
+        <w:rPr>
+          <w:rFonts w:ascii="Courier New" w:cs="Courier New" w:eastAsia="Courier New" w:hAnsi="Courier New"/>
+          <w:color w:val="1a4a7a"/>
+          <w:sz w:val="19"/>
+          <w:szCs w:val="19"/>
+        </w:rPr>
+        <w:t xml:space="preserve">world.py</w:t>
+      </w:r>
+      <w:r>
+        <w:rPr>
+          <w:rFonts w:ascii="Apple SD Gothic Neo" w:cs="Apple SD Gothic Neo" w:eastAsia="Apple SD Gothic Neo" w:hAnsi="Apple SD Gothic Neo"/>
+        </w:rPr>
+        <w:t xml:space="preserve"> + 심준서 </w:t>
+      </w:r>
+      <w:r>
+        <w:rPr>
+          <w:rFonts w:ascii="Courier New" w:cs="Courier New" w:eastAsia="Courier New" w:hAnsi="Courier New"/>
+          <w:color w:val="1a4a7a"/>
+          <w:sz w:val="19"/>
+          <w:szCs w:val="19"/>
+        </w:rPr>
+        <w:t xml:space="preserve">interactions.py</w:t>
+      </w:r>
+      <w:r>
+        <w:rPr>
+          <w:rFonts w:ascii="Apple SD Gothic Neo" w:cs="Apple SD Gothic Neo" w:eastAsia="Apple SD Gothic Neo" w:hAnsi="Apple SD Gothic Neo"/>
+        </w:rPr>
+        <w:t xml:space="preserve"> (nearest/within 이름 합의 후).</w:t>
       </w:r>
     </w:p>
     <w:p>
@@ -1994,24 +4874,89 @@
           <w:ilvl w:val="0"/>
           <w:numId w:val="2"/>
         </w:numPr>
-        <w:spacing w:after="60"/>
+        <w:spacing w:after="50"/>
       </w:pPr>
       <w:r>
         <w:rPr>
           <w:rFonts w:ascii="Apple SD Gothic Neo" w:cs="Apple SD Gothic Neo" w:eastAsia="Apple SD Gothic Neo" w:hAnsi="Apple SD Gothic Neo"/>
         </w:rPr>
-        <w:t xml:space="preserve">다 함께 통합·밸런싱·디버깅 후 시연 영상과 발표 자료를 제작한다.</w:t>
+        <w:t xml:space="preserve">⑤ (2인 병렬): 한시헌 </w:t>
+      </w:r>
+      <w:r>
+        <w:rPr>
+          <w:rFonts w:ascii="Courier New" w:cs="Courier New" w:eastAsia="Courier New" w:hAnsi="Courier New"/>
+          <w:color w:val="1a4a7a"/>
+          <w:sz w:val="19"/>
+          <w:szCs w:val="19"/>
+        </w:rPr>
+        <w:t xml:space="preserve">gui.py</w:t>
+      </w:r>
+      <w:r>
+        <w:rPr>
+          <w:rFonts w:ascii="Apple SD Gothic Neo" w:cs="Apple SD Gothic Neo" w:eastAsia="Apple SD Gothic Neo" w:hAnsi="Apple SD Gothic Neo"/>
+        </w:rPr>
+        <w:t xml:space="preserve"> + 홍순율 </w:t>
+      </w:r>
+      <w:r>
+        <w:rPr>
+          <w:rFonts w:ascii="Courier New" w:cs="Courier New" w:eastAsia="Courier New" w:hAnsi="Courier New"/>
+          <w:color w:val="1a4a7a"/>
+          <w:sz w:val="19"/>
+          <w:szCs w:val="19"/>
+        </w:rPr>
+        <w:t xml:space="preserve">disaster.py</w:t>
+      </w:r>
+      <w:r>
+        <w:rPr>
+          <w:rFonts w:ascii="Apple SD Gothic Neo" w:cs="Apple SD Gothic Neo" w:eastAsia="Apple SD Gothic Neo" w:hAnsi="Apple SD Gothic Neo"/>
+        </w:rPr>
+        <w:t xml:space="preserve"> → 마지막으로 홍순율 </w:t>
+      </w:r>
+      <w:r>
+        <w:rPr>
+          <w:rFonts w:ascii="Courier New" w:cs="Courier New" w:eastAsia="Courier New" w:hAnsi="Courier New"/>
+          <w:color w:val="1a4a7a"/>
+          <w:sz w:val="19"/>
+          <w:szCs w:val="19"/>
+        </w:rPr>
+        <w:t xml:space="preserve">main.py</w:t>
+      </w:r>
+      <w:r>
+        <w:rPr>
+          <w:rFonts w:ascii="Apple SD Gothic Neo" w:cs="Apple SD Gothic Neo" w:eastAsia="Apple SD Gothic Neo" w:hAnsi="Apple SD Gothic Neo"/>
+        </w:rPr>
+        <w:t xml:space="preserve">.</w:t>
       </w:r>
     </w:p>
     <w:p>
       <w:pPr>
-        <w:spacing w:after="120"/>
+        <w:pStyle w:val="ListParagraph"/>
+        <w:numPr>
+          <w:ilvl w:val="0"/>
+          <w:numId w:val="2"/>
+        </w:numPr>
+        <w:spacing w:after="50"/>
       </w:pPr>
       <w:r>
         <w:rPr>
           <w:rFonts w:ascii="Apple SD Gothic Neo" w:cs="Apple SD Gothic Neo" w:eastAsia="Apple SD Gothic Neo" w:hAnsi="Apple SD Gothic Neo"/>
         </w:rPr>
-        <w:t xml:space="preserve">병목은 ② 부모 클래스와 ④ World다. 이 둘의 이름(인터페이스)만 먼저 합의해 두면 속 내용이 비어 있어도 나머지 팀원이 기다리지 않고 병렬로 개발할 수 있다.</w:t>
+        <w:t xml:space="preserve">⑥–⑦: 다 함께 통합·밸런싱(</w:t>
+      </w:r>
+      <w:r>
+        <w:rPr>
+          <w:rFonts w:ascii="Courier New" w:cs="Courier New" w:eastAsia="Courier New" w:hAnsi="Courier New"/>
+          <w:color w:val="1a4a7a"/>
+          <w:sz w:val="19"/>
+          <w:szCs w:val="19"/>
+        </w:rPr>
+        <w:t xml:space="preserve">config.py</w:t>
+      </w:r>
+      <w:r>
+        <w:rPr>
+          <w:rFonts w:ascii="Apple SD Gothic Neo" w:cs="Apple SD Gothic Neo" w:eastAsia="Apple SD Gothic Neo" w:hAnsi="Apple SD Gothic Neo"/>
+        </w:rPr>
+        <w:t xml:space="preserve"> 수치 조정)·디버깅 → 시연 영상(2분)·발표 자료 제작.</w:t>
       </w:r>
     </w:p>
     <w:p>
@@ -2029,7 +4974,7 @@
           <w:b/>
           <w:bCs/>
         </w:rPr>
-        <w:t xml:space="preserve">2. 코드 시연 영상 시나리오 (2분 이내)</w:t>
+        <w:t xml:space="preserve">3. 코드 시연 영상 시나리오 (2분 이내)</w:t>
       </w:r>
     </w:p>
     <w:p>
@@ -2242,8 +5187,8 @@
               <w:rPr>
                 <w:rFonts w:ascii="Courier New" w:cs="Courier New" w:eastAsia="Courier New" w:hAnsi="Courier New"/>
                 <w:color w:val="1a4a7a"/>
-                <w:sz w:val="20"/>
-                <w:szCs w:val="20"/>
+                <w:sz w:val="19"/>
+                <w:szCs w:val="19"/>
               </w:rPr>
               <w:t xml:space="preserve">python3 main.py</w:t>
             </w:r>
@@ -2713,7 +5658,7 @@
           <w:b/>
           <w:bCs/>
         </w:rPr>
-        <w:t xml:space="preserve">3. 발표 대본 (3인, 각 1분 30초 이내 · 합계 약 4분 30초)</w:t>
+        <w:t xml:space="preserve">4. 발표 대본 (3인, 각 1분 30초 이내 · 합계 약 4분 30초)</w:t>
       </w:r>
     </w:p>
     <w:p>
@@ -2737,7 +5682,7 @@
           <w:b/>
           <w:bCs/>
         </w:rPr>
-        <w:t xml:space="preserve">3-1. 홍순율 — 물리엔진과 시작·끝 (약 1분 25초)</w:t>
+        <w:t xml:space="preserve">4-1. 홍순율 — 물리엔진과 시작·끝 (약 1분 25초)</w:t>
       </w:r>
     </w:p>
     <w:p>
@@ -2761,7 +5706,7 @@
           <w:b/>
           <w:bCs/>
         </w:rPr>
-        <w:t xml:space="preserve">3-2. 심준서 — 육식동물과 상호작용 (약 1분 25초)</w:t>
+        <w:t xml:space="preserve">4-2. 심준서 — 육식동물과 상호작용 (약 1분 25초)</w:t>
       </w:r>
     </w:p>
     <w:p>
@@ -2785,7 +5730,7 @@
           <w:b/>
           <w:bCs/>
         </w:rPr>
-        <w:t xml:space="preserve">3-3. 한시헌 — 초식동물·식물·GUI (약 1분 25초)</w:t>
+        <w:t xml:space="preserve">4-3. 한시헌 — 초식동물·식물·GUI (약 1분 25초)</w:t>
       </w:r>
     </w:p>
     <w:p>
@@ -2809,7 +5754,7 @@
           <w:b/>
           <w:bCs/>
         </w:rPr>
-        <w:t xml:space="preserve">3-4. 시간 배분 점검</w:t>
+        <w:t xml:space="preserve">4-4. 시간 배분 점검</w:t>
       </w:r>
     </w:p>
     <w:tbl>
@@ -3426,7 +6371,7 @@
     </w:p>
     <w:sectPr>
       <w:pgSz w:w="11906" w:h="16838" w:orient="portrait"/>
-      <w:pgMar w:top="1280" w:right="1280" w:bottom="1280" w:left="1280" w:header="708" w:footer="708" w:gutter="0"/>
+      <w:pgMar w:top="1180" w:right="1180" w:bottom="1180" w:left="1180" w:header="708" w:footer="708" w:gutter="0"/>
       <w:pgNumType/>
       <w:docGrid w:linePitch="360"/>
     </w:sectPr>
@@ -3606,19 +6551,7 @@
       <w:lvlText w:val="•"/>
       <w:lvlJc w:val="left"/>
       <w:pPr>
-        <w:ind w:left="540" w:hanging="280"/>
-      </w:pPr>
-    </w:lvl>
-  </w:abstractNum>
-  <w:abstractNum w:abstractNumId="3" w15:restartNumberingAfterBreak="0">
-    <w:multiLevelType w:val="hybridMultilevel"/>
-    <w:lvl w:ilvl="0" w15:tentative="1">
-      <w:start w:val="1"/>
-      <w:numFmt w:val="decimal"/>
-      <w:lvlText w:val="%1."/>
-      <w:lvlJc w:val="left"/>
-      <w:pPr>
-        <w:ind w:left="540" w:hanging="280"/>
+        <w:ind w:left="480" w:hanging="260"/>
       </w:pPr>
     </w:lvl>
   </w:abstractNum>
@@ -3629,7 +6562,7 @@
     </w:lvlOverride>
   </w:num>
   <w:num w:numId="2">
-    <w:abstractNumId w:val="3"/>
+    <w:abstractNumId w:val="2"/>
     <w:lvlOverride w:ilvl="0">
       <w:startOverride w:val="1"/>
     </w:lvlOverride>

</xml_diff>

<commit_message>
자동 동기화 2026-06-10 23:00:25
</commit_message>
<xml_diff>
--- a/발표준비/개발순서_시연시나리오_발표대본.docx
+++ b/발표준비/개발순서_시연시나리오_발표대본.docx
@@ -1531,7 +1531,7 @@
               <w:rPr>
                 <w:rFonts w:ascii="Apple SD Gothic Neo" w:cs="Apple SD Gothic Neo" w:eastAsia="Apple SD Gothic Neo" w:hAnsi="Apple SD Gothic Neo"/>
               </w:rPr>
-              <w:t xml:space="preserve">⑤-a</w:t>
+              <w:t xml:space="preserve">⑤</w:t>
             </w:r>
           </w:p>
         </w:tc>
@@ -1583,127 +1583,13 @@
                 <w:sz w:val="19"/>
                 <w:szCs w:val="19"/>
               </w:rPr>
-              <w:t xml:space="preserve">main.py</w:t>
-            </w:r>
-            <w:r>
-              <w:rPr>
-                <w:rFonts w:ascii="Apple SD Gothic Neo" w:cs="Apple SD Gothic Neo" w:eastAsia="Apple SD Gothic Neo" w:hAnsi="Apple SD Gothic Neo"/>
-              </w:rPr>
-              <w:t xml:space="preserve"> (진입점)</w:t>
-            </w:r>
-          </w:p>
-        </w:tc>
-        <w:tc>
-          <w:tcPr>
-            <w:tcW w:type="dxa" w:w="1100"/>
-            <w:tcBorders>
-              <w:top w:val="single" w:color="BBBBBB" w:sz="1"/>
-              <w:left w:val="single" w:color="BBBBBB" w:sz="1"/>
-              <w:bottom w:val="single" w:color="BBBBBB" w:sz="1"/>
-              <w:right w:val="single" w:color="BBBBBB" w:sz="1"/>
-            </w:tcBorders>
-            <w:tcMar>
-              <w:top w:type="dxa" w:w="60"/>
-              <w:left w:type="dxa" w:w="100"/>
-              <w:bottom w:type="dxa" w:w="60"/>
-              <w:right w:type="dxa" w:w="100"/>
-            </w:tcMar>
-          </w:tcPr>
-          <w:p>
-            <w:pPr>
-              <w:spacing w:after="0"/>
-            </w:pPr>
-            <w:r>
-              <w:rPr>
-                <w:rFonts w:ascii="Apple SD Gothic Neo" w:cs="Apple SD Gothic Neo" w:eastAsia="Apple SD Gothic Neo" w:hAnsi="Apple SD Gothic Neo"/>
-              </w:rPr>
-              <w:t xml:space="preserve">홍순율</w:t>
-            </w:r>
-          </w:p>
-        </w:tc>
-        <w:tc>
-          <w:tcPr>
-            <w:tcW w:type="dxa" w:w="2900"/>
-            <w:tcBorders>
-              <w:top w:val="single" w:color="BBBBBB" w:sz="1"/>
-              <w:left w:val="single" w:color="BBBBBB" w:sz="1"/>
-              <w:bottom w:val="single" w:color="BBBBBB" w:sz="1"/>
-              <w:right w:val="single" w:color="BBBBBB" w:sz="1"/>
-            </w:tcBorders>
-            <w:tcMar>
-              <w:top w:type="dxa" w:w="60"/>
-              <w:left w:type="dxa" w:w="100"/>
-              <w:bottom w:type="dxa" w:w="60"/>
-              <w:right w:type="dxa" w:w="100"/>
-            </w:tcMar>
-          </w:tcPr>
-          <w:p>
-            <w:pPr>
-              <w:spacing w:after="0"/>
-            </w:pPr>
-            <w:r>
-              <w:rPr>
-                <w:rFonts w:ascii="Apple SD Gothic Neo" w:cs="Apple SD Gothic Neo" w:eastAsia="Apple SD Gothic Neo" w:hAnsi="Apple SD Gothic Neo"/>
-              </w:rPr>
-              <w:t xml:space="preserve">④-a의 World(spawn·entities) 고정 후. main.py는 ⑤-b의 gui.py 완성 후 마지막</w:t>
-            </w:r>
-          </w:p>
-        </w:tc>
-      </w:tr>
-      <w:tr>
-        <w:tc>
-          <w:tcPr>
-            <w:tcW w:type="dxa" w:w="800"/>
-            <w:tcBorders>
-              <w:top w:val="single" w:color="BBBBBB" w:sz="1"/>
-              <w:left w:val="single" w:color="BBBBBB" w:sz="1"/>
-              <w:bottom w:val="single" w:color="BBBBBB" w:sz="1"/>
-              <w:right w:val="single" w:color="BBBBBB" w:sz="1"/>
-            </w:tcBorders>
-            <w:tcMar>
-              <w:top w:type="dxa" w:w="60"/>
-              <w:left w:type="dxa" w:w="100"/>
-              <w:bottom w:type="dxa" w:w="60"/>
-              <w:right w:type="dxa" w:w="100"/>
-            </w:tcMar>
-          </w:tcPr>
-          <w:p>
-            <w:pPr>
-              <w:spacing w:after="0"/>
-            </w:pPr>
-            <w:r>
-              <w:rPr>
-                <w:rFonts w:ascii="Apple SD Gothic Neo" w:cs="Apple SD Gothic Neo" w:eastAsia="Apple SD Gothic Neo" w:hAnsi="Apple SD Gothic Neo"/>
-              </w:rPr>
-              <w:t xml:space="preserve">⑤-b</w:t>
-            </w:r>
-          </w:p>
-        </w:tc>
-        <w:tc>
-          <w:tcPr>
-            <w:tcW w:type="dxa" w:w="4600"/>
-            <w:tcBorders>
-              <w:top w:val="single" w:color="BBBBBB" w:sz="1"/>
-              <w:left w:val="single" w:color="BBBBBB" w:sz="1"/>
-              <w:bottom w:val="single" w:color="BBBBBB" w:sz="1"/>
-              <w:right w:val="single" w:color="BBBBBB" w:sz="1"/>
-            </w:tcBorders>
-            <w:tcMar>
-              <w:top w:type="dxa" w:w="60"/>
-              <w:left w:type="dxa" w:w="100"/>
-              <w:bottom w:type="dxa" w:w="60"/>
-              <w:right w:type="dxa" w:w="100"/>
-            </w:tcMar>
-          </w:tcPr>
-          <w:p>
-            <w:pPr>
-              <w:spacing w:after="0"/>
-            </w:pPr>
-            <w:r>
-              <w:rPr>
-                <w:rFonts w:ascii="Apple SD Gothic Neo" w:cs="Apple SD Gothic Neo" w:eastAsia="Apple SD Gothic Neo" w:hAnsi="Apple SD Gothic Neo"/>
-              </w:rPr>
-              <w:t xml:space="preserve"/>
+              <w:t xml:space="preserve">gui.py</w:t>
+            </w:r>
+            <w:r>
+              <w:rPr>
+                <w:rFonts w:ascii="Apple SD Gothic Neo" w:cs="Apple SD Gothic Neo" w:eastAsia="Apple SD Gothic Neo" w:hAnsi="Apple SD Gothic Neo"/>
+              </w:rPr>
+              <w:t xml:space="preserve"> (EcosystemApp: 캔버스·패널·게임 루프·키 입력) → </w:t>
             </w:r>
             <w:r>
               <w:rPr>
@@ -1712,13 +1598,13 @@
                 <w:sz w:val="19"/>
                 <w:szCs w:val="19"/>
               </w:rPr>
-              <w:t xml:space="preserve">gui.py</w:t>
-            </w:r>
-            <w:r>
-              <w:rPr>
-                <w:rFonts w:ascii="Apple SD Gothic Neo" w:cs="Apple SD Gothic Neo" w:eastAsia="Apple SD Gothic Neo" w:hAnsi="Apple SD Gothic Neo"/>
-              </w:rPr>
-              <w:t xml:space="preserve"> (EcosystemApp: 캔버스·패널·게임 루프·키 입력)</w:t>
+              <w:t xml:space="preserve">main.py</w:t>
+            </w:r>
+            <w:r>
+              <w:rPr>
+                <w:rFonts w:ascii="Apple SD Gothic Neo" w:cs="Apple SD Gothic Neo" w:eastAsia="Apple SD Gothic Neo" w:hAnsi="Apple SD Gothic Neo"/>
+              </w:rPr>
+              <w:t xml:space="preserve"> (진입점, 맨 마지막)</w:t>
             </w:r>
           </w:p>
         </w:tc>
@@ -1746,7 +1632,7 @@
               <w:rPr>
                 <w:rFonts w:ascii="Apple SD Gothic Neo" w:cs="Apple SD Gothic Neo" w:eastAsia="Apple SD Gothic Neo" w:hAnsi="Apple SD Gothic Neo"/>
               </w:rPr>
-              <w:t xml:space="preserve">한시헌</w:t>
+              <w:t xml:space="preserve">홍순율</w:t>
             </w:r>
           </w:p>
         </w:tc>
@@ -1774,7 +1660,7 @@
               <w:rPr>
                 <w:rFonts w:ascii="Apple SD Gothic Neo" w:cs="Apple SD Gothic Neo" w:eastAsia="Apple SD Gothic Neo" w:hAnsi="Apple SD Gothic Neo"/>
               </w:rPr>
-              <w:t xml:space="preserve">④-a의 World(step·stats·events) 고정 후 (⑤-a와 병렬)</w:t>
+              <w:t xml:space="preserve">④-a의 World(step·stats·events·spawn) 고정 후</w:t>
             </w:r>
           </w:p>
         </w:tc>
@@ -2802,6 +2688,135 @@
                 <w:sz w:val="19"/>
                 <w:szCs w:val="19"/>
               </w:rPr>
+              <w:t xml:space="preserve">gui.py</w:t>
+            </w:r>
+            <w:r>
+              <w:rPr>
+                <w:rFonts w:ascii="Apple SD Gothic Neo" w:cs="Apple SD Gothic Neo" w:eastAsia="Apple SD Gothic Neo" w:hAnsi="Apple SD Gothic Neo"/>
+              </w:rPr>
+              <w:t xml:space="preserve"/>
+            </w:r>
+          </w:p>
+        </w:tc>
+        <w:tc>
+          <w:tcPr>
+            <w:tcW w:type="dxa" w:w="4500"/>
+            <w:tcBorders>
+              <w:top w:val="single" w:color="BBBBBB" w:sz="1"/>
+              <w:left w:val="single" w:color="BBBBBB" w:sz="1"/>
+              <w:bottom w:val="single" w:color="BBBBBB" w:sz="1"/>
+              <w:right w:val="single" w:color="BBBBBB" w:sz="1"/>
+            </w:tcBorders>
+            <w:tcMar>
+              <w:top w:type="dxa" w:w="60"/>
+              <w:left w:type="dxa" w:w="100"/>
+              <w:bottom w:type="dxa" w:w="60"/>
+              <w:right w:type="dxa" w:w="100"/>
+            </w:tcMar>
+          </w:tcPr>
+          <w:p>
+            <w:pPr>
+              <w:spacing w:after="0"/>
+            </w:pPr>
+            <w:r>
+              <w:rPr>
+                <w:rFonts w:ascii="Apple SD Gothic Neo" w:cs="Apple SD Gothic Neo" w:eastAsia="Apple SD Gothic Neo" w:hAnsi="Apple SD Gothic Neo"/>
+              </w:rPr>
+              <w:t xml:space="preserve">EcosystemApp: _pick_font/_resolve_fonts(글꼴 이식성) → _build_panel(정보 패널) → _loop(after 게임 루프) → _render/_draw_entity/_draw_hp_bar/_draw_gameover(렌더링) → _update_panel → _on_key/_restart(한/영 키 매핑 포함)</w:t>
+            </w:r>
+          </w:p>
+        </w:tc>
+        <w:tc>
+          <w:tcPr>
+            <w:tcW w:type="dxa" w:w="2700"/>
+            <w:tcBorders>
+              <w:top w:val="single" w:color="BBBBBB" w:sz="1"/>
+              <w:left w:val="single" w:color="BBBBBB" w:sz="1"/>
+              <w:bottom w:val="single" w:color="BBBBBB" w:sz="1"/>
+              <w:right w:val="single" w:color="BBBBBB" w:sz="1"/>
+            </w:tcBorders>
+            <w:tcMar>
+              <w:top w:type="dxa" w:w="60"/>
+              <w:left w:type="dxa" w:w="100"/>
+              <w:bottom w:type="dxa" w:w="60"/>
+              <w:right w:type="dxa" w:w="100"/>
+            </w:tcMar>
+          </w:tcPr>
+          <w:p>
+            <w:pPr>
+              <w:spacing w:after="0"/>
+            </w:pPr>
+            <w:r>
+              <w:rPr>
+                <w:rFonts w:ascii="Apple SD Gothic Neo" w:cs="Apple SD Gothic Neo" w:eastAsia="Apple SD Gothic Neo" w:hAnsi="Apple SD Gothic Neo"/>
+              </w:rPr>
+              <w:t xml:space="preserve">④-a World(step·stats·events·trigger_disaster) 고정 후</w:t>
+            </w:r>
+          </w:p>
+        </w:tc>
+      </w:tr>
+      <w:tr>
+        <w:tc>
+          <w:tcPr>
+            <w:tcW w:type="dxa" w:w="700"/>
+            <w:tcBorders>
+              <w:top w:val="single" w:color="BBBBBB" w:sz="1"/>
+              <w:left w:val="single" w:color="BBBBBB" w:sz="1"/>
+              <w:bottom w:val="single" w:color="BBBBBB" w:sz="1"/>
+              <w:right w:val="single" w:color="BBBBBB" w:sz="1"/>
+            </w:tcBorders>
+            <w:tcMar>
+              <w:top w:type="dxa" w:w="60"/>
+              <w:left w:type="dxa" w:w="100"/>
+              <w:bottom w:type="dxa" w:w="60"/>
+              <w:right w:type="dxa" w:w="100"/>
+            </w:tcMar>
+          </w:tcPr>
+          <w:p>
+            <w:pPr>
+              <w:spacing w:after="0"/>
+            </w:pPr>
+            <w:r>
+              <w:rPr>
+                <w:rFonts w:ascii="Apple SD Gothic Neo" w:cs="Apple SD Gothic Neo" w:eastAsia="Apple SD Gothic Neo" w:hAnsi="Apple SD Gothic Neo"/>
+              </w:rPr>
+              <w:t xml:space="preserve">6</w:t>
+            </w:r>
+          </w:p>
+        </w:tc>
+        <w:tc>
+          <w:tcPr>
+            <w:tcW w:type="dxa" w:w="1500"/>
+            <w:tcBorders>
+              <w:top w:val="single" w:color="BBBBBB" w:sz="1"/>
+              <w:left w:val="single" w:color="BBBBBB" w:sz="1"/>
+              <w:bottom w:val="single" w:color="BBBBBB" w:sz="1"/>
+              <w:right w:val="single" w:color="BBBBBB" w:sz="1"/>
+            </w:tcBorders>
+            <w:tcMar>
+              <w:top w:type="dxa" w:w="60"/>
+              <w:left w:type="dxa" w:w="100"/>
+              <w:bottom w:type="dxa" w:w="60"/>
+              <w:right w:type="dxa" w:w="100"/>
+            </w:tcMar>
+          </w:tcPr>
+          <w:p>
+            <w:pPr>
+              <w:spacing w:after="0"/>
+            </w:pPr>
+            <w:r>
+              <w:rPr>
+                <w:rFonts w:ascii="Apple SD Gothic Neo" w:cs="Apple SD Gothic Neo" w:eastAsia="Apple SD Gothic Neo" w:hAnsi="Apple SD Gothic Neo"/>
+              </w:rPr>
+              <w:t xml:space="preserve"/>
+            </w:r>
+            <w:r>
+              <w:rPr>
+                <w:rFonts w:ascii="Courier New" w:cs="Courier New" w:eastAsia="Courier New" w:hAnsi="Courier New"/>
+                <w:color w:val="1a4a7a"/>
+                <w:sz w:val="19"/>
+                <w:szCs w:val="19"/>
+              </w:rPr>
               <w:t xml:space="preserve">main.py</w:t>
             </w:r>
             <w:r>
@@ -2864,7 +2879,7 @@
               <w:rPr>
                 <w:rFonts w:ascii="Apple SD Gothic Neo" w:cs="Apple SD Gothic Neo" w:eastAsia="Apple SD Gothic Neo" w:hAnsi="Apple SD Gothic Neo"/>
               </w:rPr>
-              <w:t xml:space="preserve">한시헌의 gui.py 완성 후</w:t>
+              <w:t xml:space="preserve">5번 gui.py 완성 직후</w:t>
             </w:r>
           </w:p>
         </w:tc>
@@ -2923,7 +2938,7 @@
         <w:rPr>
           <w:rFonts w:ascii="Apple SD Gothic Neo" w:cs="Apple SD Gothic Neo" w:eastAsia="Apple SD Gothic Neo" w:hAnsi="Apple SD Gothic Neo"/>
         </w:rPr>
-        <w:t xml:space="preserve"> 까지를 가장 먼저 끝내 팀 전체의 출발선을 만들고, 중반에는 대기하다가 World가 나오면 </w:t>
+        <w:t xml:space="preserve"> 까지를 가장 먼저 끝내 팀 전체의 출발선을 만들고, World 인터페이스가 고정되면 </w:t>
       </w:r>
       <w:r>
         <w:rPr>
@@ -2938,7 +2953,7 @@
         <w:rPr>
           <w:rFonts w:ascii="Apple SD Gothic Neo" w:cs="Apple SD Gothic Neo" w:eastAsia="Apple SD Gothic Neo" w:hAnsi="Apple SD Gothic Neo"/>
         </w:rPr>
-        <w:t xml:space="preserve">, gui가 나오면 </w:t>
+        <w:t xml:space="preserve"> → </w:t>
       </w:r>
       <w:r>
         <w:rPr>
@@ -2947,13 +2962,28 @@
           <w:sz w:val="19"/>
           <w:szCs w:val="19"/>
         </w:rPr>
+        <w:t xml:space="preserve">gui.py</w:t>
+      </w:r>
+      <w:r>
+        <w:rPr>
+          <w:rFonts w:ascii="Apple SD Gothic Neo" w:cs="Apple SD Gothic Neo" w:eastAsia="Apple SD Gothic Neo" w:hAnsi="Apple SD Gothic Neo"/>
+        </w:rPr>
+        <w:t xml:space="preserve"> → </w:t>
+      </w:r>
+      <w:r>
+        <w:rPr>
+          <w:rFonts w:ascii="Courier New" w:cs="Courier New" w:eastAsia="Courier New" w:hAnsi="Courier New"/>
+          <w:color w:val="1a4a7a"/>
+          <w:sz w:val="19"/>
+          <w:szCs w:val="19"/>
+        </w:rPr>
         <w:t xml:space="preserve">main.py</w:t>
       </w:r>
       <w:r>
         <w:rPr>
           <w:rFonts w:ascii="Apple SD Gothic Neo" w:cs="Apple SD Gothic Neo" w:eastAsia="Apple SD Gothic Neo" w:hAnsi="Apple SD Gothic Neo"/>
         </w:rPr>
-        <w:t xml:space="preserve"> 로 프로그램을 닫는다.</w:t>
+        <w:t xml:space="preserve"> 순서로 프로그램의 입출력과 마지막을 닫는다.</w:t>
       </w:r>
     </w:p>
     <w:p>
@@ -4483,135 +4513,6 @@
           </w:p>
         </w:tc>
       </w:tr>
-      <w:tr>
-        <w:tc>
-          <w:tcPr>
-            <w:tcW w:type="dxa" w:w="700"/>
-            <w:tcBorders>
-              <w:top w:val="single" w:color="BBBBBB" w:sz="1"/>
-              <w:left w:val="single" w:color="BBBBBB" w:sz="1"/>
-              <w:bottom w:val="single" w:color="BBBBBB" w:sz="1"/>
-              <w:right w:val="single" w:color="BBBBBB" w:sz="1"/>
-            </w:tcBorders>
-            <w:tcMar>
-              <w:top w:type="dxa" w:w="60"/>
-              <w:left w:type="dxa" w:w="100"/>
-              <w:bottom w:type="dxa" w:w="60"/>
-              <w:right w:type="dxa" w:w="100"/>
-            </w:tcMar>
-          </w:tcPr>
-          <w:p>
-            <w:pPr>
-              <w:spacing w:after="0"/>
-            </w:pPr>
-            <w:r>
-              <w:rPr>
-                <w:rFonts w:ascii="Apple SD Gothic Neo" w:cs="Apple SD Gothic Neo" w:eastAsia="Apple SD Gothic Neo" w:hAnsi="Apple SD Gothic Neo"/>
-              </w:rPr>
-              <w:t xml:space="preserve">4</w:t>
-            </w:r>
-          </w:p>
-        </w:tc>
-        <w:tc>
-          <w:tcPr>
-            <w:tcW w:type="dxa" w:w="1700"/>
-            <w:tcBorders>
-              <w:top w:val="single" w:color="BBBBBB" w:sz="1"/>
-              <w:left w:val="single" w:color="BBBBBB" w:sz="1"/>
-              <w:bottom w:val="single" w:color="BBBBBB" w:sz="1"/>
-              <w:right w:val="single" w:color="BBBBBB" w:sz="1"/>
-            </w:tcBorders>
-            <w:tcMar>
-              <w:top w:type="dxa" w:w="60"/>
-              <w:left w:type="dxa" w:w="100"/>
-              <w:bottom w:type="dxa" w:w="60"/>
-              <w:right w:type="dxa" w:w="100"/>
-            </w:tcMar>
-          </w:tcPr>
-          <w:p>
-            <w:pPr>
-              <w:spacing w:after="0"/>
-            </w:pPr>
-            <w:r>
-              <w:rPr>
-                <w:rFonts w:ascii="Apple SD Gothic Neo" w:cs="Apple SD Gothic Neo" w:eastAsia="Apple SD Gothic Neo" w:hAnsi="Apple SD Gothic Neo"/>
-              </w:rPr>
-              <w:t xml:space="preserve"/>
-            </w:r>
-            <w:r>
-              <w:rPr>
-                <w:rFonts w:ascii="Courier New" w:cs="Courier New" w:eastAsia="Courier New" w:hAnsi="Courier New"/>
-                <w:color w:val="1a4a7a"/>
-                <w:sz w:val="19"/>
-                <w:szCs w:val="19"/>
-              </w:rPr>
-              <w:t xml:space="preserve">gui.py</w:t>
-            </w:r>
-            <w:r>
-              <w:rPr>
-                <w:rFonts w:ascii="Apple SD Gothic Neo" w:cs="Apple SD Gothic Neo" w:eastAsia="Apple SD Gothic Neo" w:hAnsi="Apple SD Gothic Neo"/>
-              </w:rPr>
-              <w:t xml:space="preserve"/>
-            </w:r>
-          </w:p>
-        </w:tc>
-        <w:tc>
-          <w:tcPr>
-            <w:tcW w:type="dxa" w:w="4600"/>
-            <w:tcBorders>
-              <w:top w:val="single" w:color="BBBBBB" w:sz="1"/>
-              <w:left w:val="single" w:color="BBBBBB" w:sz="1"/>
-              <w:bottom w:val="single" w:color="BBBBBB" w:sz="1"/>
-              <w:right w:val="single" w:color="BBBBBB" w:sz="1"/>
-            </w:tcBorders>
-            <w:tcMar>
-              <w:top w:type="dxa" w:w="60"/>
-              <w:left w:type="dxa" w:w="100"/>
-              <w:bottom w:type="dxa" w:w="60"/>
-              <w:right w:type="dxa" w:w="100"/>
-            </w:tcMar>
-          </w:tcPr>
-          <w:p>
-            <w:pPr>
-              <w:spacing w:after="0"/>
-            </w:pPr>
-            <w:r>
-              <w:rPr>
-                <w:rFonts w:ascii="Apple SD Gothic Neo" w:cs="Apple SD Gothic Neo" w:eastAsia="Apple SD Gothic Neo" w:hAnsi="Apple SD Gothic Neo"/>
-              </w:rPr>
-              <w:t xml:space="preserve">EcosystemApp: _pick_font/_resolve_fonts(글꼴 이식성) → _build_panel(정보 패널) → _loop(after 게임 루프) → _render/_draw_entity/_draw_hp_bar/_draw_gameover(렌더링) → _update_panel → _on_key/_restart(한/영 키 매핑 포함)</w:t>
-            </w:r>
-          </w:p>
-        </w:tc>
-        <w:tc>
-          <w:tcPr>
-            <w:tcW w:type="dxa" w:w="2400"/>
-            <w:tcBorders>
-              <w:top w:val="single" w:color="BBBBBB" w:sz="1"/>
-              <w:left w:val="single" w:color="BBBBBB" w:sz="1"/>
-              <w:bottom w:val="single" w:color="BBBBBB" w:sz="1"/>
-              <w:right w:val="single" w:color="BBBBBB" w:sz="1"/>
-            </w:tcBorders>
-            <w:tcMar>
-              <w:top w:type="dxa" w:w="60"/>
-              <w:left w:type="dxa" w:w="100"/>
-              <w:bottom w:type="dxa" w:w="60"/>
-              <w:right w:type="dxa" w:w="100"/>
-            </w:tcMar>
-          </w:tcPr>
-          <w:p>
-            <w:pPr>
-              <w:spacing w:after="0"/>
-            </w:pPr>
-            <w:r>
-              <w:rPr>
-                <w:rFonts w:ascii="Apple SD Gothic Neo" w:cs="Apple SD Gothic Neo" w:eastAsia="Apple SD Gothic Neo" w:hAnsi="Apple SD Gothic Neo"/>
-              </w:rPr>
-              <w:t xml:space="preserve">심성진 ④-a의 World(step·stats·events·trigger_disaster) 고정 후</w:t>
-            </w:r>
-          </w:p>
-        </w:tc>
-      </w:tr>
     </w:tbl>
     <w:p>
       <w:pPr>
@@ -4621,7 +4522,7 @@
         <w:rPr>
           <w:rFonts w:ascii="Apple SD Gothic Neo" w:cs="Apple SD Gothic Neo" w:eastAsia="Apple SD Gothic Neo" w:hAnsi="Apple SD Gothic Neo"/>
         </w:rPr>
-        <w:t xml:space="preserve">요약: organisms.py 하단(부모) → plants.py → 토끼·기린 순서로 먹이 피라미드 아래쪽을 완성하고, World가 나오면 gui.py로 전체를 화면에 올린다.</w:t>
+        <w:t xml:space="preserve">요약: organisms.py 하단(부모) → plants.py → 토끼·기린 순서로 먹이 피라미드 아래쪽을 완성한다. ③단계가 끝나면 ⑥ 통합·밸런싱에서 초식·식물 수치 조정을 주도한다.</w:t>
       </w:r>
     </w:p>
     <w:p>
@@ -4880,7 +4781,7 @@
         <w:rPr>
           <w:rFonts w:ascii="Apple SD Gothic Neo" w:cs="Apple SD Gothic Neo" w:eastAsia="Apple SD Gothic Neo" w:hAnsi="Apple SD Gothic Neo"/>
         </w:rPr>
-        <w:t xml:space="preserve">⑤ (2인 병렬): 한시헌 </w:t>
+        <w:t xml:space="preserve">⑤: 홍순율이 </w:t>
       </w:r>
       <w:r>
         <w:rPr>
@@ -4889,13 +4790,13 @@
           <w:sz w:val="19"/>
           <w:szCs w:val="19"/>
         </w:rPr>
-        <w:t xml:space="preserve">gui.py</w:t>
+        <w:t xml:space="preserve">disaster.py</w:t>
       </w:r>
       <w:r>
         <w:rPr>
           <w:rFonts w:ascii="Apple SD Gothic Neo" w:cs="Apple SD Gothic Neo" w:eastAsia="Apple SD Gothic Neo" w:hAnsi="Apple SD Gothic Neo"/>
         </w:rPr>
-        <w:t xml:space="preserve"> + 홍순율 </w:t>
+        <w:t xml:space="preserve"> → </w:t>
       </w:r>
       <w:r>
         <w:rPr>
@@ -4904,13 +4805,13 @@
           <w:sz w:val="19"/>
           <w:szCs w:val="19"/>
         </w:rPr>
-        <w:t xml:space="preserve">disaster.py</w:t>
+        <w:t xml:space="preserve">gui.py</w:t>
       </w:r>
       <w:r>
         <w:rPr>
           <w:rFonts w:ascii="Apple SD Gothic Neo" w:cs="Apple SD Gothic Neo" w:eastAsia="Apple SD Gothic Neo" w:hAnsi="Apple SD Gothic Neo"/>
         </w:rPr>
-        <w:t xml:space="preserve"> → 마지막으로 홍순율 </w:t>
+        <w:t xml:space="preserve"> → </w:t>
       </w:r>
       <w:r>
         <w:rPr>
@@ -4925,7 +4826,7 @@
         <w:rPr>
           <w:rFonts w:ascii="Apple SD Gothic Neo" w:cs="Apple SD Gothic Neo" w:eastAsia="Apple SD Gothic Neo" w:hAnsi="Apple SD Gothic Neo"/>
         </w:rPr>
-        <w:t xml:space="preserve">.</w:t>
+        <w:t xml:space="preserve"> 순서로 종료·화면·진입점을 완성한다.</w:t>
       </w:r>
     </w:p>
     <w:p>
@@ -5658,7 +5559,7 @@
           <w:b/>
           <w:bCs/>
         </w:rPr>
-        <w:t xml:space="preserve">4. 발표 대본 (3인, 각 1분 30초 이내 · 합계 약 4분 30초)</w:t>
+        <w:t xml:space="preserve">4. 발표 대본 (클래스 다이어그램 + 3인 · 합계 약 5분 15초)</w:t>
       </w:r>
     </w:p>
     <w:p>
@@ -5669,7 +5570,7 @@
         <w:rPr>
           <w:rFonts w:ascii="Apple SD Gothic Neo" w:cs="Apple SD Gothic Neo" w:eastAsia="Apple SD Gothic Neo" w:hAnsi="Apple SD Gothic Neo"/>
         </w:rPr>
-        <w:t xml:space="preserve">발표 순서는 개발 순서와 같게: 홍순율(기반) → 심준서(상호작용) → 한시헌(초식·GUI). 심성진 파트(부모 클래스·월드)는 클래스 다이어그램 슬라이드에서 구조 설명으로 자연스럽게 포함된다.</w:t>
+        <w:t xml:space="preserve">진행 순서: ⓪클래스 다이어그램(상속 구조) 설명 → ①홍순율(물리엔진·GUI·재난) → ②심준서(육식·상호작용) → ③한시헌(초식·식물) → 시연 영상(2분). 다이어그램 대본은 심성진 파트(부모 클래스·월드)를 구조 설명으로 대신하는 것으로, 첫 발표자가 도입부로 낭독하거나 심성진이 별도 제출용으로 쓸 수 있다.</w:t>
       </w:r>
     </w:p>
     <w:p>
@@ -5682,7 +5583,7 @@
           <w:b/>
           <w:bCs/>
         </w:rPr>
-        <w:t xml:space="preserve">4-1. 홍순율 — 물리엔진과 시작·끝 (약 1분 25초)</w:t>
+        <w:t xml:space="preserve">4-0. 클래스 다이어그램 — 상속 구조 (약 1분 5초, 다이어그램 슬라이드에서)</w:t>
       </w:r>
     </w:p>
     <w:p>
@@ -5693,7 +5594,7 @@
         <w:rPr>
           <w:rFonts w:ascii="Apple SD Gothic Neo" w:cs="Apple SD Gothic Neo" w:eastAsia="Apple SD Gothic Neo" w:hAnsi="Apple SD Gothic Neo"/>
         </w:rPr>
-        <w:t xml:space="preserve">“안녕하세요, 물리엔진과 프로그램의 뼈대를 맡은 홍순율입니다. 저희 프로젝트는 외부 라이브러리 없이 100% 파이썬 표준 라이브러리로 만들었기 때문에, 물리엔진도 직접 구현해야 했습니다. 먼저 vector.py에서 2차원 벡터 클래스를 만들고 연산자 오버로딩을 적용해서, 물리 공식을 '위치 더하기 속도 곱하기 시간'처럼 수식 그대로 코드에 쓸 수 있게 했습니다. physics.py의 핵심은 '결정과 실행의 분리'입니다. seek, flee, wander 같은 조향 함수가 '어디로 갈지' 속도 벡터만 정해 주면, integrate 함수가 오일러 적분으로 실제 위치에 반영합니다. 충돌은 모든 개체를 원으로 보고 판정하는데, 제곱근 계산이 느리기 때문에 거리의 제곱끼리 비교하는 최적화도 적용했습니다. 마지막으로 disaster.py는 종료 조건인 트랙터 재난입니다. D키를 누르면 트랙터 무리가 초원 전체 높이를 빈틈없이 덮도록 계산되어 등장하고, 화면을 가로지르며 닿는 모든 생물을 밀어버립니다. 종료를 단순한 스위치가 아니라 '시간의 흐름에 따라 관찰되는 사건'으로 만든 것이 제 파트의 포인트입니다.”</w:t>
+        <w:t xml:space="preserve">“파트 설명에 앞서 전체 클래스 구조를 소개하겠습니다. 저희 코드의 모든 구성원은 하나의 상속 트리 위에 있습니다. 최상위에는 추상 클래스 Entity가 있어 위치, 생존 여부, 그리고 매 틱 호출되는 update라는 공통 인터페이스를 정의합니다. 덕분에 물리엔진과 화면이 동물이든 식물이든 트랙터든 똑같은 방식으로 다룰 수 있습니다. 그 아래 Animal은 속도, 체력, 공격력, 회복력, 허기라는 공통 속성과 함께 '템플릿 메서드 패턴'을 구현합니다. update가 타이머 감소, 허기 증가, 행동 결정, 이동, 죽음 판정이라는 공통 흐름을 고정하고, 종마다 다른 행동은 추상 메서드 act 하나에만 맡기는 구조라서, 새로운 동물을 추가할 때는 act만 구현하면 됩니다. Animal 아래는 번식 게이지와 reproduce를 가진 초식동물 Herbivore, 기력과 attack을 가진 육식동물 Carnivore로 갈라지고, 그 아래 토끼, 기린, 얼룩말, 코끼리, 사자, 치타, 하이에나 일곱 종이 각자 고유 능력 메서드 하나씩을 더합니다. 식물은 Plant 아래 풀과 나무가 있는데, 풀은 먹이이자 토끼의 은신처, 나무는 모든 번식이 일어나는 만남의 장소입니다. 이렇게 '공통은 위로, 차이는 아래로' 보내는 상속 설계 덕분에 네 명이 코드 중복 없이 분업할 수 있었습니다.”</w:t>
       </w:r>
     </w:p>
     <w:p>
@@ -5706,7 +5607,7 @@
           <w:b/>
           <w:bCs/>
         </w:rPr>
-        <w:t xml:space="preserve">4-2. 심준서 — 육식동물과 상호작용 (약 1분 25초)</w:t>
+        <w:t xml:space="preserve">4-1. 홍순율 — 물리엔진·GUI·재난 (약 1분 25초)</w:t>
       </w:r>
     </w:p>
     <w:p>
@@ -5717,7 +5618,7 @@
         <w:rPr>
           <w:rFonts w:ascii="Apple SD Gothic Neo" w:cs="Apple SD Gothic Neo" w:eastAsia="Apple SD Gothic Neo" w:hAnsi="Apple SD Gothic Neo"/>
         </w:rPr>
-        <w:t xml:space="preserve">“육식동물과 동물 간 상호작용을 맡은 심준서입니다. 사자, 치타, 하이에나는 모두 Carnivore 부모를 상속받아서 공통 추격 로직은 물려받고, 고유 능력만 따로 구현했습니다. 사자의 포효는 주변 동물 전체를 둔화시키는데, 동료 포식자까지 함께 느려지는 '양날의 검'으로 설계했습니다. 치타의 부스트는 먹이가 멀리 있을 때만 발동해서 1.8배로 가속합니다. 제가 가장 자랑하고 싶은 건 하이에나입니다. 하이에나는 직접 사냥하기보다, 지금 사냥 중인 사자나 치타를 찾아 그 먹이를 향해 끼어들고, 사냥이 성공하는 순간 확률적으로 가로챕니다. 이게 가능했던 이유는 '공격'과 '먹기'를 분리했기 때문입니다. 누가 죽였든, 먹는 쪽은 다를 수 있게 만든 거죠. interactions.py는 풀 먹기, 사냥, 기린 싸움, 번식처럼 둘 이상의 개체가 엮이는 사건을 매 틱 중재하는 모듈입니다. 번식은 나무 근처에서 같은 종 두 마리가 만나면 일어나는데, 멸종 방지를 위해 한 마리만 준비돼도 짝과 번식하도록 조건을 완화했고, 태어난 새끼는 부모와 겹치지 않게 나무 바깥쪽에 배치해 출생 장면이 눈에 보이도록 했습니다.”</w:t>
+        <w:t xml:space="preserve">“안녕하세요, 물리엔진과 화면, 프로그램의 시작과 끝을 맡은 홍순율입니다. 저희는 외부 라이브러리 없이 100% 파이썬 표준 라이브러리로 만들었기 때문에 물리엔진도 직접 구현했습니다. vector.py의 2차원 벡터 클래스에 연산자 오버로딩을 적용해 물리 공식을 '위치 더하기 속도 곱하기 시간'처럼 수식 그대로 쓸 수 있게 했고, physics.py는 '결정과 실행의 분리'가 핵심입니다. seek, flee 같은 조향 함수가 어디로 갈지 속도만 정하면 integrate가 오일러 적분으로 위치에 반영하고, 충돌은 모든 개체를 원으로 보고 제곱거리 비교로 빠르게 판정합니다. 화면도 제가 만들었습니다. gui.py는 tkinter만으로, while 루프 대신 after 예약 방식의 게임 루프를 써서 매 프레임 월드를 한 틱 진행하고 다시 그립니다. 체력바, 기절 표시, 개체 수 통계, 생태계 일지로 변화가 한눈에 보이고, 한글 입력 상태에서 키가 안 먹는 문제까지 처리했습니다. 마지막 disaster.py의 트랙터 재난은, D키를 누르면 트랙터 무리가 초원 전체 높이를 덮도록 계산되어 등장해 화면을 가로지르며 모든 생물을 밀어버리는 종료 조건입니다. 종료를 스위치가 아니라 시간의 흐름으로 관찰되는 사건으로 만든 것이 포인트입니다.”</w:t>
       </w:r>
     </w:p>
     <w:p>
@@ -5730,7 +5631,7 @@
           <w:b/>
           <w:bCs/>
         </w:rPr>
-        <w:t xml:space="preserve">4-3. 한시헌 — 초식동물·식물·GUI (약 1분 25초)</w:t>
+        <w:t xml:space="preserve">4-2. 심준서 — 육식동물과 상호작용 (약 1분 25초)</w:t>
       </w:r>
     </w:p>
     <w:p>
@@ -5741,7 +5642,31 @@
         <w:rPr>
           <w:rFonts w:ascii="Apple SD Gothic Neo" w:cs="Apple SD Gothic Neo" w:eastAsia="Apple SD Gothic Neo" w:hAnsi="Apple SD Gothic Neo"/>
         </w:rPr>
-        <w:t xml:space="preserve">“초식동물과 식물, 그리고 화면 출력을 맡은 한시헌입니다. 저는 모든 초식동물이 상속받는 Herbivore 부모 클래스에 공통 생존 흐름을 구현했습니다. 포식자가 가까우면 도망가고, 배고프면 풀을 찾고, 번식 준비가 되면 나무로 모이는 순서입니다. 특히 모든 동물이 가장 가까운 나무 한곳에 몰려 겹쳐 보이던 문제를, '덜 붐비는 나무를 고르고, 나무 중심이 아니라 둘레의 자기 자리로 가게' 해서 해결했습니다. 토끼는 위험하면 근처 풀숲에 숨는 hide 능력이 있는데, 풀 하나에 숨을 수 있는 토끼 수에 한계를 둬서 현실성을 살렸고, 기린은 넥스윙으로 포식자를 밀쳐냅니다. 화면은 외부 라이브러리 없이 tkinter만으로 만들었습니다. while 루프 대신 after 예약 방식으로 매 프레임 월드를 한 틱 진행하고 다시 그리는 게임 루프 구조입니다. 동물 머리 위 체력바, 기절한 포식자의 노란 고리, 종별 개체 수 통계와 생태계 일지 로그로, 시간의 흐름에 따른 생태계 변화를 한눈에 볼 수 있게 했습니다. 한글 입력 상태에서 키가 안 먹는 문제까지 처리해서 어떤 상태에서도 조작이 됩니다.”</w:t>
+        <w:t xml:space="preserve">“육식동물과 동물 간 상호작용을 맡은 심준서입니다. 사자, 치타, 하이에나는 모두 Carnivore 부모를 상속받아서 공통 추격 로직은 물려받고, 고유 능력만 따로 구현했습니다. 사자의 포효는 주변 동물 전체를 둔화시키는데, 동료 포식자까지 함께 느려지는 '양날의 검'으로 설계했습니다. 치타의 부스트는 먹이가 멀리 있을 때만 발동해서 1.8배로 가속합니다. 제가 가장 자랑하고 싶은 건 하이에나입니다. 하이에나는 직접 사냥하기보다, 지금 사냥 중인 사자나 치타를 찾아 그 먹이를 향해 끼어들고, 사냥이 성공하는 순간 확률적으로 가로챕니다. 이게 가능했던 이유는 '공격'과 '먹기'를 분리했기 때문입니다. 누가 죽였든, 먹는 쪽은 다를 수 있게 만든 거죠. interactions.py는 풀 먹기, 사냥, 기린 싸움, 번식처럼 둘 이상의 개체가 엮이는 사건을 매 틱 중재하는 모듈입니다. 번식은 나무 근처에서 같은 종 두 마리가 만나면 일어나는데, 멸종 방지를 위해 한 마리만 준비돼도 짝과 번식하도록 조건을 완화했고, 태어난 새끼는 부모와 겹치지 않게 나무 바깥쪽에 배치해 출생 장면이 눈에 보이도록 했습니다.”</w:t>
+      </w:r>
+    </w:p>
+    <w:p>
+      <w:pPr>
+        <w:pStyle w:val="Heading2"/>
+      </w:pPr>
+      <w:r>
+        <w:rPr>
+          <w:rFonts w:ascii="Apple SD Gothic Neo" w:cs="Apple SD Gothic Neo" w:eastAsia="Apple SD Gothic Neo" w:hAnsi="Apple SD Gothic Neo"/>
+          <w:b/>
+          <w:bCs/>
+        </w:rPr>
+        <w:t xml:space="preserve">4-3. 한시헌 — 초식동물과 식물 (약 1분 20초)</w:t>
+      </w:r>
+    </w:p>
+    <w:p>
+      <w:pPr>
+        <w:spacing w:after="120"/>
+      </w:pPr>
+      <w:r>
+        <w:rPr>
+          <w:rFonts w:ascii="Apple SD Gothic Neo" w:cs="Apple SD Gothic Neo" w:eastAsia="Apple SD Gothic Neo" w:hAnsi="Apple SD Gothic Neo"/>
+        </w:rPr>
+        <w:t xml:space="preserve">“초식동물과 식물을 맡은 한시헌입니다. 모든 초식동물이 상속받는 Herbivore 부모 클래스에 공통 생존 흐름을 구현했습니다. 포식자가 가까우면 도망가고, 배고프면 풀을 찾고, 번식 준비가 되면 나무로 모이는 순서입니다. 제가 가장 공들인 부분은 번식터 분산 알고리즘입니다. 처음에는 모든 동물이 가장 가까운 나무 한곳에 몰려 화면이 겹쳐 보였는데, 가까운 나무 몇 개 중 덜 붐비는 곳을 고르고, 나무 중심이 아니라 둘레의 자기 자리로 가게 해서 번식 조건은 유지하면서 군집 문제를 해결했습니다. 번식 메서드는 type(self)로 자기와 같은 종을 생성하기 때문에 토끼는 토끼를, 기린은 기린을 낳고, 자식 클래스마다 번식 코드를 다시 쓸 필요가 없습니다. 토끼는 위험하면 근처 풀숲에 숨는 hide 능력이 있는데, 숨는 동안 포식자에게 보이지 않고, 풀 하나에 숨을 수 있는 토끼 수에 한계를 둬 현실성을 살렸습니다. 기린은 넥스윙으로 포식자를 밀쳐내며 피해를 주는데, 같은 메서드가 기린끼리의 싸움에도 재사용됩니다. 식물 쪽에서는 풀이 be_eaten 메서드로 자기 먹이량을 스스로 관리하고 다 뜯기면 120틱 뒤 다시 자라며, 나무는 모든 번식이 일어나는 만남의 장소가 됩니다.”</w:t>
       </w:r>
     </w:p>
     <w:p>
@@ -5926,7 +5851,7 @@
               <w:rPr>
                 <w:rFonts w:ascii="Apple SD Gothic Neo" w:cs="Apple SD Gothic Neo" w:eastAsia="Apple SD Gothic Neo" w:hAnsi="Apple SD Gothic Neo"/>
               </w:rPr>
-              <w:t xml:space="preserve">1</w:t>
+              <w:t xml:space="preserve">0</w:t>
             </w:r>
           </w:p>
         </w:tc>
@@ -5954,7 +5879,7 @@
               <w:rPr>
                 <w:rFonts w:ascii="Apple SD Gothic Neo" w:cs="Apple SD Gothic Neo" w:eastAsia="Apple SD Gothic Neo" w:hAnsi="Apple SD Gothic Neo"/>
               </w:rPr>
-              <w:t xml:space="preserve">홍순율</w:t>
+              <w:t xml:space="preserve">(첫 발표자)</w:t>
             </w:r>
           </w:p>
         </w:tc>
@@ -5982,7 +5907,7 @@
               <w:rPr>
                 <w:rFonts w:ascii="Apple SD Gothic Neo" w:cs="Apple SD Gothic Neo" w:eastAsia="Apple SD Gothic Neo" w:hAnsi="Apple SD Gothic Neo"/>
               </w:rPr>
-              <w:t xml:space="preserve">프로젝트 소개 + 물리엔진·재난</w:t>
+              <w:t xml:space="preserve">클래스 다이어그램 — 상속 구조 (심성진 파트 대체)</w:t>
             </w:r>
           </w:p>
         </w:tc>
@@ -6010,7 +5935,7 @@
               <w:rPr>
                 <w:rFonts w:ascii="Apple SD Gothic Neo" w:cs="Apple SD Gothic Neo" w:eastAsia="Apple SD Gothic Neo" w:hAnsi="Apple SD Gothic Neo"/>
               </w:rPr>
-              <w:t xml:space="preserve">약 1:25</w:t>
+              <w:t xml:space="preserve">약 1:05</w:t>
             </w:r>
           </w:p>
         </w:tc>
@@ -6040,7 +5965,7 @@
               <w:rPr>
                 <w:rFonts w:ascii="Apple SD Gothic Neo" w:cs="Apple SD Gothic Neo" w:eastAsia="Apple SD Gothic Neo" w:hAnsi="Apple SD Gothic Neo"/>
               </w:rPr>
-              <w:t xml:space="preserve">2</w:t>
+              <w:t xml:space="preserve">1</w:t>
             </w:r>
           </w:p>
         </w:tc>
@@ -6068,7 +5993,7 @@
               <w:rPr>
                 <w:rFonts w:ascii="Apple SD Gothic Neo" w:cs="Apple SD Gothic Neo" w:eastAsia="Apple SD Gothic Neo" w:hAnsi="Apple SD Gothic Neo"/>
               </w:rPr>
-              <w:t xml:space="preserve">심준서</w:t>
+              <w:t xml:space="preserve">홍순율</w:t>
             </w:r>
           </w:p>
         </w:tc>
@@ -6096,7 +6021,7 @@
               <w:rPr>
                 <w:rFonts w:ascii="Apple SD Gothic Neo" w:cs="Apple SD Gothic Neo" w:eastAsia="Apple SD Gothic Neo" w:hAnsi="Apple SD Gothic Neo"/>
               </w:rPr>
-              <w:t xml:space="preserve">육식동물·상호작용</w:t>
+              <w:t xml:space="preserve">물리엔진·GUI·재난</w:t>
             </w:r>
           </w:p>
         </w:tc>
@@ -6154,6 +6079,120 @@
               <w:rPr>
                 <w:rFonts w:ascii="Apple SD Gothic Neo" w:cs="Apple SD Gothic Neo" w:eastAsia="Apple SD Gothic Neo" w:hAnsi="Apple SD Gothic Neo"/>
               </w:rPr>
+              <w:t xml:space="preserve">2</w:t>
+            </w:r>
+          </w:p>
+        </w:tc>
+        <w:tc>
+          <w:tcPr>
+            <w:tcW w:type="dxa" w:w="1400"/>
+            <w:tcBorders>
+              <w:top w:val="single" w:color="BBBBBB" w:sz="1"/>
+              <w:left w:val="single" w:color="BBBBBB" w:sz="1"/>
+              <w:bottom w:val="single" w:color="BBBBBB" w:sz="1"/>
+              <w:right w:val="single" w:color="BBBBBB" w:sz="1"/>
+            </w:tcBorders>
+            <w:tcMar>
+              <w:top w:type="dxa" w:w="60"/>
+              <w:left w:type="dxa" w:w="100"/>
+              <w:bottom w:type="dxa" w:w="60"/>
+              <w:right w:type="dxa" w:w="100"/>
+            </w:tcMar>
+          </w:tcPr>
+          <w:p>
+            <w:pPr>
+              <w:spacing w:after="0"/>
+            </w:pPr>
+            <w:r>
+              <w:rPr>
+                <w:rFonts w:ascii="Apple SD Gothic Neo" w:cs="Apple SD Gothic Neo" w:eastAsia="Apple SD Gothic Neo" w:hAnsi="Apple SD Gothic Neo"/>
+              </w:rPr>
+              <w:t xml:space="preserve">심준서</w:t>
+            </w:r>
+          </w:p>
+        </w:tc>
+        <w:tc>
+          <w:tcPr>
+            <w:tcW w:type="dxa" w:w="4900"/>
+            <w:tcBorders>
+              <w:top w:val="single" w:color="BBBBBB" w:sz="1"/>
+              <w:left w:val="single" w:color="BBBBBB" w:sz="1"/>
+              <w:bottom w:val="single" w:color="BBBBBB" w:sz="1"/>
+              <w:right w:val="single" w:color="BBBBBB" w:sz="1"/>
+            </w:tcBorders>
+            <w:tcMar>
+              <w:top w:type="dxa" w:w="60"/>
+              <w:left w:type="dxa" w:w="100"/>
+              <w:bottom w:type="dxa" w:w="60"/>
+              <w:right w:type="dxa" w:w="100"/>
+            </w:tcMar>
+          </w:tcPr>
+          <w:p>
+            <w:pPr>
+              <w:spacing w:after="0"/>
+            </w:pPr>
+            <w:r>
+              <w:rPr>
+                <w:rFonts w:ascii="Apple SD Gothic Neo" w:cs="Apple SD Gothic Neo" w:eastAsia="Apple SD Gothic Neo" w:hAnsi="Apple SD Gothic Neo"/>
+              </w:rPr>
+              <w:t xml:space="preserve">육식동물·상호작용</w:t>
+            </w:r>
+          </w:p>
+        </w:tc>
+        <w:tc>
+          <w:tcPr>
+            <w:tcW w:type="dxa" w:w="1300"/>
+            <w:tcBorders>
+              <w:top w:val="single" w:color="BBBBBB" w:sz="1"/>
+              <w:left w:val="single" w:color="BBBBBB" w:sz="1"/>
+              <w:bottom w:val="single" w:color="BBBBBB" w:sz="1"/>
+              <w:right w:val="single" w:color="BBBBBB" w:sz="1"/>
+            </w:tcBorders>
+            <w:tcMar>
+              <w:top w:type="dxa" w:w="60"/>
+              <w:left w:type="dxa" w:w="100"/>
+              <w:bottom w:type="dxa" w:w="60"/>
+              <w:right w:type="dxa" w:w="100"/>
+            </w:tcMar>
+          </w:tcPr>
+          <w:p>
+            <w:pPr>
+              <w:spacing w:after="0"/>
+            </w:pPr>
+            <w:r>
+              <w:rPr>
+                <w:rFonts w:ascii="Apple SD Gothic Neo" w:cs="Apple SD Gothic Neo" w:eastAsia="Apple SD Gothic Neo" w:hAnsi="Apple SD Gothic Neo"/>
+              </w:rPr>
+              <w:t xml:space="preserve">약 1:25</w:t>
+            </w:r>
+          </w:p>
+        </w:tc>
+      </w:tr>
+      <w:tr>
+        <w:tc>
+          <w:tcPr>
+            <w:tcW w:type="dxa" w:w="800"/>
+            <w:tcBorders>
+              <w:top w:val="single" w:color="BBBBBB" w:sz="1"/>
+              <w:left w:val="single" w:color="BBBBBB" w:sz="1"/>
+              <w:bottom w:val="single" w:color="BBBBBB" w:sz="1"/>
+              <w:right w:val="single" w:color="BBBBBB" w:sz="1"/>
+            </w:tcBorders>
+            <w:tcMar>
+              <w:top w:type="dxa" w:w="60"/>
+              <w:left w:type="dxa" w:w="100"/>
+              <w:bottom w:type="dxa" w:w="60"/>
+              <w:right w:type="dxa" w:w="100"/>
+            </w:tcMar>
+          </w:tcPr>
+          <w:p>
+            <w:pPr>
+              <w:spacing w:after="0"/>
+            </w:pPr>
+            <w:r>
+              <w:rPr>
+                <w:rFonts w:ascii="Apple SD Gothic Neo" w:cs="Apple SD Gothic Neo" w:eastAsia="Apple SD Gothic Neo" w:hAnsi="Apple SD Gothic Neo"/>
+              </w:rPr>
               <w:t xml:space="preserve">3</w:t>
             </w:r>
           </w:p>
@@ -6210,7 +6249,7 @@
               <w:rPr>
                 <w:rFonts w:ascii="Apple SD Gothic Neo" w:cs="Apple SD Gothic Neo" w:eastAsia="Apple SD Gothic Neo" w:hAnsi="Apple SD Gothic Neo"/>
               </w:rPr>
-              <w:t xml:space="preserve">초식·식물·GUI + 시연 영상 연결</w:t>
+              <w:t xml:space="preserve">초식·식물 + 시연 영상 연결</w:t>
             </w:r>
           </w:p>
         </w:tc>
@@ -6238,7 +6277,7 @@
               <w:rPr>
                 <w:rFonts w:ascii="Apple SD Gothic Neo" w:cs="Apple SD Gothic Neo" w:eastAsia="Apple SD Gothic Neo" w:hAnsi="Apple SD Gothic Neo"/>
               </w:rPr>
-              <w:t xml:space="preserve">약 1:25</w:t>
+              <w:t xml:space="preserve">약 1:20</w:t>
             </w:r>
           </w:p>
         </w:tc>
@@ -6366,7 +6405,7 @@
         <w:rPr>
           <w:rFonts w:ascii="Apple SD Gothic Neo" w:cs="Apple SD Gothic Neo" w:eastAsia="Apple SD Gothic Neo" w:hAnsi="Apple SD Gothic Neo"/>
         </w:rPr>
-        <w:t xml:space="preserve">발표 합계 약 4분 15초~4분 30초로 6분 미만 조건을 여유 있게 만족한다. 대본은 1분 30초 기준 약 430자이므로, 연습 시 1분 30초를 넘기면 각 대본의 마지막 1~2문장을 줄이면 된다.</w:t>
+        <w:t xml:space="preserve">발표 합계 약 5분 15초로 6분 미만 조건을 만족하며, 개인별 대본은 모두 1분 30초 이내다. 연습 시 시간이 넘치면 각 대본의 마지막 1~2문장을 줄이면 된다.</w:t>
       </w:r>
     </w:p>
     <w:sectPr>

</xml_diff>